<commit_message>
add collaborator to report and presentation
</commit_message>
<xml_diff>
--- a/docs/entregables/Informe_Final_Chompas_Mabel.docx
+++ b/docs/entregables/Informe_Final_Chompas_Mabel.docx
@@ -456,31 +456,8 @@
       <w:r>
         <w:rPr>
           <w:b/>
-          <w:sz w:val="24"/>
-        </w:rPr>
-        <w:t>Colaborador: ______________________________</w:t>
-      </w:r>
-    </w:p>
-    <w:p>
-      <w:pPr>
-        <w:spacing w:after="155" w:line="259" w:lineRule="auto"/>
-        <w:ind w:left="0" w:right="200" w:firstLine="0"/>
-        <w:jc w:val="center"/>
-        <w:rPr>
-          <w:b/>
-          <w:color w:val="202124"/>
-          <w:sz w:val="28"/>
-          <w:szCs w:val="28"/>
-        </w:rPr>
-      </w:pPr>
-      <w:r>
-        <w:rPr>
-          <w:b/>
-          <w:color w:val="202124"/>
-          <w:sz w:val="28"/>
-          <w:szCs w:val="28"/>
-        </w:rPr>
-        <w:t>CRUZ SALAZAR Jorge Luis</w:t>
+        </w:rPr>
+        <w:t>Colaborador: CRUZ SALAZAR Jorge Luis</w:t>
       </w:r>
     </w:p>
     <w:p>

</xml_diff>

<commit_message>
mark both authors in deliverables
</commit_message>
<xml_diff>
--- a/docs/entregables/Informe_Final_Chompas_Mabel.docx
+++ b/docs/entregables/Informe_Final_Chompas_Mabel.docx
@@ -423,11 +423,8 @@
       <w:r>
         <w:rPr>
           <w:b/>
-          <w:color w:val="202124"/>
-          <w:sz w:val="28"/>
-          <w:szCs w:val="28"/>
-        </w:rPr>
-        <w:t>PRESENTADOR POR:</w:t>
+        </w:rPr>
+        <w:t>PRESENTADO POR:</w:t>
       </w:r>
     </w:p>
     <w:p>
@@ -457,7 +454,7 @@
         <w:rPr>
           <w:b/>
         </w:rPr>
-        <w:t>Colaborador: CRUZ SALAZAR Jorge Luis</w:t>
+        <w:t>CRUZ SALAZAR Jorge Luis</w:t>
       </w:r>
     </w:p>
     <w:p>

</xml_diff>

<commit_message>
add credit tracking module
</commit_message>
<xml_diff>
--- a/docs/entregables/Informe_Final_Chompas_Mabel.docx
+++ b/docs/entregables/Informe_Final_Chompas_Mabel.docx
@@ -233,7 +233,7 @@
                                 <w:szCs w:val="28"/>
                                 <w:lang w:val="es-ES"/>
                               </w:rPr>
-                              <w:t xml:space="preserve">Nombre del </w:t>
+                              <w:t xml:space="preserve">Chompas Mabel - Sistema Web de Gestion</w:t>
                             </w:r>
                             <w:r>
                               <w:rPr>
@@ -243,7 +243,7 @@
                                 <w:szCs w:val="28"/>
                                 <w:lang w:val="es-ES"/>
                               </w:rPr>
-                              <w:t>Proyecto</w:t>
+                              <w:t/>
                             </w:r>
                           </w:p>
                         </w:txbxContent>
@@ -285,7 +285,7 @@
                           <w:szCs w:val="28"/>
                           <w:lang w:val="es-ES"/>
                         </w:rPr>
-                        <w:t xml:space="preserve">Nombre del </w:t>
+                        <w:t xml:space="preserve"/>
                       </w:r>
                       <w:r>
                         <w:rPr>
@@ -295,7 +295,7 @@
                           <w:szCs w:val="28"/>
                           <w:lang w:val="es-ES"/>
                         </w:rPr>
-                        <w:t>Proyecto</w:t>
+                        <w:t/>
                       </w:r>
                     </w:p>
                   </w:txbxContent>
@@ -1876,7 +1876,7 @@
         <w:rPr>
           <w:sz w:val="22"/>
         </w:rPr>
-        <w:t>Chompas Mabel - Sistema Web de Gestión es una aplicación web para administrar productos textiles, clientes, pedidos, ventas e inventario de una empresa dedicada a la venta de chompas. El sistema fue implementado cómo una solución funcional y no solamente cómo prototipo visual.</w:t>
+        <w:t>Chompas Mabel - Sistema Web de Gestion es una aplicacion web para administrar productos textiles, clientes, pedidos, ventas, creditos e inventario de una empresa dedicada a la venta de chompas. El sistema fue implementado como una solucion funcional y no solo como prototipo visual.</w:t>
       </w:r>
     </w:p>
     <w:p>
@@ -1942,63 +1942,63 @@
         <w:rPr>
           <w:sz w:val="22"/>
         </w:rPr>
-        <w:t xml:space="preserve">El proyecto conserva la estructura solicitada: </w:t>
-      </w:r>
-      <w:proofErr w:type="spellStart"/>
-      <w:r>
-        <w:rPr>
-          <w:sz w:val="22"/>
-        </w:rPr>
-        <w:t>frontend</w:t>
-      </w:r>
-      <w:proofErr w:type="spellEnd"/>
-      <w:r>
-        <w:rPr>
-          <w:sz w:val="22"/>
-        </w:rPr>
-        <w:t xml:space="preserve">-angular, </w:t>
-      </w:r>
-      <w:proofErr w:type="spellStart"/>
-      <w:r>
-        <w:rPr>
-          <w:sz w:val="22"/>
-        </w:rPr>
-        <w:t>backend-springboot</w:t>
-      </w:r>
-      <w:proofErr w:type="spellEnd"/>
-      <w:r>
-        <w:rPr>
-          <w:sz w:val="22"/>
-        </w:rPr>
-        <w:t xml:space="preserve">, </w:t>
-      </w:r>
-      <w:proofErr w:type="spellStart"/>
-      <w:r>
-        <w:rPr>
-          <w:sz w:val="22"/>
-        </w:rPr>
-        <w:t>database</w:t>
-      </w:r>
-      <w:proofErr w:type="spellEnd"/>
-      <w:r>
-        <w:rPr>
-          <w:sz w:val="22"/>
-        </w:rPr>
-        <w:t xml:space="preserve">, </w:t>
-      </w:r>
-      <w:proofErr w:type="spellStart"/>
-      <w:r>
-        <w:rPr>
-          <w:sz w:val="22"/>
-        </w:rPr>
-        <w:t>docker-compose.yml</w:t>
-      </w:r>
-      <w:proofErr w:type="spellEnd"/>
-      <w:r>
-        <w:rPr>
-          <w:sz w:val="22"/>
-        </w:rPr>
-        <w:t xml:space="preserve"> y README.md.</w:t>
+        <w:t xml:space="preserve">El proyecto conserva la estructura solicitada y la completa con documentacion por modulo: frontend-angular, backend-springboot, database/schema.sql, docker-compose.yml, README.md principal, README del frontend, README del backend y carpeta docs/entregables.</w:t>
+      </w:r>
+      <w:proofErr w:type="spellStart"/>
+      <w:r>
+        <w:rPr>
+          <w:sz w:val="22"/>
+        </w:rPr>
+        <w:t/>
+      </w:r>
+      <w:proofErr w:type="spellEnd"/>
+      <w:r>
+        <w:rPr>
+          <w:sz w:val="22"/>
+        </w:rPr>
+        <w:t xml:space="preserve"/>
+      </w:r>
+      <w:proofErr w:type="spellStart"/>
+      <w:r>
+        <w:rPr>
+          <w:sz w:val="22"/>
+        </w:rPr>
+        <w:t/>
+      </w:r>
+      <w:proofErr w:type="spellEnd"/>
+      <w:r>
+        <w:rPr>
+          <w:sz w:val="22"/>
+        </w:rPr>
+        <w:t xml:space="preserve"/>
+      </w:r>
+      <w:proofErr w:type="spellStart"/>
+      <w:r>
+        <w:rPr>
+          <w:sz w:val="22"/>
+        </w:rPr>
+        <w:t/>
+      </w:r>
+      <w:proofErr w:type="spellEnd"/>
+      <w:r>
+        <w:rPr>
+          <w:sz w:val="22"/>
+        </w:rPr>
+        <w:t xml:space="preserve"/>
+      </w:r>
+      <w:proofErr w:type="spellStart"/>
+      <w:r>
+        <w:rPr>
+          <w:sz w:val="22"/>
+        </w:rPr>
+        <w:t/>
+      </w:r>
+      <w:proofErr w:type="spellEnd"/>
+      <w:r>
+        <w:rPr>
+          <w:sz w:val="22"/>
+        </w:rPr>
+        <w:t xml:space="preserve"/>
       </w:r>
     </w:p>
     <w:p>
@@ -2057,7 +2057,7 @@
         <w:rPr>
           <w:sz w:val="22"/>
         </w:rPr>
-        <w:t>El propósito del proyecto es automatizar procesos frecuentes de Chompas Mabel: registro de productos, control de stock, atención de clientes, generación de pedidos, registro de ventas y revisión de reportes básicos para la toma de decisiones.</w:t>
+        <w:t>El proposito del proyecto es automatizar procesos frecuentes de Chompas Mabel: registro de productos, control de stock, atencion de clientes, generacion de pedidos, registro de ventas, seguimiento de creditos y revision de reportes basicos para la toma de decisiones.</w:t>
       </w:r>
     </w:p>
     <w:p>
@@ -2425,7 +2425,7 @@
         <w:rPr>
           <w:sz w:val="22"/>
         </w:rPr>
-        <w:t>Implementar un sistema web de gestión para Chompas Mabel que permita administrar productos, clientes, pedidos, ventas, inventario y reportes mediante una arquitectura cliente-servidor conectada a una base de datos MySQL.</w:t>
+        <w:t>Implementar un sistema web de gestion para Chompas Mabel que permita administrar productos, clientes, pedidos, ventas, creditos, inventario y reportes mediante una arquitectura cliente-servidor conectada a una base de datos MySQL.</w:t>
       </w:r>
     </w:p>
     <w:p>
@@ -2490,35 +2490,35 @@
         <w:rPr>
           <w:sz w:val="22"/>
         </w:rPr>
-        <w:t xml:space="preserve">Implementar el </w:t>
-      </w:r>
-      <w:proofErr w:type="spellStart"/>
-      <w:r>
-        <w:rPr>
-          <w:sz w:val="22"/>
-        </w:rPr>
-        <w:t>frontend</w:t>
-      </w:r>
-      <w:proofErr w:type="spellEnd"/>
-      <w:r>
-        <w:rPr>
-          <w:sz w:val="22"/>
-        </w:rPr>
-        <w:t xml:space="preserve"> con Angular 21, </w:t>
-      </w:r>
-      <w:proofErr w:type="spellStart"/>
-      <w:r>
-        <w:rPr>
-          <w:sz w:val="22"/>
-        </w:rPr>
-        <w:t>TypeScript</w:t>
-      </w:r>
-      <w:proofErr w:type="spellEnd"/>
-      <w:r>
-        <w:rPr>
-          <w:sz w:val="22"/>
-        </w:rPr>
-        <w:t>, Bootstrap 5, CSS propio, rutas, componentes y servicios HTTP.</w:t>
+        <w:t xml:space="preserve">Implementar el frontend con Angular 21, TypeScript, Bootstrap 5, CSS propio, rutas, componentes standalone, formularios reactivos y servicios HTTP.</w:t>
+      </w:r>
+      <w:proofErr w:type="spellStart"/>
+      <w:r>
+        <w:rPr>
+          <w:sz w:val="22"/>
+        </w:rPr>
+        <w:t/>
+      </w:r>
+      <w:proofErr w:type="spellEnd"/>
+      <w:r>
+        <w:rPr>
+          <w:sz w:val="22"/>
+        </w:rPr>
+        <w:t xml:space="preserve"/>
+      </w:r>
+      <w:proofErr w:type="spellStart"/>
+      <w:r>
+        <w:rPr>
+          <w:sz w:val="22"/>
+        </w:rPr>
+        <w:t/>
+      </w:r>
+      <w:proofErr w:type="spellEnd"/>
+      <w:r>
+        <w:rPr>
+          <w:sz w:val="22"/>
+        </w:rPr>
+        <w:t/>
       </w:r>
     </w:p>
     <w:p>
@@ -2900,49 +2900,49 @@
         <w:rPr>
           <w:sz w:val="22"/>
         </w:rPr>
-        <w:t xml:space="preserve">Presentación: Angular 21, componentes </w:t>
-      </w:r>
-      <w:proofErr w:type="spellStart"/>
-      <w:r>
-        <w:rPr>
-          <w:sz w:val="22"/>
-        </w:rPr>
-        <w:t>standalone</w:t>
-      </w:r>
-      <w:proofErr w:type="spellEnd"/>
-      <w:r>
-        <w:rPr>
-          <w:sz w:val="22"/>
-        </w:rPr>
-        <w:t xml:space="preserve">, </w:t>
-      </w:r>
-      <w:proofErr w:type="spellStart"/>
-      <w:r>
-        <w:rPr>
-          <w:sz w:val="22"/>
-        </w:rPr>
-        <w:t>routing</w:t>
-      </w:r>
-      <w:proofErr w:type="spellEnd"/>
-      <w:r>
-        <w:rPr>
-          <w:sz w:val="22"/>
-        </w:rPr>
-        <w:t xml:space="preserve">, formularios reactivos, </w:t>
-      </w:r>
-      <w:proofErr w:type="spellStart"/>
-      <w:r>
-        <w:rPr>
-          <w:sz w:val="22"/>
-        </w:rPr>
-        <w:t>signals</w:t>
-      </w:r>
-      <w:proofErr w:type="spellEnd"/>
-      <w:r>
-        <w:rPr>
-          <w:sz w:val="22"/>
-        </w:rPr>
-        <w:t xml:space="preserve"> y servicios HTTP.</w:t>
+        <w:t xml:space="preserve">Presentacion: Angular 21, componentes standalone, routing, formularios reactivos, signals para estados de interfaz y servicios HTTP.</w:t>
+      </w:r>
+      <w:proofErr w:type="spellStart"/>
+      <w:r>
+        <w:rPr>
+          <w:sz w:val="22"/>
+        </w:rPr>
+        <w:t/>
+      </w:r>
+      <w:proofErr w:type="spellEnd"/>
+      <w:r>
+        <w:rPr>
+          <w:sz w:val="22"/>
+        </w:rPr>
+        <w:t xml:space="preserve"/>
+      </w:r>
+      <w:proofErr w:type="spellStart"/>
+      <w:r>
+        <w:rPr>
+          <w:sz w:val="22"/>
+        </w:rPr>
+        <w:t/>
+      </w:r>
+      <w:proofErr w:type="spellEnd"/>
+      <w:r>
+        <w:rPr>
+          <w:sz w:val="22"/>
+        </w:rPr>
+        <w:t xml:space="preserve"/>
+      </w:r>
+      <w:proofErr w:type="spellStart"/>
+      <w:r>
+        <w:rPr>
+          <w:sz w:val="22"/>
+        </w:rPr>
+        <w:t/>
+      </w:r>
+      <w:proofErr w:type="spellEnd"/>
+      <w:r>
+        <w:rPr>
+          <w:sz w:val="22"/>
+        </w:rPr>
+        <w:t xml:space="preserve"/>
       </w:r>
     </w:p>
     <w:p>
@@ -2974,35 +2974,35 @@
         <w:rPr>
           <w:sz w:val="22"/>
         </w:rPr>
-        <w:t xml:space="preserve">Modelo/dominio: entidades Categoría, Producto, Cliente, Usuario, Pedido, </w:t>
-      </w:r>
-      <w:proofErr w:type="spellStart"/>
-      <w:r>
-        <w:rPr>
-          <w:sz w:val="22"/>
-        </w:rPr>
-        <w:t>DetallePedido</w:t>
-      </w:r>
-      <w:proofErr w:type="spellEnd"/>
-      <w:r>
-        <w:rPr>
-          <w:sz w:val="22"/>
-        </w:rPr>
-        <w:t xml:space="preserve">, Venta e </w:t>
-      </w:r>
-      <w:proofErr w:type="spellStart"/>
-      <w:r>
-        <w:rPr>
-          <w:sz w:val="22"/>
-        </w:rPr>
-        <w:t>InventarioMovimiento</w:t>
-      </w:r>
-      <w:proofErr w:type="spellEnd"/>
-      <w:r>
-        <w:rPr>
-          <w:sz w:val="22"/>
-        </w:rPr>
-        <w:t>.</w:t>
+        <w:t xml:space="preserve">Modelo/dominio: entidades Categoria, Producto, Cliente, Usuario, Pedido, DetallePedido, Venta e InventarioMovimiento, mas campos de credito dentro de Pedido para cuentas por cobrar.</w:t>
+      </w:r>
+      <w:proofErr w:type="spellStart"/>
+      <w:r>
+        <w:rPr>
+          <w:sz w:val="22"/>
+        </w:rPr>
+        <w:t/>
+      </w:r>
+      <w:proofErr w:type="spellEnd"/>
+      <w:r>
+        <w:rPr>
+          <w:sz w:val="22"/>
+        </w:rPr>
+        <w:t xml:space="preserve"/>
+      </w:r>
+      <w:proofErr w:type="spellStart"/>
+      <w:r>
+        <w:rPr>
+          <w:sz w:val="22"/>
+        </w:rPr>
+        <w:t/>
+      </w:r>
+      <w:proofErr w:type="spellEnd"/>
+      <w:r>
+        <w:rPr>
+          <w:sz w:val="22"/>
+        </w:rPr>
+        <w:t/>
       </w:r>
     </w:p>
     <w:p>
@@ -3335,7 +3335,7 @@
         <w:rPr>
           <w:sz w:val="22"/>
         </w:rPr>
-        <w:t>/pedidos y /ventas: creación de pedidos, detalle de productos y generación de venta.</w:t>
+        <w:t>/pedidos, /ventas y /creditos: creacion de pedidos, relacion con ventas y seguimiento de saldos a credito.</w:t>
       </w:r>
     </w:p>
     <w:p>
@@ -3695,7 +3695,7 @@
           <w:i/>
           <w:sz w:val="20"/>
         </w:rPr>
-        <w:t>Figura 7. Módulo Pedidos/Ventas: creación de pedidos y relación con ventas.</w:t>
+        <w:t>Figura 7. Modulo Pedidos/Ventas/Creditos: creacion de pedidos, relacion con ventas y control de cuentas por cobrar.</w:t>
       </w:r>
     </w:p>
     <w:p>
@@ -3761,7 +3761,7 @@
         <w:rPr>
           <w:sz w:val="22"/>
         </w:rPr>
-        <w:t>Estas vistas evidencian que el sistema fue construido cómo producto funcional: cada pantalla tiene rutas, componentes, formularios, validaciones y conexión con servicios HTTP.</w:t>
+        <w:t>Estas vistas evidencian que el sistema fue construido como producto funcional: cada pantalla tiene rutas, componentes, formularios, validaciones, conexion con servicios HTTP y seguimiento de creditos pendientes o vencidos.</w:t>
       </w:r>
     </w:p>
     <w:p>
@@ -4458,14 +4458,61 @@
         <w:rPr>
           <w:sz w:val="22"/>
         </w:rPr>
-        <w:t xml:space="preserve">Componentes para </w:t>
-      </w:r>
-      <w:proofErr w:type="spellStart"/>
-      <w:r>
-        <w:rPr>
-          <w:sz w:val="22"/>
-        </w:rPr>
-        <w:t>login</w:t>
+        <w:t xml:space="preserve">Componentes para login, dashboard, productos, clientes, pedidos, creditos y reportes.</w:t>
+      </w:r>
+      <w:proofErr w:type="spellStart"/>
+      <w:r>
+        <w:rPr>
+          <w:sz w:val="22"/>
+        </w:rPr>
+        <w:t/>
+      </w:r>
+      <w:proofErr w:type="spellEnd"/>
+      <w:r>
+        <w:rPr>
+          <w:sz w:val="22"/>
+        </w:rPr>
+        <w:t xml:space="preserve"/>
+      </w:r>
+      <w:proofErr w:type="spellStart"/>
+      <w:r>
+        <w:rPr>
+          <w:sz w:val="22"/>
+        </w:rPr>
+        <w:t/>
+      </w:r>
+      <w:proofErr w:type="spellEnd"/>
+      <w:r>
+        <w:rPr>
+          <w:sz w:val="22"/>
+        </w:rPr>
+        <w:t/>
+      </w:r>
+    </w:p>
+    <w:p>
+      <w:pPr>
+        <w:spacing w:after="155" w:line="360" w:lineRule="auto"/>
+        <w:ind w:left="0" w:right="200" w:firstLine="0"/>
+        <w:rPr>
+          <w:rFonts w:ascii="Century Gothic" w:hAnsi="Century Gothic"/>
+          <w:b/>
+          <w:color w:val="202124"/>
+          <w:sz w:val="26"/>
+          <w:szCs w:val="26"/>
+        </w:rPr>
+      </w:pPr>
+      <w:r>
+        <w:rPr>
+          <w:sz w:val="22"/>
+        </w:rPr>
+        <w:t xml:space="preserve">Servicios HTTP: </w:t>
+      </w:r>
+      <w:proofErr w:type="spellStart"/>
+      <w:r>
+        <w:rPr>
+          <w:sz w:val="22"/>
+        </w:rPr>
+        <w:t>auth.service</w:t>
       </w:r>
       <w:proofErr w:type="spellEnd"/>
       <w:r>
@@ -4479,14 +4526,42 @@
         <w:rPr>
           <w:sz w:val="22"/>
         </w:rPr>
-        <w:t>dashboard</w:t>
-      </w:r>
-      <w:proofErr w:type="spellEnd"/>
-      <w:r>
-        <w:rPr>
-          <w:sz w:val="22"/>
-        </w:rPr>
-        <w:t>, productos, clientes, pedidos y reportes.</w:t>
+        <w:t>producto.service</w:t>
+      </w:r>
+      <w:proofErr w:type="spellEnd"/>
+      <w:r>
+        <w:rPr>
+          <w:sz w:val="22"/>
+        </w:rPr>
+        <w:t xml:space="preserve">, </w:t>
+      </w:r>
+      <w:proofErr w:type="spellStart"/>
+      <w:r>
+        <w:rPr>
+          <w:sz w:val="22"/>
+        </w:rPr>
+        <w:t>cliente.service</w:t>
+      </w:r>
+      <w:proofErr w:type="spellEnd"/>
+      <w:r>
+        <w:rPr>
+          <w:sz w:val="22"/>
+        </w:rPr>
+        <w:t xml:space="preserve"> y </w:t>
+      </w:r>
+      <w:proofErr w:type="spellStart"/>
+      <w:r>
+        <w:rPr>
+          <w:sz w:val="22"/>
+        </w:rPr>
+        <w:t>pedido.service</w:t>
+      </w:r>
+      <w:proofErr w:type="spellEnd"/>
+      <w:r>
+        <w:rPr>
+          <w:sz w:val="22"/>
+        </w:rPr>
+        <w:t>.</w:t>
       </w:r>
     </w:p>
     <w:p>
@@ -4505,14 +4580,14 @@
         <w:rPr>
           <w:sz w:val="22"/>
         </w:rPr>
-        <w:t xml:space="preserve">Servicios HTTP: </w:t>
-      </w:r>
-      <w:proofErr w:type="spellStart"/>
-      <w:r>
-        <w:rPr>
-          <w:sz w:val="22"/>
-        </w:rPr>
-        <w:t>auth.service</w:t>
+        <w:t xml:space="preserve">Formularios reactivos con </w:t>
+      </w:r>
+      <w:proofErr w:type="spellStart"/>
+      <w:r>
+        <w:rPr>
+          <w:sz w:val="22"/>
+        </w:rPr>
+        <w:t>Validators.required</w:t>
       </w:r>
       <w:proofErr w:type="spellEnd"/>
       <w:r>
@@ -4526,7 +4601,7 @@
         <w:rPr>
           <w:sz w:val="22"/>
         </w:rPr>
-        <w:t>producto.service</w:t>
+        <w:t>Validators.email</w:t>
       </w:r>
       <w:proofErr w:type="spellEnd"/>
       <w:r>
@@ -4540,7 +4615,7 @@
         <w:rPr>
           <w:sz w:val="22"/>
         </w:rPr>
-        <w:t>cliente.service</w:t>
+        <w:t>Validators.min</w:t>
       </w:r>
       <w:proofErr w:type="spellEnd"/>
       <w:r>
@@ -4554,7 +4629,7 @@
         <w:rPr>
           <w:sz w:val="22"/>
         </w:rPr>
-        <w:t>pedido.service</w:t>
+        <w:t>Validators.minLength</w:t>
       </w:r>
       <w:proofErr w:type="spellEnd"/>
       <w:r>
@@ -4576,23 +4651,85 @@
           <w:szCs w:val="26"/>
         </w:rPr>
       </w:pPr>
-      <w:r>
-        <w:rPr>
-          <w:sz w:val="22"/>
-        </w:rPr>
-        <w:t xml:space="preserve">Formularios reactivos con </w:t>
-      </w:r>
-      <w:proofErr w:type="spellStart"/>
-      <w:r>
-        <w:rPr>
-          <w:sz w:val="22"/>
-        </w:rPr>
-        <w:t>Validators.required</w:t>
-      </w:r>
-      <w:proofErr w:type="spellEnd"/>
-      <w:r>
-        <w:rPr>
-          <w:sz w:val="22"/>
+      <w:proofErr w:type="spellStart"/>
+      <w:r>
+        <w:rPr>
+          <w:sz w:val="22"/>
+        </w:rPr>
+        <w:t>Signals</w:t>
+      </w:r>
+      <w:proofErr w:type="spellEnd"/>
+      <w:r>
+        <w:rPr>
+          <w:sz w:val="22"/>
+        </w:rPr>
+        <w:t xml:space="preserve"> para manejar estado reactivo en la interfaz.</w:t>
+      </w:r>
+    </w:p>
+    <w:p>
+      <w:pPr>
+        <w:spacing w:after="155" w:line="360" w:lineRule="auto"/>
+        <w:ind w:left="0" w:right="200" w:firstLine="0"/>
+        <w:jc w:val="left"/>
+        <w:rPr>
+          <w:rFonts w:ascii="Century Gothic" w:hAnsi="Century Gothic"/>
+          <w:b/>
+          <w:color w:val="202124"/>
+          <w:sz w:val="26"/>
+          <w:szCs w:val="26"/>
+          <w:lang w:val="en-US"/>
+        </w:rPr>
+      </w:pPr>
+      <w:r>
+        <w:rPr>
+          <w:b/>
+          <w:lang w:val="en-US"/>
+        </w:rPr>
+        <w:t>Backend Spring Boot</w:t>
+      </w:r>
+    </w:p>
+    <w:p>
+      <w:pPr>
+        <w:spacing w:after="155" w:line="360" w:lineRule="auto"/>
+        <w:ind w:left="0" w:right="200" w:firstLine="0"/>
+        <w:rPr>
+          <w:rFonts w:ascii="Century Gothic" w:hAnsi="Century Gothic"/>
+          <w:b/>
+          <w:color w:val="202124"/>
+          <w:sz w:val="26"/>
+          <w:szCs w:val="26"/>
+          <w:lang w:val="en-US"/>
+        </w:rPr>
+      </w:pPr>
+      <w:proofErr w:type="spellStart"/>
+      <w:r>
+        <w:rPr>
+          <w:sz w:val="22"/>
+          <w:lang w:val="en-US"/>
+        </w:rPr>
+        <w:t>Controladores</w:t>
+      </w:r>
+      <w:proofErr w:type="spellEnd"/>
+      <w:r>
+        <w:rPr>
+          <w:sz w:val="22"/>
+          <w:lang w:val="en-US"/>
+        </w:rPr>
+        <w:t xml:space="preserve"> REST: </w:t>
+      </w:r>
+      <w:proofErr w:type="spellStart"/>
+      <w:r>
+        <w:rPr>
+          <w:sz w:val="22"/>
+          <w:lang w:val="en-US"/>
+        </w:rPr>
+        <w:t>AuthController</w:t>
+      </w:r>
+      <w:proofErr w:type="spellEnd"/>
+      <w:r>
+        <w:rPr>
+          <w:sz w:val="22"/>
+          <w:lang w:val="en-US"/>
         </w:rPr>
         <w:t xml:space="preserve">, </w:t>
       </w:r>
@@ -4600,13 +4737,15 @@
       <w:r>
         <w:rPr>
           <w:sz w:val="22"/>
-        </w:rPr>
-        <w:t>Validators.email</w:t>
-      </w:r>
-      <w:proofErr w:type="spellEnd"/>
-      <w:r>
-        <w:rPr>
-          <w:sz w:val="22"/>
+          <w:lang w:val="en-US"/>
+        </w:rPr>
+        <w:t>ProductoController</w:t>
+      </w:r>
+      <w:proofErr w:type="spellEnd"/>
+      <w:r>
+        <w:rPr>
+          <w:sz w:val="22"/>
+          <w:lang w:val="en-US"/>
         </w:rPr>
         <w:t xml:space="preserve">, </w:t>
       </w:r>
@@ -4614,13 +4753,15 @@
       <w:r>
         <w:rPr>
           <w:sz w:val="22"/>
-        </w:rPr>
-        <w:t>Validators.min</w:t>
-      </w:r>
-      <w:proofErr w:type="spellEnd"/>
-      <w:r>
-        <w:rPr>
-          <w:sz w:val="22"/>
+          <w:lang w:val="en-US"/>
+        </w:rPr>
+        <w:t>ClienteController</w:t>
+      </w:r>
+      <w:proofErr w:type="spellEnd"/>
+      <w:r>
+        <w:rPr>
+          <w:sz w:val="22"/>
+          <w:lang w:val="en-US"/>
         </w:rPr>
         <w:t xml:space="preserve"> y </w:t>
       </w:r>
@@ -4628,13 +4769,15 @@
       <w:r>
         <w:rPr>
           <w:sz w:val="22"/>
-        </w:rPr>
-        <w:t>Validators.minLength</w:t>
-      </w:r>
-      <w:proofErr w:type="spellEnd"/>
-      <w:r>
-        <w:rPr>
-          <w:sz w:val="22"/>
+          <w:lang w:val="en-US"/>
+        </w:rPr>
+        <w:t>PedidoController</w:t>
+      </w:r>
+      <w:proofErr w:type="spellEnd"/>
+      <w:r>
+        <w:rPr>
+          <w:sz w:val="22"/>
+          <w:lang w:val="en-US"/>
         </w:rPr>
         <w:t>.</w:t>
       </w:r>
@@ -4651,154 +4794,11 @@
           <w:szCs w:val="26"/>
         </w:rPr>
       </w:pPr>
-      <w:proofErr w:type="spellStart"/>
-      <w:r>
-        <w:rPr>
-          <w:sz w:val="22"/>
-        </w:rPr>
-        <w:t>Signals</w:t>
-      </w:r>
-      <w:proofErr w:type="spellEnd"/>
-      <w:r>
-        <w:rPr>
-          <w:sz w:val="22"/>
-        </w:rPr>
-        <w:t xml:space="preserve"> para manejar estado reactivo en la interfaz.</w:t>
-      </w:r>
-    </w:p>
-    <w:p>
-      <w:pPr>
-        <w:spacing w:after="155" w:line="360" w:lineRule="auto"/>
-        <w:ind w:left="0" w:right="200" w:firstLine="0"/>
-        <w:jc w:val="left"/>
-        <w:rPr>
-          <w:rFonts w:ascii="Century Gothic" w:hAnsi="Century Gothic"/>
-          <w:b/>
-          <w:color w:val="202124"/>
-          <w:sz w:val="26"/>
-          <w:szCs w:val="26"/>
-          <w:lang w:val="en-US"/>
-        </w:rPr>
-      </w:pPr>
-      <w:r>
-        <w:rPr>
-          <w:b/>
-          <w:lang w:val="en-US"/>
-        </w:rPr>
-        <w:t>Backend Spring Boot</w:t>
-      </w:r>
-    </w:p>
-    <w:p>
-      <w:pPr>
-        <w:spacing w:after="155" w:line="360" w:lineRule="auto"/>
-        <w:ind w:left="0" w:right="200" w:firstLine="0"/>
-        <w:rPr>
-          <w:rFonts w:ascii="Century Gothic" w:hAnsi="Century Gothic"/>
-          <w:b/>
-          <w:color w:val="202124"/>
-          <w:sz w:val="26"/>
-          <w:szCs w:val="26"/>
-          <w:lang w:val="en-US"/>
-        </w:rPr>
-      </w:pPr>
-      <w:proofErr w:type="spellStart"/>
-      <w:r>
-        <w:rPr>
-          <w:sz w:val="22"/>
-          <w:lang w:val="en-US"/>
-        </w:rPr>
-        <w:t>Controladores</w:t>
-      </w:r>
-      <w:proofErr w:type="spellEnd"/>
-      <w:r>
-        <w:rPr>
-          <w:sz w:val="22"/>
-          <w:lang w:val="en-US"/>
-        </w:rPr>
-        <w:t xml:space="preserve"> REST: </w:t>
-      </w:r>
-      <w:proofErr w:type="spellStart"/>
-      <w:r>
-        <w:rPr>
-          <w:sz w:val="22"/>
-          <w:lang w:val="en-US"/>
-        </w:rPr>
-        <w:t>AuthController</w:t>
-      </w:r>
-      <w:proofErr w:type="spellEnd"/>
-      <w:r>
-        <w:rPr>
-          <w:sz w:val="22"/>
-          <w:lang w:val="en-US"/>
-        </w:rPr>
-        <w:t xml:space="preserve">, </w:t>
-      </w:r>
-      <w:proofErr w:type="spellStart"/>
-      <w:r>
-        <w:rPr>
-          <w:sz w:val="22"/>
-          <w:lang w:val="en-US"/>
-        </w:rPr>
-        <w:t>ProductoController</w:t>
-      </w:r>
-      <w:proofErr w:type="spellEnd"/>
-      <w:r>
-        <w:rPr>
-          <w:sz w:val="22"/>
-          <w:lang w:val="en-US"/>
-        </w:rPr>
-        <w:t xml:space="preserve">, </w:t>
-      </w:r>
-      <w:proofErr w:type="spellStart"/>
-      <w:r>
-        <w:rPr>
-          <w:sz w:val="22"/>
-          <w:lang w:val="en-US"/>
-        </w:rPr>
-        <w:t>ClienteController</w:t>
-      </w:r>
-      <w:proofErr w:type="spellEnd"/>
-      <w:r>
-        <w:rPr>
-          <w:sz w:val="22"/>
-          <w:lang w:val="en-US"/>
-        </w:rPr>
-        <w:t xml:space="preserve"> y </w:t>
-      </w:r>
-      <w:proofErr w:type="spellStart"/>
-      <w:r>
-        <w:rPr>
-          <w:sz w:val="22"/>
-          <w:lang w:val="en-US"/>
-        </w:rPr>
-        <w:t>PedidoController</w:t>
-      </w:r>
-      <w:proofErr w:type="spellEnd"/>
-      <w:r>
-        <w:rPr>
-          <w:sz w:val="22"/>
-          <w:lang w:val="en-US"/>
-        </w:rPr>
-        <w:t>.</w:t>
-      </w:r>
-    </w:p>
-    <w:p>
-      <w:pPr>
-        <w:spacing w:after="155" w:line="360" w:lineRule="auto"/>
-        <w:ind w:left="0" w:right="200" w:firstLine="0"/>
-        <w:rPr>
-          <w:rFonts w:ascii="Century Gothic" w:hAnsi="Century Gothic"/>
-          <w:b/>
-          <w:color w:val="202124"/>
-          <w:sz w:val="26"/>
-          <w:szCs w:val="26"/>
-        </w:rPr>
-      </w:pPr>
-      <w:r>
-        <w:rPr>
-          <w:sz w:val="22"/>
-        </w:rPr>
-        <w:t>Servicios de negocio para validación, cálculo de totales, actualización de stock y registro de ventas.</w:t>
+      <w:r>
+        <w:rPr>
+          <w:sz w:val="22"/>
+        </w:rPr>
+        <w:t>Servicios de negocio para validacion, calculo de totales, actualizacion de stock, registro de ventas y calculo de saldos de credito.</w:t>
       </w:r>
     </w:p>
     <w:p>
@@ -5363,14 +5363,61 @@
         <w:rPr>
           <w:sz w:val="22"/>
         </w:rPr>
-        <w:t xml:space="preserve">Se implemento un sistema web funcional para Chompas Mabel con módulos de </w:t>
-      </w:r>
-      <w:proofErr w:type="spellStart"/>
-      <w:r>
-        <w:rPr>
-          <w:sz w:val="22"/>
-        </w:rPr>
-        <w:t>login</w:t>
+        <w:t xml:space="preserve">Se implemento un sistema web funcional para Chompas Mabel con modulos de login, dashboard, productos, inventario, clientes, pedidos, ventas, creditos y reportes.</w:t>
+      </w:r>
+      <w:proofErr w:type="spellStart"/>
+      <w:r>
+        <w:rPr>
+          <w:sz w:val="22"/>
+        </w:rPr>
+        <w:t/>
+      </w:r>
+      <w:proofErr w:type="spellEnd"/>
+      <w:r>
+        <w:rPr>
+          <w:sz w:val="22"/>
+        </w:rPr>
+        <w:t xml:space="preserve"/>
+      </w:r>
+      <w:proofErr w:type="spellStart"/>
+      <w:r>
+        <w:rPr>
+          <w:sz w:val="22"/>
+        </w:rPr>
+        <w:t/>
+      </w:r>
+      <w:proofErr w:type="spellEnd"/>
+      <w:r>
+        <w:rPr>
+          <w:sz w:val="22"/>
+        </w:rPr>
+        <w:t/>
+      </w:r>
+    </w:p>
+    <w:p>
+      <w:pPr>
+        <w:spacing w:after="155" w:line="360" w:lineRule="auto"/>
+        <w:ind w:left="0" w:right="200" w:firstLine="0"/>
+        <w:rPr>
+          <w:rFonts w:ascii="Century Gothic" w:hAnsi="Century Gothic"/>
+          <w:b/>
+          <w:color w:val="202124"/>
+          <w:sz w:val="26"/>
+          <w:szCs w:val="26"/>
+        </w:rPr>
+      </w:pPr>
+      <w:r>
+        <w:rPr>
+          <w:sz w:val="22"/>
+        </w:rPr>
+        <w:t xml:space="preserve">La arquitectura cumple con el enfoque de Ingeniería Web al separar </w:t>
+      </w:r>
+      <w:proofErr w:type="spellStart"/>
+      <w:r>
+        <w:rPr>
+          <w:sz w:val="22"/>
+        </w:rPr>
+        <w:t>frontend</w:t>
       </w:r>
       <w:proofErr w:type="spellEnd"/>
       <w:r>
@@ -5384,14 +5431,14 @@
         <w:rPr>
           <w:sz w:val="22"/>
         </w:rPr>
-        <w:t>dashboard</w:t>
-      </w:r>
-      <w:proofErr w:type="spellEnd"/>
-      <w:r>
-        <w:rPr>
-          <w:sz w:val="22"/>
-        </w:rPr>
-        <w:t>, productos, inventario, clientes, pedidos, ventas y reportes.</w:t>
+        <w:t>backend</w:t>
+      </w:r>
+      <w:proofErr w:type="spellEnd"/>
+      <w:r>
+        <w:rPr>
+          <w:sz w:val="22"/>
+        </w:rPr>
+        <w:t xml:space="preserve"> y persistencia, facilitando mantenimiento y crecimiento.</w:t>
       </w:r>
     </w:p>
     <w:p>
@@ -5410,54 +5457,7 @@
         <w:rPr>
           <w:sz w:val="22"/>
         </w:rPr>
-        <w:t xml:space="preserve">La arquitectura cumple con el enfoque de Ingeniería Web al separar </w:t>
-      </w:r>
-      <w:proofErr w:type="spellStart"/>
-      <w:r>
-        <w:rPr>
-          <w:sz w:val="22"/>
-        </w:rPr>
-        <w:t>frontend</w:t>
-      </w:r>
-      <w:proofErr w:type="spellEnd"/>
-      <w:r>
-        <w:rPr>
-          <w:sz w:val="22"/>
-        </w:rPr>
-        <w:t xml:space="preserve">, </w:t>
-      </w:r>
-      <w:proofErr w:type="spellStart"/>
-      <w:r>
-        <w:rPr>
-          <w:sz w:val="22"/>
-        </w:rPr>
-        <w:t>backend</w:t>
-      </w:r>
-      <w:proofErr w:type="spellEnd"/>
-      <w:r>
-        <w:rPr>
-          <w:sz w:val="22"/>
-        </w:rPr>
-        <w:t xml:space="preserve"> y persistencia, facilitando mantenimiento y crecimiento.</w:t>
-      </w:r>
-    </w:p>
-    <w:p>
-      <w:pPr>
-        <w:spacing w:after="155" w:line="360" w:lineRule="auto"/>
-        <w:ind w:left="0" w:right="200" w:firstLine="0"/>
-        <w:rPr>
-          <w:rFonts w:ascii="Century Gothic" w:hAnsi="Century Gothic"/>
-          <w:b/>
-          <w:color w:val="202124"/>
-          <w:sz w:val="26"/>
-          <w:szCs w:val="26"/>
-        </w:rPr>
-      </w:pPr>
-      <w:r>
-        <w:rPr>
-          <w:sz w:val="22"/>
-        </w:rPr>
-        <w:t>La base de datos relacional permite representar correctamente categorías, productos, clientes, usuarios, pedidos, detalles, ventas e inventario.</w:t>
+        <w:t>La base de datos relacional permite representar correctamente categorias, productos, clientes, usuarios, pedidos, detalles, ventas, inventario y cuentas por cobrar.</w:t>
       </w:r>
     </w:p>
     <w:p>
@@ -6723,7 +6723,7 @@
         <w:rPr>
           <w:sz w:val="22"/>
         </w:rPr>
-        <w:t>Anexo 3. Usuario de prueba: admin@chompasmabel.pe / admin123</w:t>
+        <w:t>Anexo 3. Usuarios de prueba: admin@chompasmabel.com / admin123 y vendedor@chompasmabel.com / venta123</w:t>
       </w:r>
     </w:p>
     <w:p>
@@ -6738,7 +6738,7 @@
           <w:sz w:val="22"/>
           <w:lang w:val="en-US"/>
         </w:rPr>
-        <w:t xml:space="preserve">Anexo 4. </w:t>
+        <w:t xml:space="preserve">Anexo 4. Estructura principal actualizada: frontend-angular con core, services, models y features incluyendo creditos; backend-springboot con controller, service, repository, model, dto y config; database/schema.sql; docker-compose.yml; README.md principal; README por modulo; docs/entregables e imagenes.</w:t>
       </w:r>
       <w:proofErr w:type="spellStart"/>
       <w:r>
@@ -6746,7 +6746,7 @@
           <w:sz w:val="22"/>
           <w:lang w:val="en-US"/>
         </w:rPr>
-        <w:t>Estructura</w:t>
+        <w:t/>
       </w:r>
       <w:proofErr w:type="spellEnd"/>
       <w:r>
@@ -6754,7 +6754,7 @@
           <w:sz w:val="22"/>
           <w:lang w:val="en-US"/>
         </w:rPr>
-        <w:t xml:space="preserve"> principal: frontend-angular, backend-</w:t>
+        <w:t xml:space="preserve"/>
       </w:r>
       <w:proofErr w:type="spellStart"/>
       <w:r>
@@ -6762,7 +6762,7 @@
           <w:sz w:val="22"/>
           <w:lang w:val="en-US"/>
         </w:rPr>
-        <w:t>springboot</w:t>
+        <w:t/>
       </w:r>
       <w:proofErr w:type="spellEnd"/>
       <w:r>
@@ -6770,7 +6770,7 @@
           <w:sz w:val="22"/>
           <w:lang w:val="en-US"/>
         </w:rPr>
-        <w:t>, database, docker-</w:t>
+        <w:t/>
       </w:r>
       <w:proofErr w:type="spellStart"/>
       <w:r>
@@ -6778,7 +6778,7 @@
           <w:sz w:val="22"/>
           <w:lang w:val="en-US"/>
         </w:rPr>
-        <w:t>compose.yml</w:t>
+        <w:t/>
       </w:r>
       <w:proofErr w:type="spellEnd"/>
       <w:r>
@@ -6786,7 +6786,7 @@
           <w:sz w:val="22"/>
           <w:lang w:val="en-US"/>
         </w:rPr>
-        <w:t xml:space="preserve"> y README.md.</w:t>
+        <w:t xml:space="preserve"/>
       </w:r>
     </w:p>
     <w:p>

</xml_diff>

<commit_message>
clarify role flows and notifications
</commit_message>
<xml_diff>
--- a/docs/entregables/Informe_Final_Chompas_Mabel.docx
+++ b/docs/entregables/Informe_Final_Chompas_Mabel.docx
@@ -2264,21 +2264,21 @@
         <w:rPr>
           <w:sz w:val="22"/>
         </w:rPr>
-        <w:t xml:space="preserve">El sistema </w:t>
-      </w:r>
-      <w:proofErr w:type="spellStart"/>
-      <w:r>
-        <w:rPr>
-          <w:sz w:val="22"/>
-        </w:rPr>
-        <w:t>esta</w:t>
-      </w:r>
-      <w:proofErr w:type="spellEnd"/>
-      <w:r>
-        <w:rPr>
-          <w:sz w:val="22"/>
-        </w:rPr>
-        <w:t xml:space="preserve"> dirigido al personal administrativo, vendedores y responsables de inventario de Chompas Mabel.</w:t>
+        <w:t xml:space="preserve">El sistema esta dirigido a dos perfiles principales: administrador y vendedor. El administrador controla productos, inventario, reportes, creditos y configuracion operativa; el vendedor registra clientes, pedidos, ventas y pagos de creditos sin modificar inventario.</w:t>
+      </w:r>
+      <w:proofErr w:type="spellStart"/>
+      <w:r>
+        <w:rPr>
+          <w:sz w:val="22"/>
+        </w:rPr>
+        <w:t/>
+      </w:r>
+      <w:proofErr w:type="spellEnd"/>
+      <w:r>
+        <w:rPr>
+          <w:sz w:val="22"/>
+        </w:rPr>
+        <w:t xml:space="preserve"/>
       </w:r>
     </w:p>
     <w:p>
@@ -2297,35 +2297,35 @@
         <w:rPr>
           <w:sz w:val="22"/>
         </w:rPr>
-        <w:t xml:space="preserve">También puede servir cómo base académica para demostrar conocimientos de Ingeniería Web mediante una aplicación real con </w:t>
-      </w:r>
-      <w:proofErr w:type="spellStart"/>
-      <w:r>
-        <w:rPr>
-          <w:sz w:val="22"/>
-        </w:rPr>
-        <w:t>frontend</w:t>
-      </w:r>
-      <w:proofErr w:type="spellEnd"/>
-      <w:r>
-        <w:rPr>
-          <w:sz w:val="22"/>
-        </w:rPr>
-        <w:t xml:space="preserve">, </w:t>
-      </w:r>
-      <w:proofErr w:type="spellStart"/>
-      <w:r>
-        <w:rPr>
-          <w:sz w:val="22"/>
-        </w:rPr>
-        <w:t>backend</w:t>
-      </w:r>
-      <w:proofErr w:type="spellEnd"/>
-      <w:r>
-        <w:rPr>
-          <w:sz w:val="22"/>
-        </w:rPr>
-        <w:t>, base de datos y despliegue local reproducible.</w:t>
+        <w:t xml:space="preserve">Tambien sirve como base academica para demostrar requerimientos de usuario, flujo por rol, arquitectura web, persistencia en MySQL y ejecucion local reproducible.</w:t>
+      </w:r>
+      <w:proofErr w:type="spellStart"/>
+      <w:r>
+        <w:rPr>
+          <w:sz w:val="22"/>
+        </w:rPr>
+        <w:t/>
+      </w:r>
+      <w:proofErr w:type="spellEnd"/>
+      <w:r>
+        <w:rPr>
+          <w:sz w:val="22"/>
+        </w:rPr>
+        <w:t xml:space="preserve"/>
+      </w:r>
+      <w:proofErr w:type="spellStart"/>
+      <w:r>
+        <w:rPr>
+          <w:sz w:val="22"/>
+        </w:rPr>
+        <w:t/>
+      </w:r>
+      <w:proofErr w:type="spellEnd"/>
+      <w:r>
+        <w:rPr>
+          <w:sz w:val="22"/>
+        </w:rPr>
+        <w:t/>
       </w:r>
     </w:p>
     <w:p>
@@ -2900,7 +2900,7 @@
         <w:rPr>
           <w:sz w:val="22"/>
         </w:rPr>
-        <w:t xml:space="preserve">Presentacion: Angular 21, componentes standalone, routing, formularios reactivos, signals para estados de interfaz y servicios HTTP.</w:t>
+        <w:t xml:space="preserve">Presentacion: Angular 21, componentes standalone, routing, formularios reactivos, menu por rol, campana de notificaciones, signals para estados de interfaz y servicios HTTP.</w:t>
       </w:r>
       <w:proofErr w:type="spellStart"/>
       <w:r>
@@ -3297,29 +3297,29 @@
         <w:rPr>
           <w:sz w:val="22"/>
         </w:rPr>
-        <w:t>/</w:t>
-      </w:r>
-      <w:proofErr w:type="spellStart"/>
-      <w:r>
-        <w:rPr>
-          <w:sz w:val="22"/>
-        </w:rPr>
-        <w:t>dashboard</w:t>
-      </w:r>
-      <w:proofErr w:type="spellEnd"/>
-      <w:r>
-        <w:rPr>
-          <w:sz w:val="22"/>
-        </w:rPr>
-        <w:t>: indicadores generales de productos, clientes, pedidos, ventas e inventario.</w:t>
-      </w:r>
-    </w:p>
-    <w:p>
-      <w:r>
-        <w:rPr>
-          <w:sz w:val="22"/>
-        </w:rPr>
-        <w:t>/productos e /inventario: mantenimiento de productos, stock y movimientos.</w:t>
+        <w:t>/dashboard: indicadores diferenciados para administrador y vendedor.</w:t>
+      </w:r>
+      <w:proofErr w:type="spellStart"/>
+      <w:r>
+        <w:rPr>
+          <w:sz w:val="22"/>
+        </w:rPr>
+        <w:t/>
+      </w:r>
+      <w:proofErr w:type="spellEnd"/>
+      <w:r>
+        <w:rPr>
+          <w:sz w:val="22"/>
+        </w:rPr>
+        <w:t/>
+      </w:r>
+    </w:p>
+    <w:p>
+      <w:r>
+        <w:rPr>
+          <w:sz w:val="22"/>
+        </w:rPr>
+        <w:t>/productos: catalogo visible para ambos roles; /inventario: mantenimiento reservado al administrador.</w:t>
       </w:r>
     </w:p>
     <w:p>
@@ -3343,7 +3343,7 @@
         <w:rPr>
           <w:sz w:val="22"/>
         </w:rPr>
-        <w:t>/reportes: métricas de ventas, pedidos y stock.</w:t>
+        <w:t>/reportes: metricas de ventas, pedidos, stock y creditos, visibles para administrador.</w:t>
       </w:r>
     </w:p>
     <w:p>
@@ -3507,7 +3507,7 @@
           <w:i/>
           <w:sz w:val="20"/>
         </w:rPr>
-        <w:t xml:space="preserve">Figura 4. Módulo </w:t>
+        <w:t xml:space="preserve">Figura 4. Modulo Dashboard: vista administrativa o de vendedor segun el rol autenticado.</w:t>
       </w:r>
       <w:proofErr w:type="spellStart"/>
       <w:r>
@@ -3515,7 +3515,7 @@
           <w:i/>
           <w:sz w:val="20"/>
         </w:rPr>
-        <w:t>Dashboard</w:t>
+        <w:t/>
       </w:r>
       <w:proofErr w:type="spellEnd"/>
       <w:r>
@@ -3523,7 +3523,7 @@
           <w:i/>
           <w:sz w:val="20"/>
         </w:rPr>
-        <w:t>: resumen general e indicadores.</w:t>
+        <w:t/>
       </w:r>
     </w:p>
     <w:p>
@@ -3580,7 +3580,7 @@
           <w:i/>
           <w:sz w:val="20"/>
         </w:rPr>
-        <w:t>Figura 5. Módulo Productos: listado, registro, edición y eliminación.</w:t>
+        <w:t>Figura 5. Modulo Productos: mantenimiento completo para administrador y catalogo de consulta para vendedor.</w:t>
       </w:r>
     </w:p>
     <w:p>
@@ -3761,7 +3761,7 @@
         <w:rPr>
           <w:sz w:val="22"/>
         </w:rPr>
-        <w:t>Estas vistas evidencian que el sistema fue construido como producto funcional: cada pantalla tiene rutas, componentes, formularios, validaciones, conexion con servicios HTTP y seguimiento de creditos pendientes o vencidos.</w:t>
+        <w:t>Estas vistas evidencian que el sistema fue construido como producto funcional: cada pantalla tiene rutas, componentes, formularios, validaciones, conexion con servicios HTTP, flujo por rol y campana de notificaciones con alertas reales.</w:t>
       </w:r>
     </w:p>
     <w:p>
@@ -4458,7 +4458,7 @@
         <w:rPr>
           <w:sz w:val="22"/>
         </w:rPr>
-        <w:t xml:space="preserve">Componentes para login, dashboard, productos, clientes, pedidos, creditos y reportes.</w:t>
+        <w:t xml:space="preserve">Componentes para login, dashboard, productos, clientes, pedidos, creditos, reportes y layout con menu por rol.</w:t>
       </w:r>
       <w:proofErr w:type="spellStart"/>
       <w:r>
@@ -4505,63 +4505,63 @@
         <w:rPr>
           <w:sz w:val="22"/>
         </w:rPr>
-        <w:t xml:space="preserve">Servicios HTTP: </w:t>
-      </w:r>
-      <w:proofErr w:type="spellStart"/>
-      <w:r>
-        <w:rPr>
-          <w:sz w:val="22"/>
-        </w:rPr>
-        <w:t>auth.service</w:t>
-      </w:r>
-      <w:proofErr w:type="spellEnd"/>
-      <w:r>
-        <w:rPr>
-          <w:sz w:val="22"/>
-        </w:rPr>
-        <w:t xml:space="preserve">, </w:t>
-      </w:r>
-      <w:proofErr w:type="spellStart"/>
-      <w:r>
-        <w:rPr>
-          <w:sz w:val="22"/>
-        </w:rPr>
-        <w:t>producto.service</w:t>
-      </w:r>
-      <w:proofErr w:type="spellEnd"/>
-      <w:r>
-        <w:rPr>
-          <w:sz w:val="22"/>
-        </w:rPr>
-        <w:t xml:space="preserve">, </w:t>
-      </w:r>
-      <w:proofErr w:type="spellStart"/>
-      <w:r>
-        <w:rPr>
-          <w:sz w:val="22"/>
-        </w:rPr>
-        <w:t>cliente.service</w:t>
-      </w:r>
-      <w:proofErr w:type="spellEnd"/>
-      <w:r>
-        <w:rPr>
-          <w:sz w:val="22"/>
-        </w:rPr>
-        <w:t xml:space="preserve"> y </w:t>
-      </w:r>
-      <w:proofErr w:type="spellStart"/>
-      <w:r>
-        <w:rPr>
-          <w:sz w:val="22"/>
-        </w:rPr>
-        <w:t>pedido.service</w:t>
-      </w:r>
-      <w:proofErr w:type="spellEnd"/>
-      <w:r>
-        <w:rPr>
-          <w:sz w:val="22"/>
-        </w:rPr>
-        <w:t>.</w:t>
+        <w:t xml:space="preserve">Servicios HTTP: auth.service, producto.service, cliente.service y pedido.service; el login devuelve usuario, rol e identificador para diferenciar administrador y vendedor.</w:t>
+      </w:r>
+      <w:proofErr w:type="spellStart"/>
+      <w:r>
+        <w:rPr>
+          <w:sz w:val="22"/>
+        </w:rPr>
+        <w:t/>
+      </w:r>
+      <w:proofErr w:type="spellEnd"/>
+      <w:r>
+        <w:rPr>
+          <w:sz w:val="22"/>
+        </w:rPr>
+        <w:t xml:space="preserve"/>
+      </w:r>
+      <w:proofErr w:type="spellStart"/>
+      <w:r>
+        <w:rPr>
+          <w:sz w:val="22"/>
+        </w:rPr>
+        <w:t/>
+      </w:r>
+      <w:proofErr w:type="spellEnd"/>
+      <w:r>
+        <w:rPr>
+          <w:sz w:val="22"/>
+        </w:rPr>
+        <w:t xml:space="preserve"/>
+      </w:r>
+      <w:proofErr w:type="spellStart"/>
+      <w:r>
+        <w:rPr>
+          <w:sz w:val="22"/>
+        </w:rPr>
+        <w:t/>
+      </w:r>
+      <w:proofErr w:type="spellEnd"/>
+      <w:r>
+        <w:rPr>
+          <w:sz w:val="22"/>
+        </w:rPr>
+        <w:t xml:space="preserve"/>
+      </w:r>
+      <w:proofErr w:type="spellStart"/>
+      <w:r>
+        <w:rPr>
+          <w:sz w:val="22"/>
+        </w:rPr>
+        <w:t/>
+      </w:r>
+      <w:proofErr w:type="spellEnd"/>
+      <w:r>
+        <w:rPr>
+          <w:sz w:val="22"/>
+        </w:rPr>
+        <w:t/>
       </w:r>
     </w:p>
     <w:p>
@@ -5363,7 +5363,7 @@
         <w:rPr>
           <w:sz w:val="22"/>
         </w:rPr>
-        <w:t xml:space="preserve">Se implemento un sistema web funcional para Chompas Mabel con modulos de login, dashboard, productos, inventario, clientes, pedidos, ventas, creditos y reportes.</w:t>
+        <w:t xml:space="preserve">Se implemento un sistema web funcional para Chompas Mabel con modulos de login, dashboard por rol, productos, inventario, clientes, pedidos, ventas, creditos, reportes y notificaciones.</w:t>
       </w:r>
       <w:proofErr w:type="spellStart"/>
       <w:r>
@@ -5537,7 +5537,7 @@
         <w:rPr>
           <w:sz w:val="22"/>
         </w:rPr>
-        <w:t>Las validaciones en Angular y Spring Boot reducen errores de ingreso de datos y mejoran la confiabilidad del sistema.</w:t>
+        <w:t>Las validaciones en Angular y Spring Boot reducen errores de ingreso de datos, mientras que el flujo por rol evita que el vendedor modifique secciones administrativas.</w:t>
       </w:r>
     </w:p>
     <w:p>
@@ -6738,7 +6738,7 @@
           <w:sz w:val="22"/>
           <w:lang w:val="en-US"/>
         </w:rPr>
-        <w:t xml:space="preserve">Anexo 4. Estructura principal actualizada: frontend-angular con core, services, models y features incluyendo creditos; backend-springboot con controller, service, repository, model, dto y config; database/schema.sql; docker-compose.yml; README.md principal; README por modulo; docs/entregables e imagenes.</w:t>
+        <w:t xml:space="preserve">Anexo 4. Estructura principal actualizada: frontend-angular con core, services, models, guard de roles y features incluyendo creditos; backend-springboot con controller, service, repository, model, dto y config; database/schema.sql; docs/requerimientos_usuario.md; docker-compose.yml; README.md principal; README por modulo; docs/entregables e imagenes.</w:t>
       </w:r>
       <w:proofErr w:type="spellStart"/>
       <w:r>

</xml_diff>

<commit_message>
align project with evaluation rubric
</commit_message>
<xml_diff>
--- a/docs/entregables/Informe_Final_Chompas_Mabel.docx
+++ b/docs/entregables/Informe_Final_Chompas_Mabel.docx
@@ -1,5 +1,66 @@
 
-<file path=word/document.xml><?xml version="1.0" encoding="utf-8"?>
+<file path=customXml\item1.xml><?xml version="1.0" encoding="utf-8"?>
+<b:Sources xmlns:b="http://schemas.openxmlformats.org/officeDocument/2006/bibliography" xmlns="http://schemas.openxmlformats.org/officeDocument/2006/bibliography" SelectedStyle="\APASixthEditionOfficeOnline.xsl" StyleName="APA" Version="6"/>
+</file>
+
+<file path=customXml\itemProps1.xml><?xml version="1.0" encoding="utf-8"?>
+<ds:datastoreItem xmlns:ds="http://schemas.openxmlformats.org/officeDocument/2006/customXml" ds:itemID="{902A56BA-3B9D-46BB-94DE-ECBC99AF0017}">
+  <ds:schemaRefs>
+    <ds:schemaRef ds:uri="http://schemas.openxmlformats.org/officeDocument/2006/bibliography"/>
+  </ds:schemaRefs>
+</ds:datastoreItem>
+</file>
+
+<file path=docProps\app.xml><?xml version="1.0" encoding="utf-8"?>
+<Properties xmlns="http://schemas.openxmlformats.org/officeDocument/2006/extended-properties" xmlns:vt="http://schemas.openxmlformats.org/officeDocument/2006/docPropsVTypes">
+  <Template>Normal</Template>
+  <TotalTime>55</TotalTime>
+  <Pages>17</Pages>
+  <Words>1976</Words>
+  <Characters>10868</Characters>
+  <Application>Microsoft Office Word</Application>
+  <DocSecurity>0</DocSecurity>
+  <Lines>90</Lines>
+  <Paragraphs>25</Paragraphs>
+  <ScaleCrop>false</ScaleCrop>
+  <HeadingPairs>
+    <vt:vector size="2" baseType="variant">
+      <vt:variant>
+        <vt:lpstr>Título</vt:lpstr>
+      </vt:variant>
+      <vt:variant>
+        <vt:i4>1</vt:i4>
+      </vt:variant>
+    </vt:vector>
+  </HeadingPairs>
+  <TitlesOfParts>
+    <vt:vector size="1" baseType="lpstr">
+      <vt:lpstr/>
+    </vt:vector>
+  </TitlesOfParts>
+  <Company/>
+  <LinksUpToDate>false</LinksUpToDate>
+  <CharactersWithSpaces>12819</CharactersWithSpaces>
+  <SharedDoc>false</SharedDoc>
+  <HyperlinksChanged>false</HyperlinksChanged>
+  <AppVersion>16.0000</AppVersion>
+</Properties>
+</file>
+
+<file path=docProps\core.xml><?xml version="1.0" encoding="utf-8"?>
+<cp:coreProperties xmlns:cp="http://schemas.openxmlformats.org/package/2006/metadata/core-properties" xmlns:dc="http://purl.org/dc/elements/1.1/" xmlns:dcterms="http://purl.org/dc/terms/" xmlns:dcmitype="http://purl.org/dc/dcmitype/" xmlns:xsi="http://www.w3.org/2001/XMLSchema-instance">
+  <dc:title/>
+  <dc:subject/>
+  <dc:creator>Jaqueline Inga Pérez</dc:creator>
+  <cp:keywords/>
+  <cp:lastModifiedBy>DIEGO GABRIEL ANGULO GONZALES</cp:lastModifiedBy>
+  <cp:revision>13</cp:revision>
+  <dcterms:created xsi:type="dcterms:W3CDTF">2025-09-21T05:21:00Z</dcterms:created>
+  <dcterms:modified xsi:type="dcterms:W3CDTF">2026-05-31T07:01:00Z</dcterms:modified>
+</cp:coreProperties>
+</file>
+
+<file path=word\document.xml><?xml version="1.0" encoding="utf-8"?>
 <w:document xmlns:wpc="http://schemas.microsoft.com/office/word/2010/wordprocessingCanvas" xmlns:cx="http://schemas.microsoft.com/office/drawing/2014/chartex" xmlns:cx1="http://schemas.microsoft.com/office/drawing/2015/9/8/chartex" xmlns:cx2="http://schemas.microsoft.com/office/drawing/2015/10/21/chartex" xmlns:cx3="http://schemas.microsoft.com/office/drawing/2016/5/9/chartex" xmlns:cx4="http://schemas.microsoft.com/office/drawing/2016/5/10/chartex" xmlns:cx5="http://schemas.microsoft.com/office/drawing/2016/5/11/chartex" xmlns:cx6="http://schemas.microsoft.com/office/drawing/2016/5/12/chartex" xmlns:cx7="http://schemas.microsoft.com/office/drawing/2016/5/13/chartex" xmlns:cx8="http://schemas.microsoft.com/office/drawing/2016/5/14/chartex" xmlns:mc="http://schemas.openxmlformats.org/markup-compatibility/2006" xmlns:aink="http://schemas.microsoft.com/office/drawing/2016/ink" xmlns:am3d="http://schemas.microsoft.com/office/drawing/2017/model3d" xmlns:o="urn:schemas-microsoft-com:office:office" xmlns:oel="http://schemas.microsoft.com/office/2019/extlst" xmlns:r="http://schemas.openxmlformats.org/officeDocument/2006/relationships" xmlns:m="http://schemas.openxmlformats.org/officeDocument/2006/math" xmlns:v="urn:schemas-microsoft-com:vml" xmlns:wp14="http://schemas.microsoft.com/office/word/2010/wordprocessingDrawing" xmlns:wp="http://schemas.openxmlformats.org/drawingml/2006/wordprocessingDrawing" xmlns:w10="urn:schemas-microsoft-com:office:word" xmlns:w="http://schemas.openxmlformats.org/wordprocessingml/2006/main" xmlns:w14="http://schemas.microsoft.com/office/word/2010/wordml" xmlns:w15="http://schemas.microsoft.com/office/word/2012/wordml" xmlns:w16cex="http://schemas.microsoft.com/office/word/2018/wordml/cex" xmlns:w16cid="http://schemas.microsoft.com/office/word/2016/wordml/cid" xmlns:w16="http://schemas.microsoft.com/office/word/2018/wordml" xmlns:w16du="http://schemas.microsoft.com/office/word/2023/wordml/word16du" xmlns:w16sdtdh="http://schemas.microsoft.com/office/word/2020/wordml/sdtdatahash" xmlns:w16sdtfl="http://schemas.microsoft.com/office/word/2024/wordml/sdtformatlock" xmlns:w16se="http://schemas.microsoft.com/office/word/2015/wordml/symex" xmlns:wpg="http://schemas.microsoft.com/office/word/2010/wordprocessingGroup" xmlns:wpi="http://schemas.microsoft.com/office/word/2010/wordprocessingInk" xmlns:wne="http://schemas.microsoft.com/office/word/2006/wordml" xmlns:wps="http://schemas.microsoft.com/office/word/2010/wordprocessingShape" mc:Ignorable="w14 w15 w16se w16cid w16 w16cex w16sdtdh w16sdtfl w16du wp14">
   <w:body>
     <w:p>
@@ -6825,11 +6886,77 @@
       <w:titlePg/>
       <w:docGrid w:linePitch="326"/>
     </w:sectPr>
+    <w:p>
+      <w:r>
+        <w:br w:type="page"/>
+      </w:r>
+    </w:p>
+    <w:p>
+      <w:pPr>
+        <w:pStyle w:val="Heading1"/>
+      </w:pPr>
+      <w:r>
+        <w:rPr>
+          <w:b/>
+        </w:rPr>
+        <w:t xml:space="preserve">Actualizacion final segun rubrica de evaluacion</w:t>
+      </w:r>
+    </w:p>
+    <w:p>
+      <w:r>
+        <w:t xml:space="preserve">El proyecto se actualizo para cubrir los criterios principales de la rubrica: frontend funcional en Angular 21, backend REST con FastAPI, base de datos MySQL normalizada con procedimientos almacenados, integracion completa y documentacion para sustentacion.</w:t>
+      </w:r>
+    </w:p>
+    <w:p>
+      <w:r>
+        <w:t xml:space="preserve">Frontend actualizado: se mantienen componentes standalone, servicios con HttpClient, signals, validaciones, rutas protegidas por rol y diseno responsive. El administrador cuenta con gestion de productos, inventario, ventas, creditos y reportes. El vendedor cuenta con catalogo visual para atencion al cliente, pedidos, clientes, ventas y creditos.</w:t>
+      </w:r>
+    </w:p>
+    <w:p>
+      <w:r>
+        <w:t xml:space="preserve">Se corrigieron rutas duplicadas: /productos conserva el componente de catalogo y mantenimiento; /inventario usa un componente dedicado para movimientos de inventario; /pedidos registra pedidos; /ventas muestra historial de ventas cerradas.</w:t>
+      </w:r>
+    </w:p>
+    <w:p>
+      <w:r>
+        <w:t xml:space="preserve">Se implemento busqueda global en el topbar para filtrar en tiempo real productos, pedidos, clientes, creditos, ventas e inventario segun la vista activa.</w:t>
+      </w:r>
+    </w:p>
+    <w:p>
+      <w:r>
+        <w:t xml:space="preserve">Backend actualizado: se agrego backend-fastapi como API principal para la rubrica, disponible en http://localhost:8000/api. Expone autenticacion, productos, clientes, pedidos, creditos, ventas, inventario y resumen de reportes. El backend Spring Boot queda como implementacion alternativa y compatible en http://localhost:8080/api.</w:t>
+      </w:r>
+    </w:p>
+    <w:p>
+      <w:r>
+        <w:t xml:space="preserve">Base de datos actualizada: database/schema.sql crea tablas, relaciones, restricciones, datos iniciales y procedimientos almacenados. Los procedimientos incluidos son sp_listar_productos, sp_listar_clientes, sp_listar_pedidos, sp_listar_detalles_pedido, sp_listar_ventas, sp_listar_movimientos_inventario y sp_resumen_reportes.</w:t>
+      </w:r>
+    </w:p>
+    <w:p>
+      <w:r>
+        <w:t xml:space="preserve">Creditos y cuentas por cobrar: los pedidos a credito registran monto pagado, saldo pendiente, fecha de vencimiento y estado del credito. El sistema permite detectar creditos vencidos, mostrar notificaciones y marcar creditos como pagados.</w:t>
+      </w:r>
+    </w:p>
+    <w:p>
+      <w:r>
+        <w:t xml:space="preserve">Docker y replicacion: docker-compose.yml levanta MySQL, FastAPI y Spring Boot. La guia docs/replicar_base_datos.md explica como importar la base con Docker, MySQL Workbench, XAMPP/phpMyAdmin o consola MySQL.</w:t>
+      </w:r>
+    </w:p>
+    <w:p>
+      <w:r>
+        <w:t xml:space="preserve">Seguridad y sesion: el interceptor HTTP agrega el token demo y, si recibe una respuesta 401, limpia localStorage y redirige automaticamente al login.</w:t>
+      </w:r>
+    </w:p>
+    <w:p>
+      <w:r>
+        <w:t xml:space="preserve">Con esta actualizacion el proyecto queda alineado con la rubrica: Angular 21 en el frontend, FastAPI como backend principal, MySQL con procedimientos almacenados e integracion documentada para exposicion.</w:t>
+      </w:r>
+    </w:p>
   </w:body>
 </w:document>
 </file>
 
-<file path=word/endnotes.xml><?xml version="1.0" encoding="utf-8"?>
+<file path=word\endnotes.xml><?xml version="1.0" encoding="utf-8"?>
 <w:endnotes xmlns:wpc="http://schemas.microsoft.com/office/word/2010/wordprocessingCanvas" xmlns:cx="http://schemas.microsoft.com/office/drawing/2014/chartex" xmlns:cx1="http://schemas.microsoft.com/office/drawing/2015/9/8/chartex" xmlns:cx2="http://schemas.microsoft.com/office/drawing/2015/10/21/chartex" xmlns:cx3="http://schemas.microsoft.com/office/drawing/2016/5/9/chartex" xmlns:cx4="http://schemas.microsoft.com/office/drawing/2016/5/10/chartex" xmlns:cx5="http://schemas.microsoft.com/office/drawing/2016/5/11/chartex" xmlns:cx6="http://schemas.microsoft.com/office/drawing/2016/5/12/chartex" xmlns:cx7="http://schemas.microsoft.com/office/drawing/2016/5/13/chartex" xmlns:cx8="http://schemas.microsoft.com/office/drawing/2016/5/14/chartex" xmlns:mc="http://schemas.openxmlformats.org/markup-compatibility/2006" xmlns:aink="http://schemas.microsoft.com/office/drawing/2016/ink" xmlns:am3d="http://schemas.microsoft.com/office/drawing/2017/model3d" xmlns:o="urn:schemas-microsoft-com:office:office" xmlns:oel="http://schemas.microsoft.com/office/2019/extlst" xmlns:r="http://schemas.openxmlformats.org/officeDocument/2006/relationships" xmlns:m="http://schemas.openxmlformats.org/officeDocument/2006/math" xmlns:v="urn:schemas-microsoft-com:vml" xmlns:wp14="http://schemas.microsoft.com/office/word/2010/wordprocessingDrawing" xmlns:wp="http://schemas.openxmlformats.org/drawingml/2006/wordprocessingDrawing" xmlns:w10="urn:schemas-microsoft-com:office:word" xmlns:w="http://schemas.openxmlformats.org/wordprocessingml/2006/main" xmlns:w14="http://schemas.microsoft.com/office/word/2010/wordml" xmlns:w15="http://schemas.microsoft.com/office/word/2012/wordml" xmlns:w16cex="http://schemas.microsoft.com/office/word/2018/wordml/cex" xmlns:w16cid="http://schemas.microsoft.com/office/word/2016/wordml/cid" xmlns:w16="http://schemas.microsoft.com/office/word/2018/wordml" xmlns:w16du="http://schemas.microsoft.com/office/word/2023/wordml/word16du" xmlns:w16sdtdh="http://schemas.microsoft.com/office/word/2020/wordml/sdtdatahash" xmlns:w16sdtfl="http://schemas.microsoft.com/office/word/2024/wordml/sdtformatlock" xmlns:w16se="http://schemas.microsoft.com/office/word/2015/wordml/symex" xmlns:wpg="http://schemas.microsoft.com/office/word/2010/wordprocessingGroup" xmlns:wpi="http://schemas.microsoft.com/office/word/2010/wordprocessingInk" xmlns:wne="http://schemas.microsoft.com/office/word/2006/wordml" xmlns:wps="http://schemas.microsoft.com/office/word/2010/wordprocessingShape" mc:Ignorable="w14 w15 w16se w16cid w16 w16cex w16sdtdh w16sdtfl w16du wp14">
   <w:endnote w:type="separator" w:id="-1">
     <w:p>
@@ -6854,7 +6981,82 @@
 </w:endnotes>
 </file>
 
-<file path=word/footnotes.xml><?xml version="1.0" encoding="utf-8"?>
+<file path=word\fontTable.xml><?xml version="1.0" encoding="utf-8"?>
+<w:fonts xmlns:mc="http://schemas.openxmlformats.org/markup-compatibility/2006" xmlns:r="http://schemas.openxmlformats.org/officeDocument/2006/relationships" xmlns:w="http://schemas.openxmlformats.org/wordprocessingml/2006/main" xmlns:w14="http://schemas.microsoft.com/office/word/2010/wordml" xmlns:w15="http://schemas.microsoft.com/office/word/2012/wordml" xmlns:w16cex="http://schemas.microsoft.com/office/word/2018/wordml/cex" xmlns:w16cid="http://schemas.microsoft.com/office/word/2016/wordml/cid" xmlns:w16="http://schemas.microsoft.com/office/word/2018/wordml" xmlns:w16du="http://schemas.microsoft.com/office/word/2023/wordml/word16du" xmlns:w16sdtdh="http://schemas.microsoft.com/office/word/2020/wordml/sdtdatahash" xmlns:w16sdtfl="http://schemas.microsoft.com/office/word/2024/wordml/sdtformatlock" xmlns:w16se="http://schemas.microsoft.com/office/word/2015/wordml/symex" mc:Ignorable="w14 w15 w16se w16cid w16 w16cex w16sdtdh w16sdtfl w16du">
+  <w:font w:name="Symbol">
+    <w:panose1 w:val="05050102010706020507"/>
+    <w:charset w:val="02"/>
+    <w:family w:val="roman"/>
+    <w:pitch w:val="variable"/>
+    <w:sig w:usb0="00000000" w:usb1="10000000" w:usb2="00000000" w:usb3="00000000" w:csb0="80000000" w:csb1="00000000"/>
+  </w:font>
+  <w:font w:name="Times New Roman">
+    <w:panose1 w:val="02020603050405020304"/>
+    <w:charset w:val="00"/>
+    <w:family w:val="roman"/>
+    <w:pitch w:val="variable"/>
+    <w:sig w:usb0="E0002EFF" w:usb1="C000785B" w:usb2="00000009" w:usb3="00000000" w:csb0="000001FF" w:csb1="00000000"/>
+  </w:font>
+  <w:font w:name="Courier New">
+    <w:panose1 w:val="02070309020205020404"/>
+    <w:charset w:val="00"/>
+    <w:family w:val="modern"/>
+    <w:pitch w:val="fixed"/>
+    <w:sig w:usb0="E0002EFF" w:usb1="C0007843" w:usb2="00000009" w:usb3="00000000" w:csb0="000001FF" w:csb1="00000000"/>
+  </w:font>
+  <w:font w:name="Wingdings">
+    <w:panose1 w:val="05000000000000000000"/>
+    <w:charset w:val="02"/>
+    <w:family w:val="auto"/>
+    <w:pitch w:val="variable"/>
+    <w:sig w:usb0="00000000" w:usb1="10000000" w:usb2="00000000" w:usb3="00000000" w:csb0="80000000" w:csb1="00000000"/>
+  </w:font>
+  <w:font w:name="Arial">
+    <w:panose1 w:val="020B0604020202020204"/>
+    <w:charset w:val="00"/>
+    <w:family w:val="swiss"/>
+    <w:pitch w:val="variable"/>
+    <w:sig w:usb0="E0002EFF" w:usb1="C000785B" w:usb2="00000009" w:usb3="00000000" w:csb0="000001FF" w:csb1="00000000"/>
+  </w:font>
+  <w:font w:name="Segoe UI Symbol">
+    <w:panose1 w:val="020B0502040204020203"/>
+    <w:charset w:val="00"/>
+    <w:family w:val="swiss"/>
+    <w:pitch w:val="variable"/>
+    <w:sig w:usb0="800001E3" w:usb1="1200FFEF" w:usb2="00040000" w:usb3="00000000" w:csb0="00000001" w:csb1="00000000"/>
+  </w:font>
+  <w:font w:name="Calibri">
+    <w:panose1 w:val="020F0502020204030204"/>
+    <w:charset w:val="00"/>
+    <w:family w:val="swiss"/>
+    <w:pitch w:val="variable"/>
+    <w:sig w:usb0="E4002EFF" w:usb1="C000247B" w:usb2="00000009" w:usb3="00000000" w:csb0="000001FF" w:csb1="00000000"/>
+  </w:font>
+  <w:font w:name="Calibri Light">
+    <w:panose1 w:val="020F0302020204030204"/>
+    <w:charset w:val="00"/>
+    <w:family w:val="swiss"/>
+    <w:pitch w:val="variable"/>
+    <w:sig w:usb0="E4002EFF" w:usb1="C000247B" w:usb2="00000009" w:usb3="00000000" w:csb0="000001FF" w:csb1="00000000"/>
+  </w:font>
+  <w:font w:name="Century Gothic">
+    <w:panose1 w:val="020B0502020202020204"/>
+    <w:charset w:val="00"/>
+    <w:family w:val="swiss"/>
+    <w:pitch w:val="variable"/>
+    <w:sig w:usb0="00000287" w:usb1="00000000" w:usb2="00000000" w:usb3="00000000" w:csb0="0000009F" w:csb1="00000000"/>
+  </w:font>
+  <w:font w:name="Consolas">
+    <w:panose1 w:val="020B0609020204030204"/>
+    <w:charset w:val="00"/>
+    <w:family w:val="modern"/>
+    <w:pitch w:val="fixed"/>
+    <w:sig w:usb0="E00006FF" w:usb1="0000FCFF" w:usb2="00000001" w:usb3="00000000" w:csb0="0000019F" w:csb1="00000000"/>
+  </w:font>
+</w:fonts>
+</file>
+
+<file path=word\footnotes.xml><?xml version="1.0" encoding="utf-8"?>
 <w:footnotes xmlns:wpc="http://schemas.microsoft.com/office/word/2010/wordprocessingCanvas" xmlns:cx="http://schemas.microsoft.com/office/drawing/2014/chartex" xmlns:cx1="http://schemas.microsoft.com/office/drawing/2015/9/8/chartex" xmlns:cx2="http://schemas.microsoft.com/office/drawing/2015/10/21/chartex" xmlns:cx3="http://schemas.microsoft.com/office/drawing/2016/5/9/chartex" xmlns:cx4="http://schemas.microsoft.com/office/drawing/2016/5/10/chartex" xmlns:cx5="http://schemas.microsoft.com/office/drawing/2016/5/11/chartex" xmlns:cx6="http://schemas.microsoft.com/office/drawing/2016/5/12/chartex" xmlns:cx7="http://schemas.microsoft.com/office/drawing/2016/5/13/chartex" xmlns:cx8="http://schemas.microsoft.com/office/drawing/2016/5/14/chartex" xmlns:mc="http://schemas.openxmlformats.org/markup-compatibility/2006" xmlns:aink="http://schemas.microsoft.com/office/drawing/2016/ink" xmlns:am3d="http://schemas.microsoft.com/office/drawing/2017/model3d" xmlns:o="urn:schemas-microsoft-com:office:office" xmlns:oel="http://schemas.microsoft.com/office/2019/extlst" xmlns:r="http://schemas.openxmlformats.org/officeDocument/2006/relationships" xmlns:m="http://schemas.openxmlformats.org/officeDocument/2006/math" xmlns:v="urn:schemas-microsoft-com:vml" xmlns:wp14="http://schemas.microsoft.com/office/word/2010/wordprocessingDrawing" xmlns:wp="http://schemas.openxmlformats.org/drawingml/2006/wordprocessingDrawing" xmlns:w10="urn:schemas-microsoft-com:office:word" xmlns:w="http://schemas.openxmlformats.org/wordprocessingml/2006/main" xmlns:w14="http://schemas.microsoft.com/office/word/2010/wordml" xmlns:w15="http://schemas.microsoft.com/office/word/2012/wordml" xmlns:w16cex="http://schemas.microsoft.com/office/word/2018/wordml/cex" xmlns:w16cid="http://schemas.microsoft.com/office/word/2016/wordml/cid" xmlns:w16="http://schemas.microsoft.com/office/word/2018/wordml" xmlns:w16du="http://schemas.microsoft.com/office/word/2023/wordml/word16du" xmlns:w16sdtdh="http://schemas.microsoft.com/office/word/2020/wordml/sdtdatahash" xmlns:w16sdtfl="http://schemas.microsoft.com/office/word/2024/wordml/sdtformatlock" xmlns:w16se="http://schemas.microsoft.com/office/word/2015/wordml/symex" xmlns:wpg="http://schemas.microsoft.com/office/word/2010/wordprocessingGroup" xmlns:wpi="http://schemas.microsoft.com/office/word/2010/wordprocessingInk" xmlns:wne="http://schemas.microsoft.com/office/word/2006/wordml" xmlns:wps="http://schemas.microsoft.com/office/word/2010/wordprocessingShape" mc:Ignorable="w14 w15 w16se w16cid w16 w16cex w16sdtdh w16sdtfl w16du wp14">
   <w:footnote w:type="separator" w:id="-1">
     <w:p>
@@ -6879,7 +7081,7 @@
 </w:footnotes>
 </file>
 
-<file path=word/header1.xml><?xml version="1.0" encoding="utf-8"?>
+<file path=word\header1.xml><?xml version="1.0" encoding="utf-8"?>
 <w:hdr xmlns:wpc="http://schemas.microsoft.com/office/word/2010/wordprocessingCanvas" xmlns:cx="http://schemas.microsoft.com/office/drawing/2014/chartex" xmlns:cx1="http://schemas.microsoft.com/office/drawing/2015/9/8/chartex" xmlns:cx2="http://schemas.microsoft.com/office/drawing/2015/10/21/chartex" xmlns:cx3="http://schemas.microsoft.com/office/drawing/2016/5/9/chartex" xmlns:cx4="http://schemas.microsoft.com/office/drawing/2016/5/10/chartex" xmlns:cx5="http://schemas.microsoft.com/office/drawing/2016/5/11/chartex" xmlns:cx6="http://schemas.microsoft.com/office/drawing/2016/5/12/chartex" xmlns:cx7="http://schemas.microsoft.com/office/drawing/2016/5/13/chartex" xmlns:cx8="http://schemas.microsoft.com/office/drawing/2016/5/14/chartex" xmlns:mc="http://schemas.openxmlformats.org/markup-compatibility/2006" xmlns:aink="http://schemas.microsoft.com/office/drawing/2016/ink" xmlns:am3d="http://schemas.microsoft.com/office/drawing/2017/model3d" xmlns:o="urn:schemas-microsoft-com:office:office" xmlns:oel="http://schemas.microsoft.com/office/2019/extlst" xmlns:r="http://schemas.openxmlformats.org/officeDocument/2006/relationships" xmlns:m="http://schemas.openxmlformats.org/officeDocument/2006/math" xmlns:v="urn:schemas-microsoft-com:vml" xmlns:wp14="http://schemas.microsoft.com/office/word/2010/wordprocessingDrawing" xmlns:wp="http://schemas.openxmlformats.org/drawingml/2006/wordprocessingDrawing" xmlns:w10="urn:schemas-microsoft-com:office:word" xmlns:w="http://schemas.openxmlformats.org/wordprocessingml/2006/main" xmlns:w14="http://schemas.microsoft.com/office/word/2010/wordml" xmlns:w15="http://schemas.microsoft.com/office/word/2012/wordml" xmlns:w16cex="http://schemas.microsoft.com/office/word/2018/wordml/cex" xmlns:w16cid="http://schemas.microsoft.com/office/word/2016/wordml/cid" xmlns:w16="http://schemas.microsoft.com/office/word/2018/wordml" xmlns:w16du="http://schemas.microsoft.com/office/word/2023/wordml/word16du" xmlns:w16sdtdh="http://schemas.microsoft.com/office/word/2020/wordml/sdtdatahash" xmlns:w16sdtfl="http://schemas.microsoft.com/office/word/2024/wordml/sdtformatlock" xmlns:w16se="http://schemas.microsoft.com/office/word/2015/wordml/symex" xmlns:wpg="http://schemas.microsoft.com/office/word/2010/wordprocessingGroup" xmlns:wpi="http://schemas.microsoft.com/office/word/2010/wordprocessingInk" xmlns:wne="http://schemas.microsoft.com/office/word/2006/wordml" xmlns:wps="http://schemas.microsoft.com/office/word/2010/wordprocessingShape" mc:Ignorable="w14 w15 w16se w16cid w16 w16cex w16sdtdh w16sdtfl w16du wp14">
   <w:p>
     <w:pPr>
@@ -6962,7 +7164,7 @@
 </w:hdr>
 </file>
 
-<file path=word/numbering.xml><?xml version="1.0" encoding="utf-8"?>
+<file path=word\numbering.xml><?xml version="1.0" encoding="utf-8"?>
 <w:numbering xmlns:wpc="http://schemas.microsoft.com/office/word/2010/wordprocessingCanvas" xmlns:cx="http://schemas.microsoft.com/office/drawing/2014/chartex" xmlns:cx1="http://schemas.microsoft.com/office/drawing/2015/9/8/chartex" xmlns:cx2="http://schemas.microsoft.com/office/drawing/2015/10/21/chartex" xmlns:cx3="http://schemas.microsoft.com/office/drawing/2016/5/9/chartex" xmlns:cx4="http://schemas.microsoft.com/office/drawing/2016/5/10/chartex" xmlns:cx5="http://schemas.microsoft.com/office/drawing/2016/5/11/chartex" xmlns:cx6="http://schemas.microsoft.com/office/drawing/2016/5/12/chartex" xmlns:cx7="http://schemas.microsoft.com/office/drawing/2016/5/13/chartex" xmlns:cx8="http://schemas.microsoft.com/office/drawing/2016/5/14/chartex" xmlns:mc="http://schemas.openxmlformats.org/markup-compatibility/2006" xmlns:aink="http://schemas.microsoft.com/office/drawing/2016/ink" xmlns:am3d="http://schemas.microsoft.com/office/drawing/2017/model3d" xmlns:o="urn:schemas-microsoft-com:office:office" xmlns:oel="http://schemas.microsoft.com/office/2019/extlst" xmlns:r="http://schemas.openxmlformats.org/officeDocument/2006/relationships" xmlns:m="http://schemas.openxmlformats.org/officeDocument/2006/math" xmlns:v="urn:schemas-microsoft-com:vml" xmlns:wp14="http://schemas.microsoft.com/office/word/2010/wordprocessingDrawing" xmlns:wp="http://schemas.openxmlformats.org/drawingml/2006/wordprocessingDrawing" xmlns:w10="urn:schemas-microsoft-com:office:word" xmlns:w="http://schemas.openxmlformats.org/wordprocessingml/2006/main" xmlns:w14="http://schemas.microsoft.com/office/word/2010/wordml" xmlns:w15="http://schemas.microsoft.com/office/word/2012/wordml" xmlns:w16cex="http://schemas.microsoft.com/office/word/2018/wordml/cex" xmlns:w16cid="http://schemas.microsoft.com/office/word/2016/wordml/cid" xmlns:w16="http://schemas.microsoft.com/office/word/2018/wordml" xmlns:w16du="http://schemas.microsoft.com/office/word/2023/wordml/word16du" xmlns:w16sdtdh="http://schemas.microsoft.com/office/word/2020/wordml/sdtdatahash" xmlns:w16sdtfl="http://schemas.microsoft.com/office/word/2024/wordml/sdtformatlock" xmlns:w16se="http://schemas.microsoft.com/office/word/2015/wordml/symex" xmlns:wpg="http://schemas.microsoft.com/office/word/2010/wordprocessingGroup" xmlns:wpi="http://schemas.microsoft.com/office/word/2010/wordprocessingInk" xmlns:wne="http://schemas.microsoft.com/office/word/2006/wordml" xmlns:wps="http://schemas.microsoft.com/office/word/2010/wordprocessingShape" mc:Ignorable="w14 w15 w16se w16cid w16 w16cex w16sdtdh w16sdtfl w16du wp14">
   <w:abstractNum w:abstractNumId="0" w15:restartNumberingAfterBreak="0">
     <w:nsid w:val="0839351E"/>
@@ -10358,7 +10560,116 @@
 </w:numbering>
 </file>
 
-<file path=word/styles.xml><?xml version="1.0" encoding="utf-8"?>
+<file path=word\settings.xml><?xml version="1.0" encoding="utf-8"?>
+<w:settings xmlns:mc="http://schemas.openxmlformats.org/markup-compatibility/2006" xmlns:o="urn:schemas-microsoft-com:office:office" xmlns:r="http://schemas.openxmlformats.org/officeDocument/2006/relationships" xmlns:m="http://schemas.openxmlformats.org/officeDocument/2006/math" xmlns:v="urn:schemas-microsoft-com:vml" xmlns:w10="urn:schemas-microsoft-com:office:word" xmlns:w="http://schemas.openxmlformats.org/wordprocessingml/2006/main" xmlns:w14="http://schemas.microsoft.com/office/word/2010/wordml" xmlns:w15="http://schemas.microsoft.com/office/word/2012/wordml" xmlns:w16cex="http://schemas.microsoft.com/office/word/2018/wordml/cex" xmlns:w16cid="http://schemas.microsoft.com/office/word/2016/wordml/cid" xmlns:w16="http://schemas.microsoft.com/office/word/2018/wordml" xmlns:w16du="http://schemas.microsoft.com/office/word/2023/wordml/word16du" xmlns:w16sdtdh="http://schemas.microsoft.com/office/word/2020/wordml/sdtdatahash" xmlns:w16sdtfl="http://schemas.microsoft.com/office/word/2024/wordml/sdtformatlock" xmlns:w16se="http://schemas.microsoft.com/office/word/2015/wordml/symex" xmlns:sl="http://schemas.openxmlformats.org/schemaLibrary/2006/main" mc:Ignorable="w14 w15 w16se w16cid w16 w16cex w16sdtdh w16sdtfl w16du">
+  <w:zoom w:percent="100"/>
+  <w:proofState w:spelling="clean"/>
+  <w:defaultTabStop w:val="708"/>
+  <w:hyphenationZone w:val="425"/>
+  <w:characterSpacingControl w:val="doNotCompress"/>
+  <w:hdrShapeDefaults>
+    <o:shapedefaults v:ext="edit" spidmax="2050"/>
+  </w:hdrShapeDefaults>
+  <w:footnotePr>
+    <w:footnote w:id="-1"/>
+    <w:footnote w:id="0"/>
+  </w:footnotePr>
+  <w:endnotePr>
+    <w:endnote w:id="-1"/>
+    <w:endnote w:id="0"/>
+  </w:endnotePr>
+  <w:compat>
+    <w:useFELayout/>
+    <w:compatSetting w:name="compatibilityMode" w:uri="http://schemas.microsoft.com/office/word" w:val="15"/>
+    <w:compatSetting w:name="overrideTableStyleFontSizeAndJustification" w:uri="http://schemas.microsoft.com/office/word" w:val="1"/>
+    <w:compatSetting w:name="enableOpenTypeFeatures" w:uri="http://schemas.microsoft.com/office/word" w:val="1"/>
+    <w:compatSetting w:name="doNotFlipMirrorIndents" w:uri="http://schemas.microsoft.com/office/word" w:val="1"/>
+    <w:compatSetting w:name="differentiateMultirowTableHeaders" w:uri="http://schemas.microsoft.com/office/word" w:val="1"/>
+    <w:compatSetting w:name="useWord2013TrackBottomHyphenation" w:uri="http://schemas.microsoft.com/office/word" w:val="1"/>
+  </w:compat>
+  <w:rsids>
+    <w:rsidRoot w:val="00BD394D"/>
+    <w:rsid w:val="0007581C"/>
+    <w:rsid w:val="00082FDA"/>
+    <w:rsid w:val="000970E1"/>
+    <w:rsid w:val="000C1459"/>
+    <w:rsid w:val="001278B3"/>
+    <w:rsid w:val="001679F1"/>
+    <w:rsid w:val="00194FA9"/>
+    <w:rsid w:val="00265EF4"/>
+    <w:rsid w:val="002D1BC9"/>
+    <w:rsid w:val="002E31CD"/>
+    <w:rsid w:val="0042229C"/>
+    <w:rsid w:val="004A0E1C"/>
+    <w:rsid w:val="00512079"/>
+    <w:rsid w:val="0052714D"/>
+    <w:rsid w:val="005C5870"/>
+    <w:rsid w:val="005E5A78"/>
+    <w:rsid w:val="006B60BD"/>
+    <w:rsid w:val="00754A28"/>
+    <w:rsid w:val="007757EC"/>
+    <w:rsid w:val="00775E9C"/>
+    <w:rsid w:val="007A353A"/>
+    <w:rsid w:val="007F043B"/>
+    <w:rsid w:val="008422B9"/>
+    <w:rsid w:val="0088705F"/>
+    <w:rsid w:val="008B5823"/>
+    <w:rsid w:val="008C3CDA"/>
+    <w:rsid w:val="00A04994"/>
+    <w:rsid w:val="00A510E4"/>
+    <w:rsid w:val="00AA1C94"/>
+    <w:rsid w:val="00AA310F"/>
+    <w:rsid w:val="00AE3F9A"/>
+    <w:rsid w:val="00B06B3F"/>
+    <w:rsid w:val="00B679E1"/>
+    <w:rsid w:val="00BD394D"/>
+    <w:rsid w:val="00CB126D"/>
+    <w:rsid w:val="00CE00E1"/>
+    <w:rsid w:val="00CF3B44"/>
+    <w:rsid w:val="00D170B8"/>
+    <w:rsid w:val="00D310B3"/>
+    <w:rsid w:val="00D56EE9"/>
+    <w:rsid w:val="00DB6125"/>
+    <w:rsid w:val="00DF0991"/>
+    <w:rsid w:val="00E94255"/>
+    <w:rsid w:val="00EA2BF7"/>
+    <w:rsid w:val="00EF1513"/>
+    <w:rsid w:val="00EF6D43"/>
+    <w:rsid w:val="00F159CB"/>
+    <w:rsid w:val="00F22627"/>
+    <w:rsid w:val="00F3577A"/>
+    <w:rsid w:val="00F46418"/>
+    <w:rsid w:val="00FE716F"/>
+  </w:rsids>
+  <m:mathPr>
+    <m:mathFont m:val="Cambria Math"/>
+    <m:brkBin m:val="before"/>
+    <m:brkBinSub m:val="--"/>
+    <m:smallFrac m:val="0"/>
+    <m:dispDef/>
+    <m:lMargin m:val="0"/>
+    <m:rMargin m:val="0"/>
+    <m:defJc m:val="centerGroup"/>
+    <m:wrapIndent m:val="1440"/>
+    <m:intLim m:val="subSup"/>
+    <m:naryLim m:val="undOvr"/>
+  </m:mathPr>
+  <w:themeFontLang w:val="es-PE"/>
+  <w:clrSchemeMapping w:bg1="light1" w:t1="dark1" w:bg2="light2" w:t2="dark2" w:accent1="accent1" w:accent2="accent2" w:accent3="accent3" w:accent4="accent4" w:accent5="accent5" w:accent6="accent6" w:hyperlink="hyperlink" w:followedHyperlink="followedHyperlink"/>
+  <w:shapeDefaults>
+    <o:shapedefaults v:ext="edit" spidmax="2050"/>
+    <o:shapelayout v:ext="edit">
+      <o:idmap v:ext="edit" data="2"/>
+    </o:shapelayout>
+  </w:shapeDefaults>
+  <w:decimalSymbol w:val="."/>
+  <w:listSeparator w:val=";"/>
+  <w14:docId w14:val="0EBF6C51"/>
+  <w15:docId w15:val="{94B5EB97-90B5-4D0F-97FC-E5510761B87F}"/>
+</w:settings>
+</file>
+
+<file path=word\styles.xml><?xml version="1.0" encoding="utf-8"?>
 <w:styles xmlns:mc="http://schemas.openxmlformats.org/markup-compatibility/2006" xmlns:r="http://schemas.openxmlformats.org/officeDocument/2006/relationships" xmlns:w="http://schemas.openxmlformats.org/wordprocessingml/2006/main" xmlns:w14="http://schemas.microsoft.com/office/word/2010/wordml" xmlns:w15="http://schemas.microsoft.com/office/word/2012/wordml" xmlns:w16cex="http://schemas.microsoft.com/office/word/2018/wordml/cex" xmlns:w16cid="http://schemas.microsoft.com/office/word/2016/wordml/cid" xmlns:w16="http://schemas.microsoft.com/office/word/2018/wordml" xmlns:w16du="http://schemas.microsoft.com/office/word/2023/wordml/word16du" xmlns:w16sdtdh="http://schemas.microsoft.com/office/word/2020/wordml/sdtdatahash" xmlns:w16sdtfl="http://schemas.microsoft.com/office/word/2024/wordml/sdtformatlock" xmlns:w16se="http://schemas.microsoft.com/office/word/2015/wordml/symex" mc:Ignorable="w14 w15 w16se w16cid w16 w16cex w16sdtdh w16sdtfl w16du">
   <w:docDefaults>
     <w:rPrDefault>
@@ -11079,7 +11390,7 @@
 </w:styles>
 </file>
 
-<file path=word/theme/theme1.xml><?xml version="1.0" encoding="utf-8"?>
+<file path=word\theme\theme1.xml><?xml version="1.0" encoding="utf-8"?>
 <a:theme xmlns:a="http://schemas.openxmlformats.org/drawingml/2006/main" name="Tema de Office">
   <a:themeElements>
     <a:clrScheme name="Office">
@@ -11374,14 +11685,6 @@
 </a:theme>
 </file>
 
-<file path=customXml/item1.xml><?xml version="1.0" encoding="utf-8"?>
-<b:Sources xmlns:b="http://schemas.openxmlformats.org/officeDocument/2006/bibliography" xmlns="http://schemas.openxmlformats.org/officeDocument/2006/bibliography" SelectedStyle="\APASixthEditionOfficeOnline.xsl" StyleName="APA" Version="6"/>
-</file>
-
-<file path=customXml/itemProps1.xml><?xml version="1.0" encoding="utf-8"?>
-<ds:datastoreItem xmlns:ds="http://schemas.openxmlformats.org/officeDocument/2006/customXml" ds:itemID="{902A56BA-3B9D-46BB-94DE-ECBC99AF0017}">
-  <ds:schemaRefs>
-    <ds:schemaRef ds:uri="http://schemas.openxmlformats.org/officeDocument/2006/bibliography"/>
-  </ds:schemaRefs>
-</ds:datastoreItem>
+<file path=word\webSettings.xml><?xml version="1.0" encoding="utf-8"?>
+<w:webSettings xmlns:mc="http://schemas.openxmlformats.org/markup-compatibility/2006" xmlns:r="http://schemas.openxmlformats.org/officeDocument/2006/relationships" xmlns:w="http://schemas.openxmlformats.org/wordprocessingml/2006/main" xmlns:w14="http://schemas.microsoft.com/office/word/2010/wordml" xmlns:w15="http://schemas.microsoft.com/office/word/2012/wordml" xmlns:w16cex="http://schemas.microsoft.com/office/word/2018/wordml/cex" xmlns:w16cid="http://schemas.microsoft.com/office/word/2016/wordml/cid" xmlns:w16="http://schemas.microsoft.com/office/word/2018/wordml" xmlns:w16du="http://schemas.microsoft.com/office/word/2023/wordml/word16du" xmlns:w16sdtdh="http://schemas.microsoft.com/office/word/2020/wordml/sdtdatahash" xmlns:w16sdtfl="http://schemas.microsoft.com/office/word/2024/wordml/sdtformatlock" xmlns:w16se="http://schemas.microsoft.com/office/word/2015/wordml/symex" mc:Ignorable="w14 w15 w16se w16cid w16 w16cex w16sdtdh w16sdtfl w16du"/>
 </file>
</xml_diff>

<commit_message>
polish final report rubric alignment
</commit_message>
<xml_diff>
--- a/docs/entregables/Informe_Final_Chompas_Mabel.docx
+++ b/docs/entregables/Informe_Final_Chompas_Mabel.docx
@@ -1,66 +1,5 @@
 
-<file path=customXml\item1.xml><?xml version="1.0" encoding="utf-8"?>
-<b:Sources xmlns:b="http://schemas.openxmlformats.org/officeDocument/2006/bibliography" xmlns="http://schemas.openxmlformats.org/officeDocument/2006/bibliography" SelectedStyle="\APASixthEditionOfficeOnline.xsl" StyleName="APA" Version="6"/>
-</file>
-
-<file path=customXml\itemProps1.xml><?xml version="1.0" encoding="utf-8"?>
-<ds:datastoreItem xmlns:ds="http://schemas.openxmlformats.org/officeDocument/2006/customXml" ds:itemID="{902A56BA-3B9D-46BB-94DE-ECBC99AF0017}">
-  <ds:schemaRefs>
-    <ds:schemaRef ds:uri="http://schemas.openxmlformats.org/officeDocument/2006/bibliography"/>
-  </ds:schemaRefs>
-</ds:datastoreItem>
-</file>
-
-<file path=docProps\app.xml><?xml version="1.0" encoding="utf-8"?>
-<Properties xmlns="http://schemas.openxmlformats.org/officeDocument/2006/extended-properties" xmlns:vt="http://schemas.openxmlformats.org/officeDocument/2006/docPropsVTypes">
-  <Template>Normal</Template>
-  <TotalTime>55</TotalTime>
-  <Pages>17</Pages>
-  <Words>1976</Words>
-  <Characters>10868</Characters>
-  <Application>Microsoft Office Word</Application>
-  <DocSecurity>0</DocSecurity>
-  <Lines>90</Lines>
-  <Paragraphs>25</Paragraphs>
-  <ScaleCrop>false</ScaleCrop>
-  <HeadingPairs>
-    <vt:vector size="2" baseType="variant">
-      <vt:variant>
-        <vt:lpstr>Título</vt:lpstr>
-      </vt:variant>
-      <vt:variant>
-        <vt:i4>1</vt:i4>
-      </vt:variant>
-    </vt:vector>
-  </HeadingPairs>
-  <TitlesOfParts>
-    <vt:vector size="1" baseType="lpstr">
-      <vt:lpstr/>
-    </vt:vector>
-  </TitlesOfParts>
-  <Company/>
-  <LinksUpToDate>false</LinksUpToDate>
-  <CharactersWithSpaces>12819</CharactersWithSpaces>
-  <SharedDoc>false</SharedDoc>
-  <HyperlinksChanged>false</HyperlinksChanged>
-  <AppVersion>16.0000</AppVersion>
-</Properties>
-</file>
-
-<file path=docProps\core.xml><?xml version="1.0" encoding="utf-8"?>
-<cp:coreProperties xmlns:cp="http://schemas.openxmlformats.org/package/2006/metadata/core-properties" xmlns:dc="http://purl.org/dc/elements/1.1/" xmlns:dcterms="http://purl.org/dc/terms/" xmlns:dcmitype="http://purl.org/dc/dcmitype/" xmlns:xsi="http://www.w3.org/2001/XMLSchema-instance">
-  <dc:title/>
-  <dc:subject/>
-  <dc:creator>Jaqueline Inga Pérez</dc:creator>
-  <cp:keywords/>
-  <cp:lastModifiedBy>DIEGO GABRIEL ANGULO GONZALES</cp:lastModifiedBy>
-  <cp:revision>13</cp:revision>
-  <dcterms:created xsi:type="dcterms:W3CDTF">2025-09-21T05:21:00Z</dcterms:created>
-  <dcterms:modified xsi:type="dcterms:W3CDTF">2026-05-31T07:01:00Z</dcterms:modified>
-</cp:coreProperties>
-</file>
-
-<file path=word\document.xml><?xml version="1.0" encoding="utf-8"?>
+<file path=word/document.xml><?xml version="1.0" encoding="utf-8"?>
 <w:document xmlns:wpc="http://schemas.microsoft.com/office/word/2010/wordprocessingCanvas" xmlns:cx="http://schemas.microsoft.com/office/drawing/2014/chartex" xmlns:cx1="http://schemas.microsoft.com/office/drawing/2015/9/8/chartex" xmlns:cx2="http://schemas.microsoft.com/office/drawing/2015/10/21/chartex" xmlns:cx3="http://schemas.microsoft.com/office/drawing/2016/5/9/chartex" xmlns:cx4="http://schemas.microsoft.com/office/drawing/2016/5/10/chartex" xmlns:cx5="http://schemas.microsoft.com/office/drawing/2016/5/11/chartex" xmlns:cx6="http://schemas.microsoft.com/office/drawing/2016/5/12/chartex" xmlns:cx7="http://schemas.microsoft.com/office/drawing/2016/5/13/chartex" xmlns:cx8="http://schemas.microsoft.com/office/drawing/2016/5/14/chartex" xmlns:mc="http://schemas.openxmlformats.org/markup-compatibility/2006" xmlns:aink="http://schemas.microsoft.com/office/drawing/2016/ink" xmlns:am3d="http://schemas.microsoft.com/office/drawing/2017/model3d" xmlns:o="urn:schemas-microsoft-com:office:office" xmlns:oel="http://schemas.microsoft.com/office/2019/extlst" xmlns:r="http://schemas.openxmlformats.org/officeDocument/2006/relationships" xmlns:m="http://schemas.openxmlformats.org/officeDocument/2006/math" xmlns:v="urn:schemas-microsoft-com:vml" xmlns:wp14="http://schemas.microsoft.com/office/word/2010/wordprocessingDrawing" xmlns:wp="http://schemas.openxmlformats.org/drawingml/2006/wordprocessingDrawing" xmlns:w10="urn:schemas-microsoft-com:office:word" xmlns:w="http://schemas.openxmlformats.org/wordprocessingml/2006/main" xmlns:w14="http://schemas.microsoft.com/office/word/2010/wordml" xmlns:w15="http://schemas.microsoft.com/office/word/2012/wordml" xmlns:w16cex="http://schemas.microsoft.com/office/word/2018/wordml/cex" xmlns:w16cid="http://schemas.microsoft.com/office/word/2016/wordml/cid" xmlns:w16="http://schemas.microsoft.com/office/word/2018/wordml" xmlns:w16du="http://schemas.microsoft.com/office/word/2023/wordml/word16du" xmlns:w16sdtdh="http://schemas.microsoft.com/office/word/2020/wordml/sdtdatahash" xmlns:w16sdtfl="http://schemas.microsoft.com/office/word/2024/wordml/sdtformatlock" xmlns:w16se="http://schemas.microsoft.com/office/word/2015/wordml/symex" xmlns:wpg="http://schemas.microsoft.com/office/word/2010/wordprocessingGroup" xmlns:wpi="http://schemas.microsoft.com/office/word/2010/wordprocessingInk" xmlns:wne="http://schemas.microsoft.com/office/word/2006/wordml" xmlns:wps="http://schemas.microsoft.com/office/word/2010/wordprocessingShape" mc:Ignorable="w14 w15 w16se w16cid w16 w16cex w16sdtdh w16sdtfl w16du wp14">
   <w:body>
     <w:p>
@@ -86,7 +25,7 @@
           <w:lang w:val="es-ES"/>
         </w:rPr>
         <w:drawing>
-          <wp:inline distT="0" distB="0" distL="0" distR="0" wp14:anchorId="61DCCD7E" wp14:editId="72EB9A4B">
+          <wp:inline distT="0" distB="0" distL="0" distR="0" wp14:anchorId="61DCCD7E" wp14:editId="518C15C0">
             <wp:extent cx="3253740" cy="751247"/>
             <wp:effectExtent l="0" t="0" r="3810" b="0"/>
             <wp:docPr id="2" name="Imagen 2"/>
@@ -294,17 +233,7 @@
                                 <w:szCs w:val="28"/>
                                 <w:lang w:val="es-ES"/>
                               </w:rPr>
-                              <w:t xml:space="preserve">Chompas Mabel - Sistema Web de Gestion</w:t>
-                            </w:r>
-                            <w:r>
-                              <w:rPr>
-                                <w:b/>
-                                <w:bCs/>
-                                <w:sz w:val="28"/>
-                                <w:szCs w:val="28"/>
-                                <w:lang w:val="es-ES"/>
-                              </w:rPr>
-                              <w:t/>
+                              <w:t>Chompas Mabel - Sistema Web de Gestion</w:t>
                             </w:r>
                           </w:p>
                         </w:txbxContent>
@@ -709,6 +638,7 @@
         <w:rPr>
           <w:rFonts w:ascii="Arial" w:hAnsi="Arial" w:cs="Arial"/>
         </w:rPr>
+        <w:lastRenderedPageBreak/>
         <w:t>ÍNDICE</w:t>
       </w:r>
       <w:bookmarkEnd w:id="0"/>
@@ -1956,35 +1886,19 @@
         <w:rPr>
           <w:sz w:val="22"/>
         </w:rPr>
-        <w:t xml:space="preserve">La aplicación integra un </w:t>
-      </w:r>
-      <w:proofErr w:type="spellStart"/>
-      <w:r>
-        <w:rPr>
-          <w:sz w:val="22"/>
-        </w:rPr>
-        <w:t>frontend</w:t>
-      </w:r>
-      <w:proofErr w:type="spellEnd"/>
-      <w:r>
-        <w:rPr>
-          <w:sz w:val="22"/>
-        </w:rPr>
-        <w:t xml:space="preserve"> en Angular 21 con formularios reactivos, validaciones, rutas y servicios HTTP; un </w:t>
-      </w:r>
-      <w:proofErr w:type="spellStart"/>
-      <w:r>
-        <w:rPr>
-          <w:sz w:val="22"/>
-        </w:rPr>
-        <w:t>backend</w:t>
-      </w:r>
-      <w:proofErr w:type="spellEnd"/>
-      <w:r>
-        <w:rPr>
-          <w:sz w:val="22"/>
-        </w:rPr>
-        <w:t xml:space="preserve"> en Spring Boot con API REST, servicios, repositorios, modelos JPA y validaciones; y una base de datos MySQL creada desde un script SQL reproducible.</w:t>
+        <w:t xml:space="preserve">La aplicación integra un frontend en Angular 21 con formularios reactivos, validaciones, rutas y servicios HTTP; un </w:t>
+      </w:r>
+      <w:r>
+        <w:rPr>
+          <w:sz w:val="22"/>
+        </w:rPr>
+        <w:t>backend principal en FastAPI con API REST, validaciones Pydantic y MySQL Connector</w:t>
+      </w:r>
+      <w:r>
+        <w:rPr>
+          <w:sz w:val="22"/>
+        </w:rPr>
+        <w:t>; y una base de datos MySQL creada desde un script SQL reproducible.</w:t>
       </w:r>
     </w:p>
     <w:p>
@@ -2003,63 +1917,31 @@
         <w:rPr>
           <w:sz w:val="22"/>
         </w:rPr>
-        <w:t xml:space="preserve">El proyecto conserva la estructura solicitada y la completa con documentacion por modulo: frontend-angular, backend-springboot, database/schema.sql, docker-compose.yml, README.md principal, README del frontend, README del backend y carpeta docs/entregables.</w:t>
-      </w:r>
-      <w:proofErr w:type="spellStart"/>
-      <w:r>
-        <w:rPr>
-          <w:sz w:val="22"/>
-        </w:rPr>
-        <w:t/>
-      </w:r>
-      <w:proofErr w:type="spellEnd"/>
-      <w:r>
-        <w:rPr>
-          <w:sz w:val="22"/>
-        </w:rPr>
-        <w:t xml:space="preserve"/>
-      </w:r>
-      <w:proofErr w:type="spellStart"/>
-      <w:r>
-        <w:rPr>
-          <w:sz w:val="22"/>
-        </w:rPr>
-        <w:t/>
-      </w:r>
-      <w:proofErr w:type="spellEnd"/>
-      <w:r>
-        <w:rPr>
-          <w:sz w:val="22"/>
-        </w:rPr>
-        <w:t xml:space="preserve"/>
-      </w:r>
-      <w:proofErr w:type="spellStart"/>
-      <w:r>
-        <w:rPr>
-          <w:sz w:val="22"/>
-        </w:rPr>
-        <w:t/>
-      </w:r>
-      <w:proofErr w:type="spellEnd"/>
-      <w:r>
-        <w:rPr>
-          <w:sz w:val="22"/>
-        </w:rPr>
-        <w:t xml:space="preserve"/>
-      </w:r>
-      <w:proofErr w:type="spellStart"/>
-      <w:r>
-        <w:rPr>
-          <w:sz w:val="22"/>
-        </w:rPr>
-        <w:t/>
-      </w:r>
-      <w:proofErr w:type="spellEnd"/>
-      <w:r>
-        <w:rPr>
-          <w:sz w:val="22"/>
-        </w:rPr>
-        <w:t xml:space="preserve"/>
+        <w:t xml:space="preserve">El proyecto conserva la estructura solicitada y la completa con documentacion por modulo: </w:t>
+      </w:r>
+      <w:r>
+        <w:rPr>
+          <w:sz w:val="22"/>
+        </w:rPr>
+        <w:t>frontend-angular, backend-fastapi, backend-springboot alternativo, database/schema.sql</w:t>
+      </w:r>
+      <w:r>
+        <w:rPr>
+          <w:sz w:val="22"/>
+        </w:rPr>
+        <w:t xml:space="preserve">, docker-compose.yml, README.md principal, README del frontend, </w:t>
+      </w:r>
+      <w:r>
+        <w:rPr>
+          <w:sz w:val="22"/>
+        </w:rPr>
+        <w:t>README del backend FastAPI y README del backend Spring Boot alternativo</w:t>
+      </w:r>
+      <w:r>
+        <w:rPr>
+          <w:sz w:val="22"/>
+        </w:rPr>
+        <w:t xml:space="preserve"> y carpeta docs/entregables.</w:t>
       </w:r>
     </w:p>
     <w:p>
@@ -2208,21 +2090,7 @@
         <w:rPr>
           <w:sz w:val="22"/>
         </w:rPr>
-        <w:t xml:space="preserve">En una empresa textil pequeña o mediana, la gestión manual de productos, ventas y stock puede producir pérdida de información, duplicidad de registros y dificultades para saber que productos </w:t>
-      </w:r>
-      <w:proofErr w:type="spellStart"/>
-      <w:r>
-        <w:rPr>
-          <w:sz w:val="22"/>
-        </w:rPr>
-        <w:t>estan</w:t>
-      </w:r>
-      <w:proofErr w:type="spellEnd"/>
-      <w:r>
-        <w:rPr>
-          <w:sz w:val="22"/>
-        </w:rPr>
-        <w:t xml:space="preserve"> disponibles.</w:t>
+        <w:t>En una empresa textil pequeña o mediana, la gestión manual de productos, ventas y stock puede producir pérdida de información, duplicidad de registros y dificultades para saber que productos estan disponibles.</w:t>
       </w:r>
     </w:p>
     <w:p>
@@ -2325,68 +2193,26 @@
         <w:rPr>
           <w:sz w:val="22"/>
         </w:rPr>
-        <w:t xml:space="preserve">El sistema esta dirigido a dos perfiles principales: administrador y vendedor. El administrador controla productos, inventario, reportes, creditos y configuracion operativa; el vendedor registra clientes, pedidos, ventas y pagos de creditos sin modificar inventario.</w:t>
-      </w:r>
-      <w:proofErr w:type="spellStart"/>
-      <w:r>
-        <w:rPr>
-          <w:sz w:val="22"/>
-        </w:rPr>
-        <w:t/>
-      </w:r>
-      <w:proofErr w:type="spellEnd"/>
-      <w:r>
-        <w:rPr>
-          <w:sz w:val="22"/>
-        </w:rPr>
-        <w:t xml:space="preserve"/>
-      </w:r>
-    </w:p>
-    <w:p>
-      <w:pPr>
-        <w:spacing w:after="155" w:line="360" w:lineRule="auto"/>
-        <w:ind w:left="0" w:right="200" w:firstLine="0"/>
-        <w:rPr>
-          <w:rFonts w:ascii="Century Gothic" w:hAnsi="Century Gothic"/>
-          <w:b/>
-          <w:color w:val="202124"/>
-          <w:sz w:val="26"/>
-          <w:szCs w:val="26"/>
-        </w:rPr>
-      </w:pPr>
-      <w:r>
-        <w:rPr>
-          <w:sz w:val="22"/>
-        </w:rPr>
-        <w:t xml:space="preserve">Tambien sirve como base academica para demostrar requerimientos de usuario, flujo por rol, arquitectura web, persistencia en MySQL y ejecucion local reproducible.</w:t>
-      </w:r>
-      <w:proofErr w:type="spellStart"/>
-      <w:r>
-        <w:rPr>
-          <w:sz w:val="22"/>
-        </w:rPr>
-        <w:t/>
-      </w:r>
-      <w:proofErr w:type="spellEnd"/>
-      <w:r>
-        <w:rPr>
-          <w:sz w:val="22"/>
-        </w:rPr>
-        <w:t xml:space="preserve"/>
-      </w:r>
-      <w:proofErr w:type="spellStart"/>
-      <w:r>
-        <w:rPr>
-          <w:sz w:val="22"/>
-        </w:rPr>
-        <w:t/>
-      </w:r>
-      <w:proofErr w:type="spellEnd"/>
-      <w:r>
-        <w:rPr>
-          <w:sz w:val="22"/>
-        </w:rPr>
-        <w:t/>
+        <w:t>El sistema esta dirigido a dos perfiles principales: administrador y vendedor. El administrador controla productos, inventario, reportes, creditos y configuracion operativa; el vendedor registra clientes, pedidos, ventas y pagos de creditos sin modificar inventario.</w:t>
+      </w:r>
+    </w:p>
+    <w:p>
+      <w:pPr>
+        <w:spacing w:after="155" w:line="360" w:lineRule="auto"/>
+        <w:ind w:left="0" w:right="200" w:firstLine="0"/>
+        <w:rPr>
+          <w:rFonts w:ascii="Century Gothic" w:hAnsi="Century Gothic"/>
+          <w:b/>
+          <w:color w:val="202124"/>
+          <w:sz w:val="26"/>
+          <w:szCs w:val="26"/>
+        </w:rPr>
+      </w:pPr>
+      <w:r>
+        <w:rPr>
+          <w:sz w:val="22"/>
+        </w:rPr>
+        <w:t>Tambien sirve como base academica para demostrar requerimientos de usuario, flujo por rol, arquitectura web, persistencia en MySQL y ejecucion local reproducible.</w:t>
       </w:r>
     </w:p>
     <w:p>
@@ -2551,35 +2377,7 @@
         <w:rPr>
           <w:sz w:val="22"/>
         </w:rPr>
-        <w:t xml:space="preserve">Implementar el frontend con Angular 21, TypeScript, Bootstrap 5, CSS propio, rutas, componentes standalone, formularios reactivos y servicios HTTP.</w:t>
-      </w:r>
-      <w:proofErr w:type="spellStart"/>
-      <w:r>
-        <w:rPr>
-          <w:sz w:val="22"/>
-        </w:rPr>
-        <w:t/>
-      </w:r>
-      <w:proofErr w:type="spellEnd"/>
-      <w:r>
-        <w:rPr>
-          <w:sz w:val="22"/>
-        </w:rPr>
-        <w:t xml:space="preserve"/>
-      </w:r>
-      <w:proofErr w:type="spellStart"/>
-      <w:r>
-        <w:rPr>
-          <w:sz w:val="22"/>
-        </w:rPr>
-        <w:t/>
-      </w:r>
-      <w:proofErr w:type="spellEnd"/>
-      <w:r>
-        <w:rPr>
-          <w:sz w:val="22"/>
-        </w:rPr>
-        <w:t/>
+        <w:t>Implementar el frontend con Angular 21, TypeScript, Bootstrap 5, CSS propio, rutas, componentes standalone, formularios reactivos y servicios HTTP.</w:t>
       </w:r>
     </w:p>
     <w:p>
@@ -2603,28 +2401,12 @@
         </w:rPr>
         <w:t xml:space="preserve">Implementar el </w:t>
       </w:r>
-      <w:proofErr w:type="spellStart"/>
-      <w:r>
-        <w:rPr>
-          <w:sz w:val="22"/>
-        </w:rPr>
-        <w:t>backend</w:t>
-      </w:r>
-      <w:proofErr w:type="spellEnd"/>
-      <w:r>
-        <w:rPr>
-          <w:sz w:val="22"/>
-        </w:rPr>
-        <w:t xml:space="preserve"> con Java 21, Spring Boot, controladores REST, servicios, repositorios JPA y entidades </w:t>
-      </w:r>
-      <w:proofErr w:type="spellStart"/>
-      <w:r>
-        <w:rPr>
-          <w:sz w:val="22"/>
-        </w:rPr>
-        <w:t>relaciónadas</w:t>
-      </w:r>
-      <w:proofErr w:type="spellEnd"/>
+      <w:r>
+        <w:rPr>
+          <w:sz w:val="22"/>
+        </w:rPr>
+        <w:t>backend principal con FastAPI, endpoints REST, validaciones Pydantic, conexion MySQL y procedimientos almacenados</w:t>
+      </w:r>
       <w:r>
         <w:rPr>
           <w:sz w:val="22"/>
@@ -2640,35 +2422,7 @@
         <w:rPr>
           <w:sz w:val="22"/>
         </w:rPr>
-        <w:t xml:space="preserve">Crear </w:t>
-      </w:r>
-      <w:proofErr w:type="spellStart"/>
-      <w:r>
-        <w:rPr>
-          <w:sz w:val="22"/>
-        </w:rPr>
-        <w:t>endpoints</w:t>
-      </w:r>
-      <w:proofErr w:type="spellEnd"/>
-      <w:r>
-        <w:rPr>
-          <w:sz w:val="22"/>
-        </w:rPr>
-        <w:t xml:space="preserve"> REST para productos, clientes y pedidos, incluyendo </w:t>
-      </w:r>
-      <w:proofErr w:type="spellStart"/>
-      <w:r>
-        <w:rPr>
-          <w:sz w:val="22"/>
-        </w:rPr>
-        <w:t>operaciónes</w:t>
-      </w:r>
-      <w:proofErr w:type="spellEnd"/>
-      <w:r>
-        <w:rPr>
-          <w:sz w:val="22"/>
-        </w:rPr>
-        <w:t xml:space="preserve"> de consulta, registro, actualización y eliminación cuando corresponde.</w:t>
+        <w:t>Crear endpoints REST para productos, clientes y pedidos, incluyendo operaciónes de consulta, registro, actualización y eliminación cuando corresponde.</w:t>
       </w:r>
     </w:p>
     <w:p>
@@ -2679,21 +2433,7 @@
         <w:rPr>
           <w:sz w:val="22"/>
         </w:rPr>
-        <w:t xml:space="preserve">Definir una base de datos MySQL con tablas, claves primarias, claves </w:t>
-      </w:r>
-      <w:proofErr w:type="spellStart"/>
-      <w:r>
-        <w:rPr>
-          <w:sz w:val="22"/>
-        </w:rPr>
-        <w:t>foráneas</w:t>
-      </w:r>
-      <w:proofErr w:type="spellEnd"/>
-      <w:r>
-        <w:rPr>
-          <w:sz w:val="22"/>
-        </w:rPr>
-        <w:t xml:space="preserve"> y datos iniciales suficientes para pruebas.</w:t>
+        <w:t>Definir una base de datos MySQL con tablas, claves primarias, claves foráneas y datos iniciales suficientes para pruebas.</w:t>
       </w:r>
     </w:p>
     <w:p>
@@ -2704,63 +2444,19 @@
         <w:rPr>
           <w:sz w:val="22"/>
         </w:rPr>
-        <w:t xml:space="preserve">Permitir la ejecución local con Docker </w:t>
-      </w:r>
-      <w:proofErr w:type="spellStart"/>
-      <w:r>
-        <w:rPr>
-          <w:sz w:val="22"/>
-        </w:rPr>
-        <w:t>Compose</w:t>
-      </w:r>
-      <w:proofErr w:type="spellEnd"/>
-      <w:r>
-        <w:rPr>
-          <w:sz w:val="22"/>
-        </w:rPr>
-        <w:t xml:space="preserve"> para MySQL, Spring Boot para el </w:t>
-      </w:r>
-      <w:proofErr w:type="spellStart"/>
-      <w:r>
-        <w:rPr>
-          <w:sz w:val="22"/>
-        </w:rPr>
-        <w:t>backend</w:t>
-      </w:r>
-      <w:proofErr w:type="spellEnd"/>
-      <w:r>
-        <w:rPr>
-          <w:sz w:val="22"/>
-        </w:rPr>
-        <w:t xml:space="preserve"> y </w:t>
-      </w:r>
-      <w:proofErr w:type="spellStart"/>
-      <w:r>
-        <w:rPr>
-          <w:sz w:val="22"/>
-        </w:rPr>
-        <w:t>npm</w:t>
-      </w:r>
-      <w:proofErr w:type="spellEnd"/>
-      <w:r>
-        <w:rPr>
-          <w:sz w:val="22"/>
-        </w:rPr>
-        <w:t xml:space="preserve"> </w:t>
-      </w:r>
-      <w:proofErr w:type="spellStart"/>
-      <w:r>
-        <w:rPr>
-          <w:sz w:val="22"/>
-        </w:rPr>
-        <w:t>start</w:t>
-      </w:r>
-      <w:proofErr w:type="spellEnd"/>
-      <w:r>
-        <w:rPr>
-          <w:sz w:val="22"/>
-        </w:rPr>
-        <w:t xml:space="preserve"> para Angular.</w:t>
+        <w:t xml:space="preserve">Permitir la ejecución local con </w:t>
+      </w:r>
+      <w:r>
+        <w:rPr>
+          <w:sz w:val="22"/>
+        </w:rPr>
+        <w:t>Docker Compose para MySQL y FastAPI, y npm start para Angular</w:t>
+      </w:r>
+      <w:r>
+        <w:rPr>
+          <w:sz w:val="22"/>
+        </w:rPr>
+        <w:t>.</w:t>
       </w:r>
     </w:p>
     <w:p>
@@ -2878,49 +2574,19 @@
         <w:rPr>
           <w:sz w:val="22"/>
         </w:rPr>
-        <w:t xml:space="preserve">La aplicación utiliza una arquitectura cliente-servidor organizada en capas. El </w:t>
-      </w:r>
-      <w:proofErr w:type="spellStart"/>
-      <w:r>
-        <w:rPr>
-          <w:sz w:val="22"/>
-        </w:rPr>
-        <w:t>frontend</w:t>
-      </w:r>
-      <w:proofErr w:type="spellEnd"/>
-      <w:r>
-        <w:rPr>
-          <w:sz w:val="22"/>
-        </w:rPr>
-        <w:t xml:space="preserve"> Angular funciona cómo una SPA que presenta la interfaz y consume servicios HTTP; el </w:t>
-      </w:r>
-      <w:proofErr w:type="spellStart"/>
-      <w:r>
-        <w:rPr>
-          <w:sz w:val="22"/>
-        </w:rPr>
-        <w:t>backend</w:t>
-      </w:r>
-      <w:proofErr w:type="spellEnd"/>
-      <w:r>
-        <w:rPr>
-          <w:sz w:val="22"/>
-        </w:rPr>
-        <w:t xml:space="preserve"> Spring Boot expone una API REST y concentra la lógica de negocio; la persistencia se realiza en MySQL mediante JPA/</w:t>
-      </w:r>
-      <w:proofErr w:type="spellStart"/>
-      <w:r>
-        <w:rPr>
-          <w:sz w:val="22"/>
-        </w:rPr>
-        <w:t>Hibernate</w:t>
-      </w:r>
-      <w:proofErr w:type="spellEnd"/>
-      <w:r>
-        <w:rPr>
-          <w:sz w:val="22"/>
-        </w:rPr>
-        <w:t>.</w:t>
+        <w:t xml:space="preserve">La aplicación utiliza una arquitectura cliente-servidor organizada en capas. El frontend Angular funciona cómo una SPA que presenta la interfaz y consume servicios HTTP; el </w:t>
+      </w:r>
+      <w:r>
+        <w:rPr>
+          <w:sz w:val="22"/>
+        </w:rPr>
+        <w:t>backend FastAPI expone una API REST</w:t>
+      </w:r>
+      <w:r>
+        <w:rPr>
+          <w:sz w:val="22"/>
+        </w:rPr>
+        <w:t xml:space="preserve"> y concentra la lógica de negocio; la persistencia se realiza en MySQL mediante JPA/Hibernate.</w:t>
       </w:r>
     </w:p>
     <w:p>
@@ -2939,71 +2605,27 @@
         <w:rPr>
           <w:sz w:val="22"/>
         </w:rPr>
-        <w:t xml:space="preserve">El patrón principal es arquitectura en capas, complementado por MVC en Spring Boot y comunicación REST. Se eligió porque separa responsabilidades: la capa de presentación no contiene reglas de negocio, los controladores solo reciben solicitudes, los servicios procesan </w:t>
-      </w:r>
-      <w:proofErr w:type="spellStart"/>
-      <w:r>
-        <w:rPr>
-          <w:sz w:val="22"/>
-        </w:rPr>
-        <w:t>operaciónes</w:t>
-      </w:r>
-      <w:proofErr w:type="spellEnd"/>
-      <w:r>
-        <w:rPr>
-          <w:sz w:val="22"/>
-        </w:rPr>
-        <w:t>, los repositorios acceden a datos y los modelos representan las entidades del dominio.</w:t>
-      </w:r>
-    </w:p>
-    <w:p>
-      <w:r>
-        <w:rPr>
-          <w:sz w:val="22"/>
-        </w:rPr>
-        <w:t xml:space="preserve">Presentacion: Angular 21, componentes standalone, routing, formularios reactivos, menu por rol, campana de notificaciones, signals para estados de interfaz y servicios HTTP.</w:t>
-      </w:r>
-      <w:proofErr w:type="spellStart"/>
-      <w:r>
-        <w:rPr>
-          <w:sz w:val="22"/>
-        </w:rPr>
-        <w:t/>
-      </w:r>
-      <w:proofErr w:type="spellEnd"/>
-      <w:r>
-        <w:rPr>
-          <w:sz w:val="22"/>
-        </w:rPr>
-        <w:t xml:space="preserve"/>
-      </w:r>
-      <w:proofErr w:type="spellStart"/>
-      <w:r>
-        <w:rPr>
-          <w:sz w:val="22"/>
-        </w:rPr>
-        <w:t/>
-      </w:r>
-      <w:proofErr w:type="spellEnd"/>
-      <w:r>
-        <w:rPr>
-          <w:sz w:val="22"/>
-        </w:rPr>
-        <w:t xml:space="preserve"/>
-      </w:r>
-      <w:proofErr w:type="spellStart"/>
-      <w:r>
-        <w:rPr>
-          <w:sz w:val="22"/>
-        </w:rPr>
-        <w:t/>
-      </w:r>
-      <w:proofErr w:type="spellEnd"/>
-      <w:r>
-        <w:rPr>
-          <w:sz w:val="22"/>
-        </w:rPr>
-        <w:t xml:space="preserve"/>
+        <w:t xml:space="preserve">El patrón principal es arquitectura en capas, complementado por </w:t>
+      </w:r>
+      <w:r>
+        <w:rPr>
+          <w:sz w:val="22"/>
+        </w:rPr>
+        <w:t>Servicios REST en FastAPI y comunicacion HTTP</w:t>
+      </w:r>
+      <w:r>
+        <w:rPr>
+          <w:sz w:val="22"/>
+        </w:rPr>
+        <w:t>. Se eligió porque separa responsabilidades: la capa de presentación no contiene reglas de negocio, los controladores solo reciben solicitudes, los servicios procesan operaciónes, los repositorios acceden a datos y los modelos representan las entidades del dominio.</w:t>
+      </w:r>
+    </w:p>
+    <w:p>
+      <w:r>
+        <w:rPr>
+          <w:sz w:val="22"/>
+        </w:rPr>
+        <w:t>Presentacion: Angular 21, componentes standalone, routing, formularios reactivos, menu por rol, campana de notificaciones, signals para estados de interfaz y servicios HTTP.</w:t>
       </w:r>
     </w:p>
     <w:p>
@@ -3027,43 +2649,15 @@
         <w:rPr>
           <w:sz w:val="22"/>
         </w:rPr>
-        <w:t>Repositorios: encapsulan el acceso a MySQL con Spring Data JPA.</w:t>
-      </w:r>
-    </w:p>
-    <w:p>
-      <w:r>
-        <w:rPr>
-          <w:sz w:val="22"/>
-        </w:rPr>
-        <w:t xml:space="preserve">Modelo/dominio: entidades Categoria, Producto, Cliente, Usuario, Pedido, DetallePedido, Venta e InventarioMovimiento, mas campos de credito dentro de Pedido para cuentas por cobrar.</w:t>
-      </w:r>
-      <w:proofErr w:type="spellStart"/>
-      <w:r>
-        <w:rPr>
-          <w:sz w:val="22"/>
-        </w:rPr>
-        <w:t/>
-      </w:r>
-      <w:proofErr w:type="spellEnd"/>
-      <w:r>
-        <w:rPr>
-          <w:sz w:val="22"/>
-        </w:rPr>
-        <w:t xml:space="preserve"/>
-      </w:r>
-      <w:proofErr w:type="spellStart"/>
-      <w:r>
-        <w:rPr>
-          <w:sz w:val="22"/>
-        </w:rPr>
-        <w:t/>
-      </w:r>
-      <w:proofErr w:type="spellEnd"/>
-      <w:r>
-        <w:rPr>
-          <w:sz w:val="22"/>
-        </w:rPr>
-        <w:t/>
+        <w:t>Acceso a datos: FastAPI usa MySQL Connector y procedimientos almacenados; Spring Boot queda como backend alternativo.</w:t>
+      </w:r>
+    </w:p>
+    <w:p>
+      <w:r>
+        <w:rPr>
+          <w:sz w:val="22"/>
+        </w:rPr>
+        <w:t>Modelo/dominio: entidades Categoria, Producto, Cliente, Usuario, Pedido, DetallePedido, Venta e InventarioMovimiento, mas campos de credito dentro de Pedido para cuentas por cobrar.</w:t>
       </w:r>
     </w:p>
     <w:p>
@@ -3090,35 +2684,7 @@
         <w:rPr>
           <w:sz w:val="22"/>
         </w:rPr>
-        <w:t xml:space="preserve">Permite escalar: el </w:t>
-      </w:r>
-      <w:proofErr w:type="spellStart"/>
-      <w:r>
-        <w:rPr>
-          <w:sz w:val="22"/>
-        </w:rPr>
-        <w:t>frontend</w:t>
-      </w:r>
-      <w:proofErr w:type="spellEnd"/>
-      <w:r>
-        <w:rPr>
-          <w:sz w:val="22"/>
-        </w:rPr>
-        <w:t xml:space="preserve"> y </w:t>
-      </w:r>
-      <w:proofErr w:type="spellStart"/>
-      <w:r>
-        <w:rPr>
-          <w:sz w:val="22"/>
-        </w:rPr>
-        <w:t>backend</w:t>
-      </w:r>
-      <w:proofErr w:type="spellEnd"/>
-      <w:r>
-        <w:rPr>
-          <w:sz w:val="22"/>
-        </w:rPr>
-        <w:t xml:space="preserve"> pueden desplegarse por separado.</w:t>
+        <w:t>Permite escalar: el frontend y backend pueden desplegarse por separado.</w:t>
       </w:r>
     </w:p>
     <w:p>
@@ -3191,7 +2757,21 @@
           <w:i/>
           <w:sz w:val="20"/>
         </w:rPr>
-        <w:t>Figura 1. Arquitectura en capas con SPA Angular, API REST Spring Boot y MySQL.</w:t>
+        <w:t xml:space="preserve">Figura 1. Arquitectura en capas con SPA Angular, </w:t>
+      </w:r>
+      <w:r>
+        <w:rPr>
+          <w:i/>
+          <w:sz w:val="20"/>
+        </w:rPr>
+        <w:t>API REST FastAPI y MySQL</w:t>
+      </w:r>
+      <w:r>
+        <w:rPr>
+          <w:i/>
+          <w:sz w:val="20"/>
+        </w:rPr>
+        <w:t>.</w:t>
       </w:r>
     </w:p>
     <w:p>
@@ -3218,49 +2798,7 @@
         <w:rPr>
           <w:sz w:val="22"/>
         </w:rPr>
-        <w:t xml:space="preserve">El mapa de navegación representa el recorrido completo del usuario dentro de la aplicación. Inicia en el </w:t>
-      </w:r>
-      <w:proofErr w:type="spellStart"/>
-      <w:r>
-        <w:rPr>
-          <w:sz w:val="22"/>
-        </w:rPr>
-        <w:t>login</w:t>
-      </w:r>
-      <w:proofErr w:type="spellEnd"/>
-      <w:r>
-        <w:rPr>
-          <w:sz w:val="22"/>
-        </w:rPr>
-        <w:t xml:space="preserve">, continúa en el </w:t>
-      </w:r>
-      <w:proofErr w:type="spellStart"/>
-      <w:r>
-        <w:rPr>
-          <w:sz w:val="22"/>
-        </w:rPr>
-        <w:t>dashboard</w:t>
-      </w:r>
-      <w:proofErr w:type="spellEnd"/>
-      <w:r>
-        <w:rPr>
-          <w:sz w:val="22"/>
-        </w:rPr>
-        <w:t xml:space="preserve"> y desde el </w:t>
-      </w:r>
-      <w:proofErr w:type="spellStart"/>
-      <w:r>
-        <w:rPr>
-          <w:sz w:val="22"/>
-        </w:rPr>
-        <w:t>layout</w:t>
-      </w:r>
-      <w:proofErr w:type="spellEnd"/>
-      <w:r>
-        <w:rPr>
-          <w:sz w:val="22"/>
-        </w:rPr>
-        <w:t xml:space="preserve"> principal permite acceder a los módulos operativos mediante rutas internas de Angular.</w:t>
+        <w:t>El mapa de navegación representa el recorrido completo del usuario dentro de la aplicación. Inicia en el login, continúa en el dashboard y desde el layout principal permite acceder a los módulos operativos mediante rutas internas de Angular.</w:t>
       </w:r>
     </w:p>
     <w:p>
@@ -3336,21 +2874,7 @@
         <w:rPr>
           <w:sz w:val="22"/>
         </w:rPr>
-        <w:t>/</w:t>
-      </w:r>
-      <w:proofErr w:type="spellStart"/>
-      <w:r>
-        <w:rPr>
-          <w:sz w:val="22"/>
-        </w:rPr>
-        <w:t>login</w:t>
-      </w:r>
-      <w:proofErr w:type="spellEnd"/>
-      <w:r>
-        <w:rPr>
-          <w:sz w:val="22"/>
-        </w:rPr>
-        <w:t>: autenticación inicial y validación de credenciales.</w:t>
+        <w:t>/login: autenticación inicial y validación de credenciales.</w:t>
       </w:r>
     </w:p>
     <w:p>
@@ -3359,20 +2883,6 @@
           <w:sz w:val="22"/>
         </w:rPr>
         <w:t>/dashboard: indicadores diferenciados para administrador y vendedor.</w:t>
-      </w:r>
-      <w:proofErr w:type="spellStart"/>
-      <w:r>
-        <w:rPr>
-          <w:sz w:val="22"/>
-        </w:rPr>
-        <w:t/>
-      </w:r>
-      <w:proofErr w:type="spellEnd"/>
-      <w:r>
-        <w:rPr>
-          <w:sz w:val="22"/>
-        </w:rPr>
-        <w:t/>
       </w:r>
     </w:p>
     <w:p>
@@ -3439,21 +2949,7 @@
         <w:rPr>
           <w:sz w:val="22"/>
         </w:rPr>
-        <w:t xml:space="preserve">La aplicación ya se encuentra implementada y conectada al </w:t>
-      </w:r>
-      <w:proofErr w:type="spellStart"/>
-      <w:r>
-        <w:rPr>
-          <w:sz w:val="22"/>
-        </w:rPr>
-        <w:t>backend</w:t>
-      </w:r>
-      <w:proofErr w:type="spellEnd"/>
-      <w:r>
-        <w:rPr>
-          <w:sz w:val="22"/>
-        </w:rPr>
-        <w:t>. Por ello, esta sección no muestra solo prototipos estáticos, sino capturas reales de cada parte principal de la web ejecutándose en http://localhost:4200.</w:t>
+        <w:t>La aplicación ya se encuentra implementada y conectada al backend. Por ello, esta sección no muestra solo prototipos estáticos, sino capturas reales de cada parte principal de la web ejecutándose en http://localhost:4200.</w:t>
       </w:r>
     </w:p>
     <w:p>
@@ -3521,7 +3017,6 @@
         <w:rPr>
           <w:noProof/>
         </w:rPr>
-        <w:lastRenderedPageBreak/>
         <w:drawing>
           <wp:inline distT="0" distB="0" distL="0" distR="0" wp14:anchorId="66315135" wp14:editId="0D0551B9">
             <wp:extent cx="5715000" cy="3213119"/>
@@ -3568,23 +3063,7 @@
           <w:i/>
           <w:sz w:val="20"/>
         </w:rPr>
-        <w:t xml:space="preserve">Figura 4. Modulo Dashboard: vista administrativa o de vendedor segun el rol autenticado.</w:t>
-      </w:r>
-      <w:proofErr w:type="spellStart"/>
-      <w:r>
-        <w:rPr>
-          <w:i/>
-          <w:sz w:val="20"/>
-        </w:rPr>
-        <w:t/>
-      </w:r>
-      <w:proofErr w:type="spellEnd"/>
-      <w:r>
-        <w:rPr>
-          <w:i/>
-          <w:sz w:val="20"/>
-        </w:rPr>
-        <w:t/>
+        <w:t>Figura 4. Modulo Dashboard: vista administrativa o de vendedor segun el rol autenticado.</w:t>
       </w:r>
     </w:p>
     <w:p>
@@ -3652,7 +3131,6 @@
         <w:rPr>
           <w:noProof/>
         </w:rPr>
-        <w:lastRenderedPageBreak/>
         <w:drawing>
           <wp:inline distT="0" distB="0" distL="0" distR="0" wp14:anchorId="6ED5396A" wp14:editId="05087A7E">
             <wp:extent cx="5715000" cy="3213119"/>
@@ -3767,7 +3245,6 @@
         <w:rPr>
           <w:noProof/>
         </w:rPr>
-        <w:lastRenderedPageBreak/>
         <w:drawing>
           <wp:inline distT="0" distB="0" distL="0" distR="0" wp14:anchorId="20E49CF8" wp14:editId="7D669A93">
             <wp:extent cx="5715000" cy="3213119"/>
@@ -3852,49 +3329,7 @@
         <w:rPr>
           <w:sz w:val="22"/>
         </w:rPr>
-        <w:t xml:space="preserve">La base de datos física no es una captura de Docker. Docker Desktop solo ejecuta el contenedor donde vive MySQL. El diseño físico de la base se sustenta con el archivo </w:t>
-      </w:r>
-      <w:proofErr w:type="spellStart"/>
-      <w:r>
-        <w:rPr>
-          <w:sz w:val="22"/>
-        </w:rPr>
-        <w:t>database</w:t>
-      </w:r>
-      <w:proofErr w:type="spellEnd"/>
-      <w:r>
-        <w:rPr>
-          <w:sz w:val="22"/>
-        </w:rPr>
-        <w:t>/</w:t>
-      </w:r>
-      <w:proofErr w:type="spellStart"/>
-      <w:r>
-        <w:rPr>
-          <w:sz w:val="22"/>
-        </w:rPr>
-        <w:t>schema.sql</w:t>
-      </w:r>
-      <w:proofErr w:type="spellEnd"/>
-      <w:r>
-        <w:rPr>
-          <w:sz w:val="22"/>
-        </w:rPr>
-        <w:t xml:space="preserve">, el modelo entidad-relación, las tablas creadas, los tipos de datos, claves primarias, claves </w:t>
-      </w:r>
-      <w:proofErr w:type="spellStart"/>
-      <w:r>
-        <w:rPr>
-          <w:sz w:val="22"/>
-        </w:rPr>
-        <w:t>foráneas</w:t>
-      </w:r>
-      <w:proofErr w:type="spellEnd"/>
-      <w:r>
-        <w:rPr>
-          <w:sz w:val="22"/>
-        </w:rPr>
-        <w:t xml:space="preserve"> y datos iniciales.</w:t>
+        <w:t>La base de datos física no es una captura de Docker. Docker Desktop solo ejecuta el contenedor donde vive MySQL. El diseño físico de la base se sustenta con el archivo database/schema.sql, el modelo entidad-relación, las tablas creadas, los tipos de datos, claves primarias, claves foráneas y datos iniciales.</w:t>
       </w:r>
     </w:p>
     <w:p>
@@ -3905,35 +3340,7 @@
         <w:rPr>
           <w:sz w:val="22"/>
         </w:rPr>
-        <w:t xml:space="preserve">Para este proyecto se utiliza la base </w:t>
-      </w:r>
-      <w:proofErr w:type="spellStart"/>
-      <w:r>
-        <w:rPr>
-          <w:sz w:val="22"/>
-        </w:rPr>
-        <w:t>chompas_mabel_db</w:t>
-      </w:r>
-      <w:proofErr w:type="spellEnd"/>
-      <w:r>
-        <w:rPr>
-          <w:sz w:val="22"/>
-        </w:rPr>
-        <w:t xml:space="preserve"> en MySQL 8.4. El contenedor Docker permite replicar el ambiente en otra PC sin instalar MySQL manualmente, pero la estructura real de la base </w:t>
-      </w:r>
-      <w:proofErr w:type="spellStart"/>
-      <w:r>
-        <w:rPr>
-          <w:sz w:val="22"/>
-        </w:rPr>
-        <w:t>esta</w:t>
-      </w:r>
-      <w:proofErr w:type="spellEnd"/>
-      <w:r>
-        <w:rPr>
-          <w:sz w:val="22"/>
-        </w:rPr>
-        <w:t xml:space="preserve"> definida en el script SQL.</w:t>
+        <w:t>Para este proyecto se utiliza la base chompas_mabel_db en MySQL 8.4. El contenedor Docker permite replicar el ambiente en otra PC sin instalar MySQL manualmente, pero la estructura real de la base esta definida en el script SQL.</w:t>
       </w:r>
     </w:p>
     <w:p>
@@ -3945,7 +3352,6 @@
         <w:rPr>
           <w:noProof/>
         </w:rPr>
-        <w:lastRenderedPageBreak/>
         <w:drawing>
           <wp:inline distT="0" distB="0" distL="0" distR="0" wp14:anchorId="6444FA5A" wp14:editId="45453FC3">
             <wp:extent cx="5715000" cy="4286250"/>
@@ -4004,21 +3410,7 @@
         <w:rPr>
           <w:sz w:val="22"/>
         </w:rPr>
-        <w:t xml:space="preserve">Categoría 1 a N Productos mediante </w:t>
-      </w:r>
-      <w:proofErr w:type="spellStart"/>
-      <w:r>
-        <w:rPr>
-          <w:sz w:val="22"/>
-        </w:rPr>
-        <w:t>productos.id_categoría</w:t>
-      </w:r>
-      <w:proofErr w:type="spellEnd"/>
-      <w:r>
-        <w:rPr>
-          <w:sz w:val="22"/>
-        </w:rPr>
-        <w:t>.</w:t>
+        <w:t>Categoría 1 a N Productos mediante productos.id_categoría.</w:t>
       </w:r>
     </w:p>
     <w:p>
@@ -4029,21 +3421,7 @@
         <w:rPr>
           <w:sz w:val="22"/>
         </w:rPr>
-        <w:t xml:space="preserve">Cliente 1 a N Pedidos mediante </w:t>
-      </w:r>
-      <w:proofErr w:type="spellStart"/>
-      <w:r>
-        <w:rPr>
-          <w:sz w:val="22"/>
-        </w:rPr>
-        <w:t>pedidos.id_cliente</w:t>
-      </w:r>
-      <w:proofErr w:type="spellEnd"/>
-      <w:r>
-        <w:rPr>
-          <w:sz w:val="22"/>
-        </w:rPr>
-        <w:t>.</w:t>
+        <w:t>Cliente 1 a N Pedidos mediante pedidos.id_cliente.</w:t>
       </w:r>
     </w:p>
     <w:p>
@@ -4054,21 +3432,7 @@
         <w:rPr>
           <w:sz w:val="22"/>
         </w:rPr>
-        <w:t xml:space="preserve">Usuario 1 a N Pedidos mediante </w:t>
-      </w:r>
-      <w:proofErr w:type="spellStart"/>
-      <w:r>
-        <w:rPr>
-          <w:sz w:val="22"/>
-        </w:rPr>
-        <w:t>pedidos.id_usuario</w:t>
-      </w:r>
-      <w:proofErr w:type="spellEnd"/>
-      <w:r>
-        <w:rPr>
-          <w:sz w:val="22"/>
-        </w:rPr>
-        <w:t>.</w:t>
+        <w:t>Usuario 1 a N Pedidos mediante pedidos.id_usuario.</w:t>
       </w:r>
     </w:p>
     <w:p>
@@ -4079,35 +3443,7 @@
         <w:rPr>
           <w:sz w:val="22"/>
         </w:rPr>
-        <w:t xml:space="preserve">Pedido 1 a N </w:t>
-      </w:r>
-      <w:proofErr w:type="spellStart"/>
-      <w:r>
-        <w:rPr>
-          <w:sz w:val="22"/>
-        </w:rPr>
-        <w:t>DetallePedido</w:t>
-      </w:r>
-      <w:proofErr w:type="spellEnd"/>
-      <w:r>
-        <w:rPr>
-          <w:sz w:val="22"/>
-        </w:rPr>
-        <w:t xml:space="preserve"> mediante </w:t>
-      </w:r>
-      <w:proofErr w:type="spellStart"/>
-      <w:r>
-        <w:rPr>
-          <w:sz w:val="22"/>
-        </w:rPr>
-        <w:t>detalle_pedido.id_pedido</w:t>
-      </w:r>
-      <w:proofErr w:type="spellEnd"/>
-      <w:r>
-        <w:rPr>
-          <w:sz w:val="22"/>
-        </w:rPr>
-        <w:t>.</w:t>
+        <w:t>Pedido 1 a N DetallePedido mediante detalle_pedido.id_pedido.</w:t>
       </w:r>
     </w:p>
     <w:p>
@@ -4118,35 +3454,7 @@
         <w:rPr>
           <w:sz w:val="22"/>
         </w:rPr>
-        <w:t xml:space="preserve">Producto 1 a N </w:t>
-      </w:r>
-      <w:proofErr w:type="spellStart"/>
-      <w:r>
-        <w:rPr>
-          <w:sz w:val="22"/>
-        </w:rPr>
-        <w:t>DetallePedido</w:t>
-      </w:r>
-      <w:proofErr w:type="spellEnd"/>
-      <w:r>
-        <w:rPr>
-          <w:sz w:val="22"/>
-        </w:rPr>
-        <w:t xml:space="preserve"> mediante </w:t>
-      </w:r>
-      <w:proofErr w:type="spellStart"/>
-      <w:r>
-        <w:rPr>
-          <w:sz w:val="22"/>
-        </w:rPr>
-        <w:t>detalle_pedido.id_producto</w:t>
-      </w:r>
-      <w:proofErr w:type="spellEnd"/>
-      <w:r>
-        <w:rPr>
-          <w:sz w:val="22"/>
-        </w:rPr>
-        <w:t>.</w:t>
+        <w:t>Producto 1 a N DetallePedido mediante detalle_pedido.id_producto.</w:t>
       </w:r>
     </w:p>
     <w:p>
@@ -4157,35 +3465,7 @@
         <w:rPr>
           <w:sz w:val="22"/>
         </w:rPr>
-        <w:t xml:space="preserve">Producto 1 a N </w:t>
-      </w:r>
-      <w:proofErr w:type="spellStart"/>
-      <w:r>
-        <w:rPr>
-          <w:sz w:val="22"/>
-        </w:rPr>
-        <w:t>InventarioMovimiento</w:t>
-      </w:r>
-      <w:proofErr w:type="spellEnd"/>
-      <w:r>
-        <w:rPr>
-          <w:sz w:val="22"/>
-        </w:rPr>
-        <w:t xml:space="preserve"> mediante </w:t>
-      </w:r>
-      <w:proofErr w:type="spellStart"/>
-      <w:r>
-        <w:rPr>
-          <w:sz w:val="22"/>
-        </w:rPr>
-        <w:t>inventario_movimientos.id_producto</w:t>
-      </w:r>
-      <w:proofErr w:type="spellEnd"/>
-      <w:r>
-        <w:rPr>
-          <w:sz w:val="22"/>
-        </w:rPr>
-        <w:t>.</w:t>
+        <w:t>Producto 1 a N InventarioMovimiento mediante inventario_movimientos.id_producto.</w:t>
       </w:r>
     </w:p>
     <w:p>
@@ -4196,21 +3476,7 @@
         <w:rPr>
           <w:sz w:val="22"/>
         </w:rPr>
-        <w:t xml:space="preserve">Pedido 1 a 1 Venta mediante </w:t>
-      </w:r>
-      <w:proofErr w:type="spellStart"/>
-      <w:r>
-        <w:rPr>
-          <w:sz w:val="22"/>
-        </w:rPr>
-        <w:t>ventas.id_pedido</w:t>
-      </w:r>
-      <w:proofErr w:type="spellEnd"/>
-      <w:r>
-        <w:rPr>
-          <w:sz w:val="22"/>
-        </w:rPr>
-        <w:t xml:space="preserve"> con restricción UNIQUE.</w:t>
+        <w:t>Pedido 1 a 1 Venta mediante ventas.id_pedido con restricción UNIQUE.</w:t>
       </w:r>
     </w:p>
     <w:p>
@@ -4222,7 +3488,6 @@
         <w:rPr>
           <w:noProof/>
         </w:rPr>
-        <w:lastRenderedPageBreak/>
         <w:drawing>
           <wp:inline distT="0" distB="0" distL="0" distR="0" wp14:anchorId="0CABF95B" wp14:editId="3C89BF8C">
             <wp:extent cx="5715000" cy="3333750"/>
@@ -4281,35 +3546,7 @@
         <w:rPr>
           <w:sz w:val="22"/>
         </w:rPr>
-        <w:t xml:space="preserve">Por lo tanto, para la entrega se recomienda presentar el modelo ER y el script </w:t>
-      </w:r>
-      <w:proofErr w:type="spellStart"/>
-      <w:r>
-        <w:rPr>
-          <w:sz w:val="22"/>
-        </w:rPr>
-        <w:t>schema.sql</w:t>
-      </w:r>
-      <w:proofErr w:type="spellEnd"/>
-      <w:r>
-        <w:rPr>
-          <w:sz w:val="22"/>
-        </w:rPr>
-        <w:t xml:space="preserve"> cómo evidencia principal de la base de datos física; la captura o evidencia de Docker se usa solo para demostrar que MySQL levanta correctamente con la base </w:t>
-      </w:r>
-      <w:proofErr w:type="spellStart"/>
-      <w:r>
-        <w:rPr>
-          <w:sz w:val="22"/>
-        </w:rPr>
-        <w:t>chompas_mabel_db</w:t>
-      </w:r>
-      <w:proofErr w:type="spellEnd"/>
-      <w:r>
-        <w:rPr>
-          <w:sz w:val="22"/>
-        </w:rPr>
-        <w:t>.</w:t>
+        <w:t>Por lo tanto, para la entrega se recomienda presentar el modelo ER y el script schema.sql cómo evidencia principal de la base de datos física; la captura o evidencia de Docker se usa solo para demostrar que MySQL levanta correctamente con la base chompas_mabel_db.</w:t>
       </w:r>
     </w:p>
     <w:p>
@@ -4425,63 +3662,7 @@
         <w:rPr>
           <w:sz w:val="22"/>
         </w:rPr>
-        <w:t xml:space="preserve">El desarrollo se </w:t>
-      </w:r>
-      <w:proofErr w:type="spellStart"/>
-      <w:r>
-        <w:rPr>
-          <w:sz w:val="22"/>
-        </w:rPr>
-        <w:t>realizo</w:t>
-      </w:r>
-      <w:proofErr w:type="spellEnd"/>
-      <w:r>
-        <w:rPr>
-          <w:sz w:val="22"/>
-        </w:rPr>
-        <w:t xml:space="preserve"> con una estructura separada por </w:t>
-      </w:r>
-      <w:proofErr w:type="spellStart"/>
-      <w:r>
-        <w:rPr>
-          <w:sz w:val="22"/>
-        </w:rPr>
-        <w:t>frontend</w:t>
-      </w:r>
-      <w:proofErr w:type="spellEnd"/>
-      <w:r>
-        <w:rPr>
-          <w:sz w:val="22"/>
-        </w:rPr>
-        <w:t xml:space="preserve">, </w:t>
-      </w:r>
-      <w:proofErr w:type="spellStart"/>
-      <w:r>
-        <w:rPr>
-          <w:sz w:val="22"/>
-        </w:rPr>
-        <w:t>backend</w:t>
-      </w:r>
-      <w:proofErr w:type="spellEnd"/>
-      <w:r>
-        <w:rPr>
-          <w:sz w:val="22"/>
-        </w:rPr>
-        <w:t xml:space="preserve"> y base de datos. Cada parte puede ejecutarse de forma local y también conectarse mediante Docker </w:t>
-      </w:r>
-      <w:proofErr w:type="spellStart"/>
-      <w:r>
-        <w:rPr>
-          <w:sz w:val="22"/>
-        </w:rPr>
-        <w:t>Compose</w:t>
-      </w:r>
-      <w:proofErr w:type="spellEnd"/>
-      <w:r>
-        <w:rPr>
-          <w:sz w:val="22"/>
-        </w:rPr>
-        <w:t xml:space="preserve"> para la base MySQL.</w:t>
+        <w:t>El desarrollo se realizo con una estructura separada por frontend, backend y base de datos. Cada parte puede ejecutarse de forma local y también conectarse mediante Docker Compose para la base MySQL.</w:t>
       </w:r>
     </w:p>
     <w:p>
@@ -4496,19 +3677,11 @@
           <w:szCs w:val="18"/>
         </w:rPr>
       </w:pPr>
-      <w:proofErr w:type="spellStart"/>
-      <w:r>
-        <w:rPr>
-          <w:b/>
-        </w:rPr>
-        <w:t>Frontend</w:t>
-      </w:r>
-      <w:proofErr w:type="spellEnd"/>
-      <w:r>
-        <w:rPr>
-          <w:b/>
-        </w:rPr>
-        <w:t xml:space="preserve"> Angular</w:t>
+      <w:r>
+        <w:rPr>
+          <w:b/>
+        </w:rPr>
+        <w:t>Frontend Angular</w:t>
       </w:r>
     </w:p>
     <w:p>
@@ -4519,212 +3692,64 @@
         <w:rPr>
           <w:sz w:val="22"/>
         </w:rPr>
-        <w:t xml:space="preserve">Componentes para login, dashboard, productos, clientes, pedidos, creditos, reportes y layout con menu por rol.</w:t>
-      </w:r>
-      <w:proofErr w:type="spellStart"/>
-      <w:r>
-        <w:rPr>
-          <w:sz w:val="22"/>
-        </w:rPr>
-        <w:t/>
-      </w:r>
-      <w:proofErr w:type="spellEnd"/>
-      <w:r>
-        <w:rPr>
-          <w:sz w:val="22"/>
-        </w:rPr>
-        <w:t xml:space="preserve"/>
-      </w:r>
-      <w:proofErr w:type="spellStart"/>
-      <w:r>
-        <w:rPr>
-          <w:sz w:val="22"/>
-        </w:rPr>
-        <w:t/>
-      </w:r>
-      <w:proofErr w:type="spellEnd"/>
-      <w:r>
-        <w:rPr>
-          <w:sz w:val="22"/>
-        </w:rPr>
-        <w:t/>
-      </w:r>
-    </w:p>
-    <w:p>
-      <w:pPr>
-        <w:spacing w:after="155" w:line="360" w:lineRule="auto"/>
-        <w:ind w:left="0" w:right="200" w:firstLine="0"/>
-        <w:rPr>
-          <w:rFonts w:ascii="Century Gothic" w:hAnsi="Century Gothic"/>
-          <w:b/>
-          <w:color w:val="202124"/>
-          <w:sz w:val="26"/>
-          <w:szCs w:val="26"/>
-        </w:rPr>
-      </w:pPr>
-      <w:r>
-        <w:rPr>
-          <w:sz w:val="22"/>
-        </w:rPr>
-        <w:t xml:space="preserve">Servicios HTTP: auth.service, producto.service, cliente.service y pedido.service; el login devuelve usuario, rol e identificador para diferenciar administrador y vendedor.</w:t>
-      </w:r>
-      <w:proofErr w:type="spellStart"/>
-      <w:r>
-        <w:rPr>
-          <w:sz w:val="22"/>
-        </w:rPr>
-        <w:t/>
-      </w:r>
-      <w:proofErr w:type="spellEnd"/>
-      <w:r>
-        <w:rPr>
-          <w:sz w:val="22"/>
-        </w:rPr>
-        <w:t xml:space="preserve"/>
-      </w:r>
-      <w:proofErr w:type="spellStart"/>
-      <w:r>
-        <w:rPr>
-          <w:sz w:val="22"/>
-        </w:rPr>
-        <w:t/>
-      </w:r>
-      <w:proofErr w:type="spellEnd"/>
-      <w:r>
-        <w:rPr>
-          <w:sz w:val="22"/>
-        </w:rPr>
-        <w:t xml:space="preserve"/>
-      </w:r>
-      <w:proofErr w:type="spellStart"/>
-      <w:r>
-        <w:rPr>
-          <w:sz w:val="22"/>
-        </w:rPr>
-        <w:t/>
-      </w:r>
-      <w:proofErr w:type="spellEnd"/>
-      <w:r>
-        <w:rPr>
-          <w:sz w:val="22"/>
-        </w:rPr>
-        <w:t xml:space="preserve"/>
-      </w:r>
-      <w:proofErr w:type="spellStart"/>
-      <w:r>
-        <w:rPr>
-          <w:sz w:val="22"/>
-        </w:rPr>
-        <w:t/>
-      </w:r>
-      <w:proofErr w:type="spellEnd"/>
-      <w:r>
-        <w:rPr>
-          <w:sz w:val="22"/>
-        </w:rPr>
-        <w:t/>
-      </w:r>
-    </w:p>
-    <w:p>
-      <w:pPr>
-        <w:spacing w:after="155" w:line="360" w:lineRule="auto"/>
-        <w:ind w:left="0" w:right="200" w:firstLine="0"/>
-        <w:rPr>
-          <w:rFonts w:ascii="Century Gothic" w:hAnsi="Century Gothic"/>
-          <w:b/>
-          <w:color w:val="202124"/>
-          <w:sz w:val="26"/>
-          <w:szCs w:val="26"/>
-        </w:rPr>
-      </w:pPr>
-      <w:r>
-        <w:rPr>
-          <w:sz w:val="22"/>
-        </w:rPr>
-        <w:t xml:space="preserve">Formularios reactivos con </w:t>
-      </w:r>
-      <w:proofErr w:type="spellStart"/>
-      <w:r>
-        <w:rPr>
-          <w:sz w:val="22"/>
-        </w:rPr>
-        <w:t>Validators.required</w:t>
-      </w:r>
-      <w:proofErr w:type="spellEnd"/>
-      <w:r>
-        <w:rPr>
-          <w:sz w:val="22"/>
-        </w:rPr>
-        <w:t xml:space="preserve">, </w:t>
-      </w:r>
-      <w:proofErr w:type="spellStart"/>
-      <w:r>
-        <w:rPr>
-          <w:sz w:val="22"/>
-        </w:rPr>
-        <w:t>Validators.email</w:t>
-      </w:r>
-      <w:proofErr w:type="spellEnd"/>
-      <w:r>
-        <w:rPr>
-          <w:sz w:val="22"/>
-        </w:rPr>
-        <w:t xml:space="preserve">, </w:t>
-      </w:r>
-      <w:proofErr w:type="spellStart"/>
-      <w:r>
-        <w:rPr>
-          <w:sz w:val="22"/>
-        </w:rPr>
-        <w:t>Validators.min</w:t>
-      </w:r>
-      <w:proofErr w:type="spellEnd"/>
-      <w:r>
-        <w:rPr>
-          <w:sz w:val="22"/>
-        </w:rPr>
-        <w:t xml:space="preserve"> y </w:t>
-      </w:r>
-      <w:proofErr w:type="spellStart"/>
-      <w:r>
-        <w:rPr>
-          <w:sz w:val="22"/>
-        </w:rPr>
-        <w:t>Validators.minLength</w:t>
-      </w:r>
-      <w:proofErr w:type="spellEnd"/>
-      <w:r>
-        <w:rPr>
-          <w:sz w:val="22"/>
-        </w:rPr>
-        <w:t>.</w:t>
-      </w:r>
-    </w:p>
-    <w:p>
-      <w:pPr>
-        <w:spacing w:after="155" w:line="360" w:lineRule="auto"/>
-        <w:ind w:left="0" w:right="200" w:firstLine="0"/>
-        <w:rPr>
-          <w:rFonts w:ascii="Century Gothic" w:hAnsi="Century Gothic"/>
-          <w:b/>
-          <w:color w:val="202124"/>
-          <w:sz w:val="26"/>
-          <w:szCs w:val="26"/>
-        </w:rPr>
-      </w:pPr>
-      <w:proofErr w:type="spellStart"/>
-      <w:r>
-        <w:rPr>
-          <w:sz w:val="22"/>
-        </w:rPr>
-        <w:t>Signals</w:t>
-      </w:r>
-      <w:proofErr w:type="spellEnd"/>
-      <w:r>
-        <w:rPr>
-          <w:sz w:val="22"/>
-        </w:rPr>
-        <w:t xml:space="preserve"> para manejar estado reactivo en la interfaz.</w:t>
+        <w:t>Componentes para login, dashboard, productos, clientes, pedidos, creditos, reportes y layout con menu por rol.</w:t>
+      </w:r>
+    </w:p>
+    <w:p>
+      <w:pPr>
+        <w:spacing w:after="155" w:line="360" w:lineRule="auto"/>
+        <w:ind w:left="0" w:right="200" w:firstLine="0"/>
+        <w:rPr>
+          <w:rFonts w:ascii="Century Gothic" w:hAnsi="Century Gothic"/>
+          <w:b/>
+          <w:color w:val="202124"/>
+          <w:sz w:val="26"/>
+          <w:szCs w:val="26"/>
+        </w:rPr>
+      </w:pPr>
+      <w:r>
+        <w:rPr>
+          <w:sz w:val="22"/>
+        </w:rPr>
+        <w:t>Servicios HTTP: auth.service, producto.service, cliente.service y pedido.service; el login devuelve usuario, rol e identificador para diferenciar administrador y vendedor.</w:t>
+      </w:r>
+    </w:p>
+    <w:p>
+      <w:pPr>
+        <w:spacing w:after="155" w:line="360" w:lineRule="auto"/>
+        <w:ind w:left="0" w:right="200" w:firstLine="0"/>
+        <w:rPr>
+          <w:rFonts w:ascii="Century Gothic" w:hAnsi="Century Gothic"/>
+          <w:b/>
+          <w:color w:val="202124"/>
+          <w:sz w:val="26"/>
+          <w:szCs w:val="26"/>
+        </w:rPr>
+      </w:pPr>
+      <w:r>
+        <w:rPr>
+          <w:sz w:val="22"/>
+        </w:rPr>
+        <w:t>Formularios reactivos con Validators.required, Validators.email, Validators.min y Validators.minLength.</w:t>
+      </w:r>
+    </w:p>
+    <w:p>
+      <w:pPr>
+        <w:spacing w:after="155" w:line="360" w:lineRule="auto"/>
+        <w:ind w:left="0" w:right="200" w:firstLine="0"/>
+        <w:rPr>
+          <w:rFonts w:ascii="Century Gothic" w:hAnsi="Century Gothic"/>
+          <w:b/>
+          <w:color w:val="202124"/>
+          <w:sz w:val="26"/>
+          <w:szCs w:val="26"/>
+        </w:rPr>
+      </w:pPr>
+      <w:r>
+        <w:rPr>
+          <w:sz w:val="22"/>
+        </w:rPr>
+        <w:t>Signals para manejar estado reactivo en la interfaz.</w:t>
       </w:r>
     </w:p>
     <w:p>
@@ -4746,7 +3771,7 @@
           <w:b/>
           <w:lang w:val="en-US"/>
         </w:rPr>
-        <w:t>Backend Spring Boot</w:t>
+        <w:t>Backend FastAPI</w:t>
       </w:r>
     </w:p>
     <w:p>
@@ -4762,584 +3787,252 @@
           <w:lang w:val="en-US"/>
         </w:rPr>
       </w:pPr>
-      <w:proofErr w:type="spellStart"/>
       <w:r>
         <w:rPr>
           <w:sz w:val="22"/>
           <w:lang w:val="en-US"/>
         </w:rPr>
-        <w:t>Controladores</w:t>
-      </w:r>
-      <w:proofErr w:type="spellEnd"/>
-      <w:r>
-        <w:rPr>
-          <w:sz w:val="22"/>
+        <w:t>Controladores REST: AuthController, ProductoController, ClienteController y PedidoController.</w:t>
+      </w:r>
+    </w:p>
+    <w:p>
+      <w:pPr>
+        <w:spacing w:after="155" w:line="360" w:lineRule="auto"/>
+        <w:ind w:left="0" w:right="200" w:firstLine="0"/>
+        <w:rPr>
+          <w:rFonts w:ascii="Century Gothic" w:hAnsi="Century Gothic"/>
+          <w:b/>
+          <w:color w:val="202124"/>
+          <w:sz w:val="26"/>
+          <w:szCs w:val="26"/>
+        </w:rPr>
+      </w:pPr>
+      <w:r>
+        <w:rPr>
+          <w:sz w:val="22"/>
+        </w:rPr>
+        <w:t>Servicios de negocio para validacion, calculo de totales, actualizacion de stock, registro de ventas y calculo de saldos de credito.</w:t>
+      </w:r>
+    </w:p>
+    <w:p>
+      <w:pPr>
+        <w:spacing w:after="155" w:line="360" w:lineRule="auto"/>
+        <w:ind w:left="0" w:right="200" w:firstLine="0"/>
+        <w:rPr>
+          <w:rFonts w:ascii="Century Gothic" w:hAnsi="Century Gothic"/>
+          <w:b/>
+          <w:color w:val="202124"/>
+          <w:sz w:val="26"/>
+          <w:szCs w:val="26"/>
+        </w:rPr>
+      </w:pPr>
+      <w:r>
+        <w:rPr>
+          <w:sz w:val="22"/>
+        </w:rPr>
+        <w:t>Acceso a MySQL mediante MySQL Connector y procedimientos almacenados.</w:t>
+      </w:r>
+    </w:p>
+    <w:p>
+      <w:pPr>
+        <w:spacing w:after="155" w:line="360" w:lineRule="auto"/>
+        <w:ind w:left="0" w:right="200" w:firstLine="0"/>
+        <w:rPr>
+          <w:rFonts w:ascii="Century Gothic" w:hAnsi="Century Gothic"/>
+          <w:b/>
+          <w:color w:val="202124"/>
+          <w:sz w:val="26"/>
+          <w:szCs w:val="26"/>
+        </w:rPr>
+      </w:pPr>
+      <w:r>
+        <w:rPr>
+          <w:sz w:val="22"/>
+        </w:rPr>
+        <w:t>Validaciones con Pydantic en modelos de entrada y respuestas JSON para errores.</w:t>
+      </w:r>
+    </w:p>
+    <w:p>
+      <w:pPr>
+        <w:spacing w:after="155" w:line="360" w:lineRule="auto"/>
+        <w:ind w:left="0" w:right="200" w:firstLine="0"/>
+        <w:jc w:val="left"/>
+        <w:rPr>
+          <w:rFonts w:ascii="Century Gothic" w:hAnsi="Century Gothic"/>
+          <w:b/>
+          <w:color w:val="202124"/>
+          <w:sz w:val="26"/>
+          <w:szCs w:val="26"/>
           <w:lang w:val="en-US"/>
         </w:rPr>
-        <w:t xml:space="preserve"> REST: </w:t>
-      </w:r>
-      <w:proofErr w:type="spellStart"/>
-      <w:r>
-        <w:rPr>
-          <w:sz w:val="22"/>
+      </w:pPr>
+      <w:r>
+        <w:rPr>
+          <w:b/>
           <w:lang w:val="en-US"/>
         </w:rPr>
-        <w:t>AuthController</w:t>
-      </w:r>
-      <w:proofErr w:type="spellEnd"/>
-      <w:r>
-        <w:rPr>
-          <w:sz w:val="22"/>
+        <w:t>Endpoints principales</w:t>
+      </w:r>
+    </w:p>
+    <w:p>
+      <w:pPr>
+        <w:spacing w:after="155" w:line="360" w:lineRule="auto"/>
+        <w:ind w:left="0" w:right="200" w:firstLine="0"/>
+        <w:rPr>
+          <w:rFonts w:ascii="Century Gothic" w:hAnsi="Century Gothic"/>
+          <w:b/>
+          <w:color w:val="202124"/>
+          <w:sz w:val="26"/>
+          <w:szCs w:val="26"/>
           <w:lang w:val="en-US"/>
         </w:rPr>
-        <w:t xml:space="preserve">, </w:t>
-      </w:r>
-      <w:proofErr w:type="spellStart"/>
+      </w:pPr>
       <w:r>
         <w:rPr>
           <w:sz w:val="22"/>
           <w:lang w:val="en-US"/>
         </w:rPr>
-        <w:t>ProductoController</w:t>
-      </w:r>
-      <w:proofErr w:type="spellEnd"/>
-      <w:r>
-        <w:rPr>
-          <w:sz w:val="22"/>
+        <w:t>GET, POST, PUT y DELETE /api/productos.</w:t>
+      </w:r>
+    </w:p>
+    <w:p>
+      <w:pPr>
+        <w:spacing w:after="155" w:line="360" w:lineRule="auto"/>
+        <w:ind w:left="0" w:right="200" w:firstLine="0"/>
+        <w:rPr>
+          <w:rFonts w:ascii="Century Gothic" w:hAnsi="Century Gothic"/>
+          <w:b/>
+          <w:color w:val="202124"/>
+          <w:sz w:val="26"/>
+          <w:szCs w:val="26"/>
           <w:lang w:val="en-US"/>
         </w:rPr>
-        <w:t xml:space="preserve">, </w:t>
-      </w:r>
-      <w:proofErr w:type="spellStart"/>
+      </w:pPr>
       <w:r>
         <w:rPr>
           <w:sz w:val="22"/>
           <w:lang w:val="en-US"/>
         </w:rPr>
-        <w:t>ClienteController</w:t>
-      </w:r>
-      <w:proofErr w:type="spellEnd"/>
-      <w:r>
-        <w:rPr>
-          <w:sz w:val="22"/>
+        <w:t>GET y POST /api/clientes.</w:t>
+      </w:r>
+    </w:p>
+    <w:p>
+      <w:pPr>
+        <w:spacing w:after="155" w:line="360" w:lineRule="auto"/>
+        <w:ind w:left="0" w:right="200" w:firstLine="0"/>
+        <w:rPr>
+          <w:rFonts w:ascii="Century Gothic" w:hAnsi="Century Gothic"/>
+          <w:b/>
+          <w:color w:val="202124"/>
+          <w:sz w:val="26"/>
+          <w:szCs w:val="26"/>
+        </w:rPr>
+      </w:pPr>
+      <w:r>
+        <w:rPr>
+          <w:sz w:val="22"/>
+        </w:rPr>
+        <w:t>GET y POST /api/pedidos.</w:t>
+      </w:r>
+    </w:p>
+    <w:p>
+      <w:pPr>
+        <w:spacing w:after="155" w:line="360" w:lineRule="auto"/>
+        <w:ind w:left="0" w:right="200" w:firstLine="0"/>
+        <w:rPr>
+          <w:rFonts w:ascii="Century Gothic" w:hAnsi="Century Gothic"/>
+          <w:b/>
+          <w:color w:val="202124"/>
+          <w:sz w:val="26"/>
+          <w:szCs w:val="26"/>
+        </w:rPr>
+      </w:pPr>
+      <w:r>
+        <w:rPr>
+          <w:sz w:val="22"/>
+        </w:rPr>
+        <w:t>POST /api/auth/login para autenticación básica del sistema.</w:t>
+      </w:r>
+    </w:p>
+    <w:p>
+      <w:pPr>
+        <w:spacing w:after="155" w:line="360" w:lineRule="auto"/>
+        <w:ind w:left="0" w:right="200" w:firstLine="0"/>
+        <w:jc w:val="left"/>
+        <w:rPr>
+          <w:rFonts w:ascii="Century Gothic" w:hAnsi="Century Gothic"/>
+          <w:b/>
+          <w:color w:val="202124"/>
+          <w:sz w:val="26"/>
+          <w:szCs w:val="26"/>
+        </w:rPr>
+      </w:pPr>
+      <w:r>
+        <w:rPr>
+          <w:b/>
+        </w:rPr>
+        <w:t>Ejecución</w:t>
+      </w:r>
+    </w:p>
+    <w:p>
+      <w:pPr>
+        <w:spacing w:after="155" w:line="360" w:lineRule="auto"/>
+        <w:ind w:left="0" w:right="200" w:firstLine="0"/>
+        <w:rPr>
+          <w:rFonts w:ascii="Century Gothic" w:hAnsi="Century Gothic"/>
+          <w:b/>
+          <w:color w:val="202124"/>
+          <w:sz w:val="26"/>
+          <w:szCs w:val="26"/>
+        </w:rPr>
+      </w:pPr>
+      <w:r>
+        <w:rPr>
+          <w:sz w:val="22"/>
+        </w:rPr>
+        <w:t>Base de datos: docker compose up -d mysql.</w:t>
+      </w:r>
+    </w:p>
+    <w:p>
+      <w:pPr>
+        <w:spacing w:after="155" w:line="360" w:lineRule="auto"/>
+        <w:ind w:left="0" w:right="200" w:firstLine="0"/>
+        <w:rPr>
+          <w:rFonts w:ascii="Century Gothic" w:hAnsi="Century Gothic"/>
+          <w:b/>
+          <w:color w:val="202124"/>
+          <w:sz w:val="26"/>
+          <w:szCs w:val="26"/>
           <w:lang w:val="en-US"/>
         </w:rPr>
-        <w:t xml:space="preserve"> y </w:t>
-      </w:r>
-      <w:proofErr w:type="spellStart"/>
+      </w:pPr>
       <w:r>
         <w:rPr>
           <w:sz w:val="22"/>
           <w:lang w:val="en-US"/>
         </w:rPr>
-        <w:t>PedidoController</w:t>
-      </w:r>
-      <w:proofErr w:type="spellEnd"/>
-      <w:r>
-        <w:rPr>
-          <w:sz w:val="22"/>
+        <w:t>Backend: cd backend-springboot; mvn spring-boot:run.</w:t>
+      </w:r>
+    </w:p>
+    <w:p>
+      <w:pPr>
+        <w:spacing w:after="155" w:line="360" w:lineRule="auto"/>
+        <w:ind w:left="0" w:right="200" w:firstLine="0"/>
+        <w:rPr>
+          <w:rFonts w:ascii="Century Gothic" w:hAnsi="Century Gothic"/>
+          <w:b/>
+          <w:color w:val="202124"/>
+          <w:sz w:val="26"/>
+          <w:szCs w:val="26"/>
           <w:lang w:val="en-US"/>
         </w:rPr>
-        <w:t>.</w:t>
-      </w:r>
-    </w:p>
-    <w:p>
-      <w:pPr>
-        <w:spacing w:after="155" w:line="360" w:lineRule="auto"/>
-        <w:ind w:left="0" w:right="200" w:firstLine="0"/>
-        <w:rPr>
-          <w:rFonts w:ascii="Century Gothic" w:hAnsi="Century Gothic"/>
-          <w:b/>
-          <w:color w:val="202124"/>
-          <w:sz w:val="26"/>
-          <w:szCs w:val="26"/>
-        </w:rPr>
-      </w:pPr>
-      <w:r>
-        <w:rPr>
-          <w:sz w:val="22"/>
-        </w:rPr>
-        <w:t>Servicios de negocio para validacion, calculo de totales, actualizacion de stock, registro de ventas y calculo de saldos de credito.</w:t>
-      </w:r>
-    </w:p>
-    <w:p>
-      <w:pPr>
-        <w:spacing w:after="155" w:line="360" w:lineRule="auto"/>
-        <w:ind w:left="0" w:right="200" w:firstLine="0"/>
-        <w:rPr>
-          <w:rFonts w:ascii="Century Gothic" w:hAnsi="Century Gothic"/>
-          <w:b/>
-          <w:color w:val="202124"/>
-          <w:sz w:val="26"/>
-          <w:szCs w:val="26"/>
-        </w:rPr>
-      </w:pPr>
-      <w:r>
-        <w:rPr>
-          <w:sz w:val="22"/>
-        </w:rPr>
-        <w:t>Repositorios Spring Data JPA para acceso a MySQL.</w:t>
-      </w:r>
-    </w:p>
-    <w:p>
-      <w:pPr>
-        <w:spacing w:after="155" w:line="360" w:lineRule="auto"/>
-        <w:ind w:left="0" w:right="200" w:firstLine="0"/>
-        <w:rPr>
-          <w:rFonts w:ascii="Century Gothic" w:hAnsi="Century Gothic"/>
-          <w:b/>
-          <w:color w:val="202124"/>
-          <w:sz w:val="26"/>
-          <w:szCs w:val="26"/>
-        </w:rPr>
-      </w:pPr>
-      <w:proofErr w:type="spellStart"/>
-      <w:r>
-        <w:rPr>
-          <w:sz w:val="22"/>
-        </w:rPr>
-        <w:t>Validaciones</w:t>
-      </w:r>
-      <w:proofErr w:type="spellEnd"/>
-      <w:r>
-        <w:rPr>
-          <w:sz w:val="22"/>
-        </w:rPr>
-        <w:t xml:space="preserve"> con </w:t>
-      </w:r>
-      <w:proofErr w:type="spellStart"/>
-      <w:r>
-        <w:rPr>
-          <w:sz w:val="22"/>
-        </w:rPr>
-        <w:t>jakarta.validation</w:t>
-      </w:r>
-      <w:proofErr w:type="spellEnd"/>
-      <w:r>
-        <w:rPr>
-          <w:sz w:val="22"/>
-        </w:rPr>
-        <w:t xml:space="preserve"> en </w:t>
-      </w:r>
-      <w:proofErr w:type="spellStart"/>
-      <w:r>
-        <w:rPr>
-          <w:sz w:val="22"/>
-        </w:rPr>
-        <w:t>DTOs</w:t>
-      </w:r>
-      <w:proofErr w:type="spellEnd"/>
-      <w:r>
-        <w:rPr>
-          <w:sz w:val="22"/>
-        </w:rPr>
-        <w:t xml:space="preserve"> y manejo centralizado de errores.</w:t>
-      </w:r>
-    </w:p>
-    <w:p>
-      <w:pPr>
-        <w:spacing w:after="155" w:line="360" w:lineRule="auto"/>
-        <w:ind w:left="0" w:right="200" w:firstLine="0"/>
-        <w:jc w:val="left"/>
-        <w:rPr>
-          <w:rFonts w:ascii="Century Gothic" w:hAnsi="Century Gothic"/>
-          <w:b/>
-          <w:color w:val="202124"/>
-          <w:sz w:val="26"/>
-          <w:szCs w:val="26"/>
+      </w:pPr>
+      <w:r>
+        <w:rPr>
+          <w:sz w:val="22"/>
           <w:lang w:val="en-US"/>
         </w:rPr>
-      </w:pPr>
-      <w:r>
-        <w:rPr>
-          <w:b/>
-          <w:lang w:val="en-US"/>
-        </w:rPr>
-        <w:t xml:space="preserve">Endpoints </w:t>
-      </w:r>
-      <w:proofErr w:type="spellStart"/>
-      <w:r>
-        <w:rPr>
-          <w:b/>
-          <w:lang w:val="en-US"/>
-        </w:rPr>
-        <w:t>principales</w:t>
-      </w:r>
-      <w:proofErr w:type="spellEnd"/>
-    </w:p>
-    <w:p>
-      <w:pPr>
-        <w:spacing w:after="155" w:line="360" w:lineRule="auto"/>
-        <w:ind w:left="0" w:right="200" w:firstLine="0"/>
-        <w:rPr>
-          <w:rFonts w:ascii="Century Gothic" w:hAnsi="Century Gothic"/>
-          <w:b/>
-          <w:color w:val="202124"/>
-          <w:sz w:val="26"/>
-          <w:szCs w:val="26"/>
-          <w:lang w:val="en-US"/>
-        </w:rPr>
-      </w:pPr>
-      <w:r>
-        <w:rPr>
-          <w:sz w:val="22"/>
-          <w:lang w:val="en-US"/>
-        </w:rPr>
-        <w:t>GET, POST, PUT y DELETE /</w:t>
-      </w:r>
-      <w:proofErr w:type="spellStart"/>
-      <w:r>
-        <w:rPr>
-          <w:sz w:val="22"/>
-          <w:lang w:val="en-US"/>
-        </w:rPr>
-        <w:t>api</w:t>
-      </w:r>
-      <w:proofErr w:type="spellEnd"/>
-      <w:r>
-        <w:rPr>
-          <w:sz w:val="22"/>
-          <w:lang w:val="en-US"/>
-        </w:rPr>
-        <w:t>/</w:t>
-      </w:r>
-      <w:proofErr w:type="spellStart"/>
-      <w:r>
-        <w:rPr>
-          <w:sz w:val="22"/>
-          <w:lang w:val="en-US"/>
-        </w:rPr>
-        <w:t>productos</w:t>
-      </w:r>
-      <w:proofErr w:type="spellEnd"/>
-      <w:r>
-        <w:rPr>
-          <w:sz w:val="22"/>
-          <w:lang w:val="en-US"/>
-        </w:rPr>
-        <w:t>.</w:t>
-      </w:r>
-    </w:p>
-    <w:p>
-      <w:pPr>
-        <w:spacing w:after="155" w:line="360" w:lineRule="auto"/>
-        <w:ind w:left="0" w:right="200" w:firstLine="0"/>
-        <w:rPr>
-          <w:rFonts w:ascii="Century Gothic" w:hAnsi="Century Gothic"/>
-          <w:b/>
-          <w:color w:val="202124"/>
-          <w:sz w:val="26"/>
-          <w:szCs w:val="26"/>
-          <w:lang w:val="en-US"/>
-        </w:rPr>
-      </w:pPr>
-      <w:r>
-        <w:rPr>
-          <w:sz w:val="22"/>
-          <w:lang w:val="en-US"/>
-        </w:rPr>
-        <w:t>GET y POST /</w:t>
-      </w:r>
-      <w:proofErr w:type="spellStart"/>
-      <w:r>
-        <w:rPr>
-          <w:sz w:val="22"/>
-          <w:lang w:val="en-US"/>
-        </w:rPr>
-        <w:t>api</w:t>
-      </w:r>
-      <w:proofErr w:type="spellEnd"/>
-      <w:r>
-        <w:rPr>
-          <w:sz w:val="22"/>
-          <w:lang w:val="en-US"/>
-        </w:rPr>
-        <w:t>/</w:t>
-      </w:r>
-      <w:proofErr w:type="spellStart"/>
-      <w:r>
-        <w:rPr>
-          <w:sz w:val="22"/>
-          <w:lang w:val="en-US"/>
-        </w:rPr>
-        <w:t>clientes</w:t>
-      </w:r>
-      <w:proofErr w:type="spellEnd"/>
-      <w:r>
-        <w:rPr>
-          <w:sz w:val="22"/>
-          <w:lang w:val="en-US"/>
-        </w:rPr>
-        <w:t>.</w:t>
-      </w:r>
-    </w:p>
-    <w:p>
-      <w:pPr>
-        <w:spacing w:after="155" w:line="360" w:lineRule="auto"/>
-        <w:ind w:left="0" w:right="200" w:firstLine="0"/>
-        <w:rPr>
-          <w:rFonts w:ascii="Century Gothic" w:hAnsi="Century Gothic"/>
-          <w:b/>
-          <w:color w:val="202124"/>
-          <w:sz w:val="26"/>
-          <w:szCs w:val="26"/>
-        </w:rPr>
-      </w:pPr>
-      <w:r>
-        <w:rPr>
-          <w:sz w:val="22"/>
-        </w:rPr>
-        <w:t>GET y POST /api/pedidos.</w:t>
-      </w:r>
-    </w:p>
-    <w:p>
-      <w:pPr>
-        <w:spacing w:after="155" w:line="360" w:lineRule="auto"/>
-        <w:ind w:left="0" w:right="200" w:firstLine="0"/>
-        <w:rPr>
-          <w:rFonts w:ascii="Century Gothic" w:hAnsi="Century Gothic"/>
-          <w:b/>
-          <w:color w:val="202124"/>
-          <w:sz w:val="26"/>
-          <w:szCs w:val="26"/>
-        </w:rPr>
-      </w:pPr>
-      <w:r>
-        <w:rPr>
-          <w:sz w:val="22"/>
-        </w:rPr>
-        <w:t>POST /api/</w:t>
-      </w:r>
-      <w:proofErr w:type="spellStart"/>
-      <w:r>
-        <w:rPr>
-          <w:sz w:val="22"/>
-        </w:rPr>
-        <w:t>auth</w:t>
-      </w:r>
-      <w:proofErr w:type="spellEnd"/>
-      <w:r>
-        <w:rPr>
-          <w:sz w:val="22"/>
-        </w:rPr>
-        <w:t>/</w:t>
-      </w:r>
-      <w:proofErr w:type="spellStart"/>
-      <w:r>
-        <w:rPr>
-          <w:sz w:val="22"/>
-        </w:rPr>
-        <w:t>login</w:t>
-      </w:r>
-      <w:proofErr w:type="spellEnd"/>
-      <w:r>
-        <w:rPr>
-          <w:sz w:val="22"/>
-        </w:rPr>
-        <w:t xml:space="preserve"> para autenticación básica del sistema.</w:t>
-      </w:r>
-    </w:p>
-    <w:p>
-      <w:pPr>
-        <w:spacing w:after="155" w:line="360" w:lineRule="auto"/>
-        <w:ind w:left="0" w:right="200" w:firstLine="0"/>
-        <w:jc w:val="left"/>
-        <w:rPr>
-          <w:rFonts w:ascii="Century Gothic" w:hAnsi="Century Gothic"/>
-          <w:b/>
-          <w:color w:val="202124"/>
-          <w:sz w:val="26"/>
-          <w:szCs w:val="26"/>
-        </w:rPr>
-      </w:pPr>
-      <w:r>
-        <w:rPr>
-          <w:b/>
-        </w:rPr>
-        <w:t>Ejecución</w:t>
-      </w:r>
-    </w:p>
-    <w:p>
-      <w:pPr>
-        <w:spacing w:after="155" w:line="360" w:lineRule="auto"/>
-        <w:ind w:left="0" w:right="200" w:firstLine="0"/>
-        <w:rPr>
-          <w:rFonts w:ascii="Century Gothic" w:hAnsi="Century Gothic"/>
-          <w:b/>
-          <w:color w:val="202124"/>
-          <w:sz w:val="26"/>
-          <w:szCs w:val="26"/>
-        </w:rPr>
-      </w:pPr>
-      <w:r>
-        <w:rPr>
-          <w:sz w:val="22"/>
-        </w:rPr>
-        <w:t xml:space="preserve">Base de datos: </w:t>
-      </w:r>
-      <w:proofErr w:type="spellStart"/>
-      <w:r>
-        <w:rPr>
-          <w:sz w:val="22"/>
-        </w:rPr>
-        <w:t>docker</w:t>
-      </w:r>
-      <w:proofErr w:type="spellEnd"/>
-      <w:r>
-        <w:rPr>
-          <w:sz w:val="22"/>
-        </w:rPr>
-        <w:t xml:space="preserve"> </w:t>
-      </w:r>
-      <w:proofErr w:type="spellStart"/>
-      <w:r>
-        <w:rPr>
-          <w:sz w:val="22"/>
-        </w:rPr>
-        <w:t>compose</w:t>
-      </w:r>
-      <w:proofErr w:type="spellEnd"/>
-      <w:r>
-        <w:rPr>
-          <w:sz w:val="22"/>
-        </w:rPr>
-        <w:t xml:space="preserve"> up -d </w:t>
-      </w:r>
-      <w:proofErr w:type="spellStart"/>
-      <w:r>
-        <w:rPr>
-          <w:sz w:val="22"/>
-        </w:rPr>
-        <w:t>mysql</w:t>
-      </w:r>
-      <w:proofErr w:type="spellEnd"/>
-      <w:r>
-        <w:rPr>
-          <w:sz w:val="22"/>
-        </w:rPr>
-        <w:t>.</w:t>
-      </w:r>
-    </w:p>
-    <w:p>
-      <w:pPr>
-        <w:spacing w:after="155" w:line="360" w:lineRule="auto"/>
-        <w:ind w:left="0" w:right="200" w:firstLine="0"/>
-        <w:rPr>
-          <w:rFonts w:ascii="Century Gothic" w:hAnsi="Century Gothic"/>
-          <w:b/>
-          <w:color w:val="202124"/>
-          <w:sz w:val="26"/>
-          <w:szCs w:val="26"/>
-          <w:lang w:val="en-US"/>
-        </w:rPr>
-      </w:pPr>
-      <w:r>
-        <w:rPr>
-          <w:sz w:val="22"/>
-          <w:lang w:val="en-US"/>
-        </w:rPr>
-        <w:t>Backend: cd backend-</w:t>
-      </w:r>
-      <w:proofErr w:type="spellStart"/>
-      <w:r>
-        <w:rPr>
-          <w:sz w:val="22"/>
-          <w:lang w:val="en-US"/>
-        </w:rPr>
-        <w:t>springboot</w:t>
-      </w:r>
-      <w:proofErr w:type="spellEnd"/>
-      <w:r>
-        <w:rPr>
-          <w:sz w:val="22"/>
-          <w:lang w:val="en-US"/>
-        </w:rPr>
-        <w:t xml:space="preserve">; </w:t>
-      </w:r>
-      <w:proofErr w:type="spellStart"/>
-      <w:r>
-        <w:rPr>
-          <w:sz w:val="22"/>
-          <w:lang w:val="en-US"/>
-        </w:rPr>
-        <w:t>mvn</w:t>
-      </w:r>
-      <w:proofErr w:type="spellEnd"/>
-      <w:r>
-        <w:rPr>
-          <w:sz w:val="22"/>
-          <w:lang w:val="en-US"/>
-        </w:rPr>
-        <w:t xml:space="preserve"> </w:t>
-      </w:r>
-      <w:proofErr w:type="spellStart"/>
-      <w:r>
-        <w:rPr>
-          <w:sz w:val="22"/>
-          <w:lang w:val="en-US"/>
-        </w:rPr>
-        <w:t>spring-boot:run</w:t>
-      </w:r>
-      <w:proofErr w:type="spellEnd"/>
-      <w:r>
-        <w:rPr>
-          <w:sz w:val="22"/>
-          <w:lang w:val="en-US"/>
-        </w:rPr>
-        <w:t>.</w:t>
-      </w:r>
-    </w:p>
-    <w:p>
-      <w:pPr>
-        <w:spacing w:after="155" w:line="360" w:lineRule="auto"/>
-        <w:ind w:left="0" w:right="200" w:firstLine="0"/>
-        <w:rPr>
-          <w:rFonts w:ascii="Century Gothic" w:hAnsi="Century Gothic"/>
-          <w:b/>
-          <w:color w:val="202124"/>
-          <w:sz w:val="26"/>
-          <w:szCs w:val="26"/>
-          <w:lang w:val="en-US"/>
-        </w:rPr>
-      </w:pPr>
-      <w:r>
-        <w:rPr>
-          <w:sz w:val="22"/>
-          <w:lang w:val="en-US"/>
-        </w:rPr>
-        <w:t xml:space="preserve">Frontend: cd frontend-angular; </w:t>
-      </w:r>
-      <w:proofErr w:type="spellStart"/>
-      <w:r>
-        <w:rPr>
-          <w:sz w:val="22"/>
-          <w:lang w:val="en-US"/>
-        </w:rPr>
-        <w:t>npm</w:t>
-      </w:r>
-      <w:proofErr w:type="spellEnd"/>
-      <w:r>
-        <w:rPr>
-          <w:sz w:val="22"/>
-          <w:lang w:val="en-US"/>
-        </w:rPr>
-        <w:t xml:space="preserve"> install; </w:t>
-      </w:r>
-      <w:proofErr w:type="spellStart"/>
-      <w:r>
-        <w:rPr>
-          <w:sz w:val="22"/>
-          <w:lang w:val="en-US"/>
-        </w:rPr>
-        <w:t>npm</w:t>
-      </w:r>
-      <w:proofErr w:type="spellEnd"/>
-      <w:r>
-        <w:rPr>
-          <w:sz w:val="22"/>
-          <w:lang w:val="en-US"/>
-        </w:rPr>
-        <w:t xml:space="preserve"> start.</w:t>
+        <w:t>Frontend: cd frontend-angular; npm install; npm start.</w:t>
       </w:r>
     </w:p>
     <w:p>
@@ -5360,19 +4053,17 @@
         </w:rPr>
         <w:t xml:space="preserve">La aplicación fue verificada localmente: Docker levanta MySQL, el </w:t>
       </w:r>
-      <w:proofErr w:type="spellStart"/>
-      <w:r>
-        <w:rPr>
-          <w:sz w:val="22"/>
-        </w:rPr>
-        <w:t>backend</w:t>
-      </w:r>
-      <w:proofErr w:type="spellEnd"/>
-      <w:r>
-        <w:rPr>
-          <w:sz w:val="22"/>
-        </w:rPr>
-        <w:t xml:space="preserve"> responde en el puerto 8080 y Angular se ejecuta en el puerto 4200.</w:t>
+      <w:r>
+        <w:rPr>
+          <w:sz w:val="22"/>
+        </w:rPr>
+        <w:t>backend FastAPI responde en el puerto 8000</w:t>
+      </w:r>
+      <w:r>
+        <w:rPr>
+          <w:sz w:val="22"/>
+        </w:rPr>
+        <w:t xml:space="preserve"> y Angular se ejecuta en el puerto 4200.</w:t>
       </w:r>
     </w:p>
     <w:p>
@@ -5424,82 +4115,26 @@
         <w:rPr>
           <w:sz w:val="22"/>
         </w:rPr>
-        <w:t xml:space="preserve">Se implemento un sistema web funcional para Chompas Mabel con modulos de login, dashboard por rol, productos, inventario, clientes, pedidos, ventas, creditos, reportes y notificaciones.</w:t>
-      </w:r>
-      <w:proofErr w:type="spellStart"/>
-      <w:r>
-        <w:rPr>
-          <w:sz w:val="22"/>
-        </w:rPr>
-        <w:t/>
-      </w:r>
-      <w:proofErr w:type="spellEnd"/>
-      <w:r>
-        <w:rPr>
-          <w:sz w:val="22"/>
-        </w:rPr>
-        <w:t xml:space="preserve"/>
-      </w:r>
-      <w:proofErr w:type="spellStart"/>
-      <w:r>
-        <w:rPr>
-          <w:sz w:val="22"/>
-        </w:rPr>
-        <w:t/>
-      </w:r>
-      <w:proofErr w:type="spellEnd"/>
-      <w:r>
-        <w:rPr>
-          <w:sz w:val="22"/>
-        </w:rPr>
-        <w:t/>
-      </w:r>
-    </w:p>
-    <w:p>
-      <w:pPr>
-        <w:spacing w:after="155" w:line="360" w:lineRule="auto"/>
-        <w:ind w:left="0" w:right="200" w:firstLine="0"/>
-        <w:rPr>
-          <w:rFonts w:ascii="Century Gothic" w:hAnsi="Century Gothic"/>
-          <w:b/>
-          <w:color w:val="202124"/>
-          <w:sz w:val="26"/>
-          <w:szCs w:val="26"/>
-        </w:rPr>
-      </w:pPr>
-      <w:r>
-        <w:rPr>
-          <w:sz w:val="22"/>
-        </w:rPr>
-        <w:t xml:space="preserve">La arquitectura cumple con el enfoque de Ingeniería Web al separar </w:t>
-      </w:r>
-      <w:proofErr w:type="spellStart"/>
-      <w:r>
-        <w:rPr>
-          <w:sz w:val="22"/>
-        </w:rPr>
-        <w:t>frontend</w:t>
-      </w:r>
-      <w:proofErr w:type="spellEnd"/>
-      <w:r>
-        <w:rPr>
-          <w:sz w:val="22"/>
-        </w:rPr>
-        <w:t xml:space="preserve">, </w:t>
-      </w:r>
-      <w:proofErr w:type="spellStart"/>
-      <w:r>
-        <w:rPr>
-          <w:sz w:val="22"/>
-        </w:rPr>
-        <w:t>backend</w:t>
-      </w:r>
-      <w:proofErr w:type="spellEnd"/>
-      <w:r>
-        <w:rPr>
-          <w:sz w:val="22"/>
-        </w:rPr>
-        <w:t xml:space="preserve"> y persistencia, facilitando mantenimiento y crecimiento.</w:t>
+        <w:t>Se implemento un sistema web funcional para Chompas Mabel con modulos de login, dashboard por rol, productos, inventario, clientes, pedidos, ventas, creditos, reportes y notificaciones.</w:t>
+      </w:r>
+    </w:p>
+    <w:p>
+      <w:pPr>
+        <w:spacing w:after="155" w:line="360" w:lineRule="auto"/>
+        <w:ind w:left="0" w:right="200" w:firstLine="0"/>
+        <w:rPr>
+          <w:rFonts w:ascii="Century Gothic" w:hAnsi="Century Gothic"/>
+          <w:b/>
+          <w:color w:val="202124"/>
+          <w:sz w:val="26"/>
+          <w:szCs w:val="26"/>
+        </w:rPr>
+      </w:pPr>
+      <w:r>
+        <w:rPr>
+          <w:sz w:val="22"/>
+        </w:rPr>
+        <w:t>La arquitectura cumple con el enfoque de Ingeniería Web al separar frontend, backend y persistencia, facilitando mantenimiento y crecimiento.</w:t>
       </w:r>
     </w:p>
     <w:p>
@@ -5537,68 +4172,32 @@
         <w:rPr>
           <w:sz w:val="22"/>
         </w:rPr>
-        <w:t xml:space="preserve">El uso de Docker </w:t>
-      </w:r>
-      <w:proofErr w:type="spellStart"/>
-      <w:r>
-        <w:rPr>
-          <w:sz w:val="22"/>
-        </w:rPr>
-        <w:t>Compose</w:t>
-      </w:r>
-      <w:proofErr w:type="spellEnd"/>
-      <w:r>
-        <w:rPr>
-          <w:sz w:val="22"/>
-        </w:rPr>
-        <w:t xml:space="preserve"> mejora la </w:t>
-      </w:r>
-      <w:proofErr w:type="spellStart"/>
-      <w:r>
-        <w:rPr>
-          <w:sz w:val="22"/>
-        </w:rPr>
-        <w:t>reproduccion</w:t>
-      </w:r>
-      <w:proofErr w:type="spellEnd"/>
-      <w:r>
-        <w:rPr>
-          <w:sz w:val="22"/>
-        </w:rPr>
-        <w:t xml:space="preserve"> del entorno en otra computadora, ya que MySQL se crea con la base </w:t>
-      </w:r>
-      <w:proofErr w:type="spellStart"/>
-      <w:r>
-        <w:rPr>
-          <w:sz w:val="22"/>
-        </w:rPr>
-        <w:t>chompas_mabel_db</w:t>
-      </w:r>
-      <w:proofErr w:type="spellEnd"/>
-      <w:r>
-        <w:rPr>
-          <w:sz w:val="22"/>
-        </w:rPr>
-        <w:t xml:space="preserve"> y datos iniciales.</w:t>
-      </w:r>
-    </w:p>
-    <w:p>
-      <w:pPr>
-        <w:spacing w:after="155" w:line="360" w:lineRule="auto"/>
-        <w:ind w:left="0" w:right="200" w:firstLine="0"/>
-        <w:rPr>
-          <w:rFonts w:ascii="Century Gothic" w:hAnsi="Century Gothic"/>
-          <w:b/>
-          <w:color w:val="202124"/>
-          <w:sz w:val="26"/>
-          <w:szCs w:val="26"/>
-        </w:rPr>
-      </w:pPr>
-      <w:r>
-        <w:rPr>
-          <w:sz w:val="22"/>
-        </w:rPr>
-        <w:t>Las validaciones en Angular y Spring Boot reducen errores de ingreso de datos, mientras que el flujo por rol evita que el vendedor modifique secciones administrativas.</w:t>
+        <w:t>El uso de Docker Compose mejora la reproduccion del entorno en otra computadora, ya que MySQL se crea con la base chompas_mabel_db y datos iniciales.</w:t>
+      </w:r>
+    </w:p>
+    <w:p>
+      <w:pPr>
+        <w:spacing w:after="155" w:line="360" w:lineRule="auto"/>
+        <w:ind w:left="0" w:right="200" w:firstLine="0"/>
+        <w:rPr>
+          <w:rFonts w:ascii="Century Gothic" w:hAnsi="Century Gothic"/>
+          <w:b/>
+          <w:color w:val="202124"/>
+          <w:sz w:val="26"/>
+          <w:szCs w:val="26"/>
+        </w:rPr>
+      </w:pPr>
+      <w:r>
+        <w:rPr>
+          <w:sz w:val="22"/>
+        </w:rPr>
+        <w:t>Las validaciones en Angular y FastAPI</w:t>
+      </w:r>
+      <w:r>
+        <w:rPr>
+          <w:sz w:val="22"/>
+        </w:rPr>
+        <w:t xml:space="preserve"> reducen errores de ingreso de datos, mientras que el flujo por rol evita que el vendedor modifique secciones administrativas.</w:t>
       </w:r>
     </w:p>
     <w:p>
@@ -5882,49 +4481,7 @@
         <w:rPr>
           <w:sz w:val="22"/>
         </w:rPr>
-        <w:t xml:space="preserve">Implementar pruebas automatizadas unitarias e </w:t>
-      </w:r>
-      <w:proofErr w:type="spellStart"/>
-      <w:r>
-        <w:rPr>
-          <w:sz w:val="22"/>
-        </w:rPr>
-        <w:t>integracion</w:t>
-      </w:r>
-      <w:proofErr w:type="spellEnd"/>
-      <w:r>
-        <w:rPr>
-          <w:sz w:val="22"/>
-        </w:rPr>
-        <w:t xml:space="preserve"> para servicios </w:t>
-      </w:r>
-      <w:proofErr w:type="spellStart"/>
-      <w:r>
-        <w:rPr>
-          <w:sz w:val="22"/>
-        </w:rPr>
-        <w:t>backend</w:t>
-      </w:r>
-      <w:proofErr w:type="spellEnd"/>
-      <w:r>
-        <w:rPr>
-          <w:sz w:val="22"/>
-        </w:rPr>
-        <w:t xml:space="preserve"> y componentes </w:t>
-      </w:r>
-      <w:proofErr w:type="spellStart"/>
-      <w:r>
-        <w:rPr>
-          <w:sz w:val="22"/>
-        </w:rPr>
-        <w:t>frontend</w:t>
-      </w:r>
-      <w:proofErr w:type="spellEnd"/>
-      <w:r>
-        <w:rPr>
-          <w:sz w:val="22"/>
-        </w:rPr>
-        <w:t>.</w:t>
+        <w:t>Implementar pruebas automatizadas unitarias e integracion para servicios backend y componentes frontend.</w:t>
       </w:r>
     </w:p>
     <w:p>
@@ -5962,21 +4519,7 @@
         <w:rPr>
           <w:sz w:val="22"/>
         </w:rPr>
-        <w:t xml:space="preserve">Mantener actualizado el README y el script </w:t>
-      </w:r>
-      <w:proofErr w:type="spellStart"/>
-      <w:r>
-        <w:rPr>
-          <w:sz w:val="22"/>
-        </w:rPr>
-        <w:t>schema.sql</w:t>
-      </w:r>
-      <w:proofErr w:type="spellEnd"/>
-      <w:r>
-        <w:rPr>
-          <w:sz w:val="22"/>
-        </w:rPr>
-        <w:t xml:space="preserve"> para que el proyecto pueda replicarse fácilmente en otra PC.</w:t>
+        <w:t>Mantener actualizado el README y el script schema.sql para que el proyecto pueda replicarse fácilmente en otra PC.</w:t>
       </w:r>
     </w:p>
     <w:p>
@@ -6237,21 +4780,7 @@
         <w:rPr>
           <w:sz w:val="22"/>
         </w:rPr>
-        <w:t xml:space="preserve">[1] Angular, Angular </w:t>
-      </w:r>
-      <w:proofErr w:type="spellStart"/>
-      <w:r>
-        <w:rPr>
-          <w:sz w:val="22"/>
-        </w:rPr>
-        <w:t>Documentation</w:t>
-      </w:r>
-      <w:proofErr w:type="spellEnd"/>
-      <w:r>
-        <w:rPr>
-          <w:sz w:val="22"/>
-        </w:rPr>
-        <w:t xml:space="preserve">, Google, 2026. </w:t>
+        <w:t xml:space="preserve">[1] Angular, Angular Documentation, Google, 2026. </w:t>
       </w:r>
       <w:r>
         <w:rPr>
@@ -6278,13 +4807,7 @@
           <w:sz w:val="22"/>
           <w:lang w:val="en-US"/>
         </w:rPr>
-        <w:t xml:space="preserve">[2] Spring, Spring Boot Reference Documentation, Broadcom, 2026. </w:t>
-      </w:r>
-      <w:r>
-        <w:rPr>
-          <w:sz w:val="22"/>
-        </w:rPr>
-        <w:t>Disponible: https://docs.spring.io/spring-boot/</w:t>
+        <w:t>[2] FastAPI, FastAPI Documentation, 2026. Disponible: https://fastapi.tiangolo.com/</w:t>
       </w:r>
     </w:p>
     <w:p>
@@ -6649,18 +5172,24 @@
           <w:sz w:val="20"/>
           <w:lang w:val="en-US"/>
         </w:rPr>
-        <w:t xml:space="preserve">docker compose up -d </w:t>
-      </w:r>
-      <w:proofErr w:type="spellStart"/>
+        <w:t>docker compose up -d mysql</w:t>
+      </w:r>
+    </w:p>
+    <w:p>
+      <w:pPr>
+        <w:jc w:val="left"/>
+        <w:rPr>
+          <w:lang w:val="en-US"/>
+        </w:rPr>
+      </w:pPr>
       <w:r>
         <w:rPr>
           <w:rFonts w:ascii="Consolas" w:hAnsi="Consolas"/>
           <w:sz w:val="20"/>
           <w:lang w:val="en-US"/>
         </w:rPr>
-        <w:t>mysql</w:t>
-      </w:r>
-      <w:proofErr w:type="spellEnd"/>
+        <w:t>cd backend-springboot &amp;&amp; mvn spring-boot:run</w:t>
+      </w:r>
     </w:p>
     <w:p>
       <w:pPr>
@@ -6675,179 +5204,33 @@
           <w:sz w:val="20"/>
           <w:lang w:val="en-US"/>
         </w:rPr>
-        <w:t>cd backend-</w:t>
-      </w:r>
-      <w:proofErr w:type="spellStart"/>
-      <w:r>
-        <w:rPr>
-          <w:rFonts w:ascii="Consolas" w:hAnsi="Consolas"/>
-          <w:sz w:val="20"/>
+        <w:t>cd frontend-angular &amp;&amp; npm install &amp;&amp; npm start</w:t>
+      </w:r>
+    </w:p>
+    <w:p>
+      <w:pPr>
+        <w:jc w:val="left"/>
+      </w:pPr>
+      <w:r>
+        <w:rPr>
+          <w:sz w:val="22"/>
+        </w:rPr>
+        <w:t>Anexo 3. Usuarios de prueba: admin@chompasmabel.com / admin123 y vendedor@chompasmabel.com / venta123</w:t>
+      </w:r>
+    </w:p>
+    <w:p>
+      <w:pPr>
+        <w:jc w:val="left"/>
+        <w:rPr>
           <w:lang w:val="en-US"/>
         </w:rPr>
-        <w:t>springboot</w:t>
-      </w:r>
-      <w:proofErr w:type="spellEnd"/>
-      <w:r>
-        <w:rPr>
-          <w:rFonts w:ascii="Consolas" w:hAnsi="Consolas"/>
-          <w:sz w:val="20"/>
+      </w:pPr>
+      <w:r>
+        <w:rPr>
+          <w:sz w:val="22"/>
           <w:lang w:val="en-US"/>
         </w:rPr>
-        <w:t xml:space="preserve"> &amp;&amp; </w:t>
-      </w:r>
-      <w:proofErr w:type="spellStart"/>
-      <w:r>
-        <w:rPr>
-          <w:rFonts w:ascii="Consolas" w:hAnsi="Consolas"/>
-          <w:sz w:val="20"/>
-          <w:lang w:val="en-US"/>
-        </w:rPr>
-        <w:t>mvn</w:t>
-      </w:r>
-      <w:proofErr w:type="spellEnd"/>
-      <w:r>
-        <w:rPr>
-          <w:rFonts w:ascii="Consolas" w:hAnsi="Consolas"/>
-          <w:sz w:val="20"/>
-          <w:lang w:val="en-US"/>
-        </w:rPr>
-        <w:t xml:space="preserve"> </w:t>
-      </w:r>
-      <w:proofErr w:type="spellStart"/>
-      <w:r>
-        <w:rPr>
-          <w:rFonts w:ascii="Consolas" w:hAnsi="Consolas"/>
-          <w:sz w:val="20"/>
-          <w:lang w:val="en-US"/>
-        </w:rPr>
-        <w:t>spring-boot:run</w:t>
-      </w:r>
-      <w:proofErr w:type="spellEnd"/>
-    </w:p>
-    <w:p>
-      <w:pPr>
-        <w:jc w:val="left"/>
-        <w:rPr>
-          <w:lang w:val="en-US"/>
-        </w:rPr>
-      </w:pPr>
-      <w:r>
-        <w:rPr>
-          <w:rFonts w:ascii="Consolas" w:hAnsi="Consolas"/>
-          <w:sz w:val="20"/>
-          <w:lang w:val="en-US"/>
-        </w:rPr>
-        <w:t xml:space="preserve">cd frontend-angular &amp;&amp; </w:t>
-      </w:r>
-      <w:proofErr w:type="spellStart"/>
-      <w:r>
-        <w:rPr>
-          <w:rFonts w:ascii="Consolas" w:hAnsi="Consolas"/>
-          <w:sz w:val="20"/>
-          <w:lang w:val="en-US"/>
-        </w:rPr>
-        <w:t>npm</w:t>
-      </w:r>
-      <w:proofErr w:type="spellEnd"/>
-      <w:r>
-        <w:rPr>
-          <w:rFonts w:ascii="Consolas" w:hAnsi="Consolas"/>
-          <w:sz w:val="20"/>
-          <w:lang w:val="en-US"/>
-        </w:rPr>
-        <w:t xml:space="preserve"> install &amp;&amp; </w:t>
-      </w:r>
-      <w:proofErr w:type="spellStart"/>
-      <w:r>
-        <w:rPr>
-          <w:rFonts w:ascii="Consolas" w:hAnsi="Consolas"/>
-          <w:sz w:val="20"/>
-          <w:lang w:val="en-US"/>
-        </w:rPr>
-        <w:t>npm</w:t>
-      </w:r>
-      <w:proofErr w:type="spellEnd"/>
-      <w:r>
-        <w:rPr>
-          <w:rFonts w:ascii="Consolas" w:hAnsi="Consolas"/>
-          <w:sz w:val="20"/>
-          <w:lang w:val="en-US"/>
-        </w:rPr>
-        <w:t xml:space="preserve"> start</w:t>
-      </w:r>
-    </w:p>
-    <w:p>
-      <w:pPr>
-        <w:jc w:val="left"/>
-      </w:pPr>
-      <w:r>
-        <w:rPr>
-          <w:sz w:val="22"/>
-        </w:rPr>
-        <w:t>Anexo 3. Usuarios de prueba: admin@chompasmabel.com / admin123 y vendedor@chompasmabel.com / venta123</w:t>
-      </w:r>
-    </w:p>
-    <w:p>
-      <w:pPr>
-        <w:jc w:val="left"/>
-        <w:rPr>
-          <w:lang w:val="en-US"/>
-        </w:rPr>
-      </w:pPr>
-      <w:r>
-        <w:rPr>
-          <w:sz w:val="22"/>
-          <w:lang w:val="en-US"/>
-        </w:rPr>
-        <w:t xml:space="preserve">Anexo 4. Estructura principal actualizada: frontend-angular con core, services, models, guard de roles y features incluyendo creditos; backend-springboot con controller, service, repository, model, dto y config; database/schema.sql; docs/requerimientos_usuario.md; docker-compose.yml; README.md principal; README por modulo; docs/entregables e imagenes.</w:t>
-      </w:r>
-      <w:proofErr w:type="spellStart"/>
-      <w:r>
-        <w:rPr>
-          <w:sz w:val="22"/>
-          <w:lang w:val="en-US"/>
-        </w:rPr>
-        <w:t/>
-      </w:r>
-      <w:proofErr w:type="spellEnd"/>
-      <w:r>
-        <w:rPr>
-          <w:sz w:val="22"/>
-          <w:lang w:val="en-US"/>
-        </w:rPr>
-        <w:t xml:space="preserve"/>
-      </w:r>
-      <w:proofErr w:type="spellStart"/>
-      <w:r>
-        <w:rPr>
-          <w:sz w:val="22"/>
-          <w:lang w:val="en-US"/>
-        </w:rPr>
-        <w:t/>
-      </w:r>
-      <w:proofErr w:type="spellEnd"/>
-      <w:r>
-        <w:rPr>
-          <w:sz w:val="22"/>
-          <w:lang w:val="en-US"/>
-        </w:rPr>
-        <w:t/>
-      </w:r>
-      <w:proofErr w:type="spellStart"/>
-      <w:r>
-        <w:rPr>
-          <w:sz w:val="22"/>
-          <w:lang w:val="en-US"/>
-        </w:rPr>
-        <w:t/>
-      </w:r>
-      <w:proofErr w:type="spellEnd"/>
-      <w:r>
-        <w:rPr>
-          <w:sz w:val="22"/>
-          <w:lang w:val="en-US"/>
-        </w:rPr>
-        <w:t xml:space="preserve"/>
+        <w:t>Anexo 4. Estructura principal actualizada: frontend-angular con core, services, models, guard de roles y features incluyendo creditos; backend-springboot con controller, service, repository, model, dto y config; database/schema.sql; docs/requerimientos_usuario.md; docker-compose.yml; README.md principal; README por modulo; docs/entregables e imagenes.</w:t>
       </w:r>
     </w:p>
     <w:p>
@@ -6877,6 +5260,81 @@
           <w:lang w:val="en-US"/>
         </w:rPr>
       </w:pPr>
+    </w:p>
+    <w:p>
+      <w:r>
+        <w:br w:type="page"/>
+      </w:r>
+    </w:p>
+    <w:p>
+      <w:r>
+        <w:rPr>
+          <w:b/>
+        </w:rPr>
+        <w:t>Actualizacion final segun rubrica de evaluacion</w:t>
+      </w:r>
+    </w:p>
+    <w:p>
+      <w:r>
+        <w:t>El proyecto se actualizo para cubrir los criterios principales de la rubrica: frontend funcional en Angular 21, backend REST con FastAPI, base de datos MySQL normalizada con procedimientos almacenados, integracion completa y documentacion para sustentacion.</w:t>
+      </w:r>
+    </w:p>
+    <w:p>
+      <w:r>
+        <w:t>Frontend actualizado: se mantienen componentes standalone, servicios con HttpClient, signals, validaciones, rutas protegidas por rol y diseno responsive. El administrador cuenta con gestion de productos, inventario, ventas, creditos y reportes. El vendedor cuenta con catalogo visual para atencion al cliente, pedidos, clientes, ventas y creditos.</w:t>
+      </w:r>
+    </w:p>
+    <w:p>
+      <w:r>
+        <w:t>Se corrigieron rutas duplicadas: /productos conserva el componente de catalogo y mantenimiento; /inventario usa un componente dedicado para movimientos de inventario; /pedidos registra pedidos; /ventas muestra historial de ventas cerradas.</w:t>
+      </w:r>
+    </w:p>
+    <w:p>
+      <w:r>
+        <w:t>Se implemento busqueda global en el topbar para filtrar en tiempo real productos, pedidos, clientes, creditos, ventas e inventario segun la vista activa.</w:t>
+      </w:r>
+    </w:p>
+    <w:p>
+      <w:r>
+        <w:t xml:space="preserve">Backend actualizado: se agrego backend-fastapi como API principal para la rubrica, disponible en http://localhost:8000/api. Expone autenticacion, productos, clientes, pedidos, creditos, ventas, inventario y resumen de reportes. El </w:t>
+      </w:r>
+      <w:r>
+        <w:t>Backend FastAPI</w:t>
+      </w:r>
+      <w:r>
+        <w:t xml:space="preserve"> queda como implementacion alternativa y compatible en http://localhost:8080/api.</w:t>
+      </w:r>
+    </w:p>
+    <w:p>
+      <w:r>
+        <w:t>Base de datos actualizada: database/schema.sql crea tablas, relaciones, restricciones, datos iniciales y procedimientos almacenados. Los procedimientos incluidos son sp_listar_productos, sp_listar_clientes, sp_listar_pedidos, sp_listar_detalles_pedido, sp_listar_ventas, sp_listar_movimientos_inventario y sp_resumen_reportes.</w:t>
+      </w:r>
+    </w:p>
+    <w:p>
+      <w:r>
+        <w:t>Creditos y cuentas por cobrar: los pedidos a credito registran monto pagado, saldo pendiente, fecha de vencimiento y estado del credito. El sistema permite detectar creditos vencidos, mostrar notificaciones y marcar creditos como pagados.</w:t>
+      </w:r>
+    </w:p>
+    <w:p>
+      <w:r>
+        <w:t xml:space="preserve">Docker y replicacion: </w:t>
+      </w:r>
+      <w:r>
+        <w:t>docker-compose.yml levanta MySQL, FastAPI y conserva Spring Boot como backend alternativo.</w:t>
+      </w:r>
+      <w:r>
+        <w:t xml:space="preserve"> La guia docs/replicar_base_datos.md explica como importar la base con Docker, MySQL Workbench, XAMPP/phpMyAdmin o consola MySQL.</w:t>
+      </w:r>
+    </w:p>
+    <w:p>
+      <w:r>
+        <w:t>Seguridad y sesion: el interceptor HTTP agrega el token demo y, si recibe una respuesta 401, limpia localStorage y redirige automaticamente al login.</w:t>
+      </w:r>
+    </w:p>
+    <w:p>
+      <w:r>
+        <w:t>Con esta actualizacion el proyecto queda alineado con la rubrica: Angular 21 en el frontend, FastAPI como backend principal, MySQL con procedimientos almacenados e integracion documentada para exposicion.</w:t>
+      </w:r>
     </w:p>
     <w:sectPr>
       <w:headerReference w:type="default" r:id="rId19"/>
@@ -6886,77 +5344,11 @@
       <w:titlePg/>
       <w:docGrid w:linePitch="326"/>
     </w:sectPr>
-    <w:p>
-      <w:r>
-        <w:br w:type="page"/>
-      </w:r>
-    </w:p>
-    <w:p>
-      <w:pPr>
-        <w:pStyle w:val="Heading1"/>
-      </w:pPr>
-      <w:r>
-        <w:rPr>
-          <w:b/>
-        </w:rPr>
-        <w:t xml:space="preserve">Actualizacion final segun rubrica de evaluacion</w:t>
-      </w:r>
-    </w:p>
-    <w:p>
-      <w:r>
-        <w:t xml:space="preserve">El proyecto se actualizo para cubrir los criterios principales de la rubrica: frontend funcional en Angular 21, backend REST con FastAPI, base de datos MySQL normalizada con procedimientos almacenados, integracion completa y documentacion para sustentacion.</w:t>
-      </w:r>
-    </w:p>
-    <w:p>
-      <w:r>
-        <w:t xml:space="preserve">Frontend actualizado: se mantienen componentes standalone, servicios con HttpClient, signals, validaciones, rutas protegidas por rol y diseno responsive. El administrador cuenta con gestion de productos, inventario, ventas, creditos y reportes. El vendedor cuenta con catalogo visual para atencion al cliente, pedidos, clientes, ventas y creditos.</w:t>
-      </w:r>
-    </w:p>
-    <w:p>
-      <w:r>
-        <w:t xml:space="preserve">Se corrigieron rutas duplicadas: /productos conserva el componente de catalogo y mantenimiento; /inventario usa un componente dedicado para movimientos de inventario; /pedidos registra pedidos; /ventas muestra historial de ventas cerradas.</w:t>
-      </w:r>
-    </w:p>
-    <w:p>
-      <w:r>
-        <w:t xml:space="preserve">Se implemento busqueda global en el topbar para filtrar en tiempo real productos, pedidos, clientes, creditos, ventas e inventario segun la vista activa.</w:t>
-      </w:r>
-    </w:p>
-    <w:p>
-      <w:r>
-        <w:t xml:space="preserve">Backend actualizado: se agrego backend-fastapi como API principal para la rubrica, disponible en http://localhost:8000/api. Expone autenticacion, productos, clientes, pedidos, creditos, ventas, inventario y resumen de reportes. El backend Spring Boot queda como implementacion alternativa y compatible en http://localhost:8080/api.</w:t>
-      </w:r>
-    </w:p>
-    <w:p>
-      <w:r>
-        <w:t xml:space="preserve">Base de datos actualizada: database/schema.sql crea tablas, relaciones, restricciones, datos iniciales y procedimientos almacenados. Los procedimientos incluidos son sp_listar_productos, sp_listar_clientes, sp_listar_pedidos, sp_listar_detalles_pedido, sp_listar_ventas, sp_listar_movimientos_inventario y sp_resumen_reportes.</w:t>
-      </w:r>
-    </w:p>
-    <w:p>
-      <w:r>
-        <w:t xml:space="preserve">Creditos y cuentas por cobrar: los pedidos a credito registran monto pagado, saldo pendiente, fecha de vencimiento y estado del credito. El sistema permite detectar creditos vencidos, mostrar notificaciones y marcar creditos como pagados.</w:t>
-      </w:r>
-    </w:p>
-    <w:p>
-      <w:r>
-        <w:t xml:space="preserve">Docker y replicacion: docker-compose.yml levanta MySQL, FastAPI y Spring Boot. La guia docs/replicar_base_datos.md explica como importar la base con Docker, MySQL Workbench, XAMPP/phpMyAdmin o consola MySQL.</w:t>
-      </w:r>
-    </w:p>
-    <w:p>
-      <w:r>
-        <w:t xml:space="preserve">Seguridad y sesion: el interceptor HTTP agrega el token demo y, si recibe una respuesta 401, limpia localStorage y redirige automaticamente al login.</w:t>
-      </w:r>
-    </w:p>
-    <w:p>
-      <w:r>
-        <w:t xml:space="preserve">Con esta actualizacion el proyecto queda alineado con la rubrica: Angular 21 en el frontend, FastAPI como backend principal, MySQL con procedimientos almacenados e integracion documentada para exposicion.</w:t>
-      </w:r>
-    </w:p>
   </w:body>
 </w:document>
 </file>
 
-<file path=word\endnotes.xml><?xml version="1.0" encoding="utf-8"?>
+<file path=word/endnotes.xml><?xml version="1.0" encoding="utf-8"?>
 <w:endnotes xmlns:wpc="http://schemas.microsoft.com/office/word/2010/wordprocessingCanvas" xmlns:cx="http://schemas.microsoft.com/office/drawing/2014/chartex" xmlns:cx1="http://schemas.microsoft.com/office/drawing/2015/9/8/chartex" xmlns:cx2="http://schemas.microsoft.com/office/drawing/2015/10/21/chartex" xmlns:cx3="http://schemas.microsoft.com/office/drawing/2016/5/9/chartex" xmlns:cx4="http://schemas.microsoft.com/office/drawing/2016/5/10/chartex" xmlns:cx5="http://schemas.microsoft.com/office/drawing/2016/5/11/chartex" xmlns:cx6="http://schemas.microsoft.com/office/drawing/2016/5/12/chartex" xmlns:cx7="http://schemas.microsoft.com/office/drawing/2016/5/13/chartex" xmlns:cx8="http://schemas.microsoft.com/office/drawing/2016/5/14/chartex" xmlns:mc="http://schemas.openxmlformats.org/markup-compatibility/2006" xmlns:aink="http://schemas.microsoft.com/office/drawing/2016/ink" xmlns:am3d="http://schemas.microsoft.com/office/drawing/2017/model3d" xmlns:o="urn:schemas-microsoft-com:office:office" xmlns:oel="http://schemas.microsoft.com/office/2019/extlst" xmlns:r="http://schemas.openxmlformats.org/officeDocument/2006/relationships" xmlns:m="http://schemas.openxmlformats.org/officeDocument/2006/math" xmlns:v="urn:schemas-microsoft-com:vml" xmlns:wp14="http://schemas.microsoft.com/office/word/2010/wordprocessingDrawing" xmlns:wp="http://schemas.openxmlformats.org/drawingml/2006/wordprocessingDrawing" xmlns:w10="urn:schemas-microsoft-com:office:word" xmlns:w="http://schemas.openxmlformats.org/wordprocessingml/2006/main" xmlns:w14="http://schemas.microsoft.com/office/word/2010/wordml" xmlns:w15="http://schemas.microsoft.com/office/word/2012/wordml" xmlns:w16cex="http://schemas.microsoft.com/office/word/2018/wordml/cex" xmlns:w16cid="http://schemas.microsoft.com/office/word/2016/wordml/cid" xmlns:w16="http://schemas.microsoft.com/office/word/2018/wordml" xmlns:w16du="http://schemas.microsoft.com/office/word/2023/wordml/word16du" xmlns:w16sdtdh="http://schemas.microsoft.com/office/word/2020/wordml/sdtdatahash" xmlns:w16sdtfl="http://schemas.microsoft.com/office/word/2024/wordml/sdtformatlock" xmlns:w16se="http://schemas.microsoft.com/office/word/2015/wordml/symex" xmlns:wpg="http://schemas.microsoft.com/office/word/2010/wordprocessingGroup" xmlns:wpi="http://schemas.microsoft.com/office/word/2010/wordprocessingInk" xmlns:wne="http://schemas.microsoft.com/office/word/2006/wordml" xmlns:wps="http://schemas.microsoft.com/office/word/2010/wordprocessingShape" mc:Ignorable="w14 w15 w16se w16cid w16 w16cex w16sdtdh w16sdtfl w16du wp14">
   <w:endnote w:type="separator" w:id="-1">
     <w:p>
@@ -6981,82 +5373,7 @@
 </w:endnotes>
 </file>
 
-<file path=word\fontTable.xml><?xml version="1.0" encoding="utf-8"?>
-<w:fonts xmlns:mc="http://schemas.openxmlformats.org/markup-compatibility/2006" xmlns:r="http://schemas.openxmlformats.org/officeDocument/2006/relationships" xmlns:w="http://schemas.openxmlformats.org/wordprocessingml/2006/main" xmlns:w14="http://schemas.microsoft.com/office/word/2010/wordml" xmlns:w15="http://schemas.microsoft.com/office/word/2012/wordml" xmlns:w16cex="http://schemas.microsoft.com/office/word/2018/wordml/cex" xmlns:w16cid="http://schemas.microsoft.com/office/word/2016/wordml/cid" xmlns:w16="http://schemas.microsoft.com/office/word/2018/wordml" xmlns:w16du="http://schemas.microsoft.com/office/word/2023/wordml/word16du" xmlns:w16sdtdh="http://schemas.microsoft.com/office/word/2020/wordml/sdtdatahash" xmlns:w16sdtfl="http://schemas.microsoft.com/office/word/2024/wordml/sdtformatlock" xmlns:w16se="http://schemas.microsoft.com/office/word/2015/wordml/symex" mc:Ignorable="w14 w15 w16se w16cid w16 w16cex w16sdtdh w16sdtfl w16du">
-  <w:font w:name="Symbol">
-    <w:panose1 w:val="05050102010706020507"/>
-    <w:charset w:val="02"/>
-    <w:family w:val="roman"/>
-    <w:pitch w:val="variable"/>
-    <w:sig w:usb0="00000000" w:usb1="10000000" w:usb2="00000000" w:usb3="00000000" w:csb0="80000000" w:csb1="00000000"/>
-  </w:font>
-  <w:font w:name="Times New Roman">
-    <w:panose1 w:val="02020603050405020304"/>
-    <w:charset w:val="00"/>
-    <w:family w:val="roman"/>
-    <w:pitch w:val="variable"/>
-    <w:sig w:usb0="E0002EFF" w:usb1="C000785B" w:usb2="00000009" w:usb3="00000000" w:csb0="000001FF" w:csb1="00000000"/>
-  </w:font>
-  <w:font w:name="Courier New">
-    <w:panose1 w:val="02070309020205020404"/>
-    <w:charset w:val="00"/>
-    <w:family w:val="modern"/>
-    <w:pitch w:val="fixed"/>
-    <w:sig w:usb0="E0002EFF" w:usb1="C0007843" w:usb2="00000009" w:usb3="00000000" w:csb0="000001FF" w:csb1="00000000"/>
-  </w:font>
-  <w:font w:name="Wingdings">
-    <w:panose1 w:val="05000000000000000000"/>
-    <w:charset w:val="02"/>
-    <w:family w:val="auto"/>
-    <w:pitch w:val="variable"/>
-    <w:sig w:usb0="00000000" w:usb1="10000000" w:usb2="00000000" w:usb3="00000000" w:csb0="80000000" w:csb1="00000000"/>
-  </w:font>
-  <w:font w:name="Arial">
-    <w:panose1 w:val="020B0604020202020204"/>
-    <w:charset w:val="00"/>
-    <w:family w:val="swiss"/>
-    <w:pitch w:val="variable"/>
-    <w:sig w:usb0="E0002EFF" w:usb1="C000785B" w:usb2="00000009" w:usb3="00000000" w:csb0="000001FF" w:csb1="00000000"/>
-  </w:font>
-  <w:font w:name="Segoe UI Symbol">
-    <w:panose1 w:val="020B0502040204020203"/>
-    <w:charset w:val="00"/>
-    <w:family w:val="swiss"/>
-    <w:pitch w:val="variable"/>
-    <w:sig w:usb0="800001E3" w:usb1="1200FFEF" w:usb2="00040000" w:usb3="00000000" w:csb0="00000001" w:csb1="00000000"/>
-  </w:font>
-  <w:font w:name="Calibri">
-    <w:panose1 w:val="020F0502020204030204"/>
-    <w:charset w:val="00"/>
-    <w:family w:val="swiss"/>
-    <w:pitch w:val="variable"/>
-    <w:sig w:usb0="E4002EFF" w:usb1="C000247B" w:usb2="00000009" w:usb3="00000000" w:csb0="000001FF" w:csb1="00000000"/>
-  </w:font>
-  <w:font w:name="Calibri Light">
-    <w:panose1 w:val="020F0302020204030204"/>
-    <w:charset w:val="00"/>
-    <w:family w:val="swiss"/>
-    <w:pitch w:val="variable"/>
-    <w:sig w:usb0="E4002EFF" w:usb1="C000247B" w:usb2="00000009" w:usb3="00000000" w:csb0="000001FF" w:csb1="00000000"/>
-  </w:font>
-  <w:font w:name="Century Gothic">
-    <w:panose1 w:val="020B0502020202020204"/>
-    <w:charset w:val="00"/>
-    <w:family w:val="swiss"/>
-    <w:pitch w:val="variable"/>
-    <w:sig w:usb0="00000287" w:usb1="00000000" w:usb2="00000000" w:usb3="00000000" w:csb0="0000009F" w:csb1="00000000"/>
-  </w:font>
-  <w:font w:name="Consolas">
-    <w:panose1 w:val="020B0609020204030204"/>
-    <w:charset w:val="00"/>
-    <w:family w:val="modern"/>
-    <w:pitch w:val="fixed"/>
-    <w:sig w:usb0="E00006FF" w:usb1="0000FCFF" w:usb2="00000001" w:usb3="00000000" w:csb0="0000019F" w:csb1="00000000"/>
-  </w:font>
-</w:fonts>
-</file>
-
-<file path=word\footnotes.xml><?xml version="1.0" encoding="utf-8"?>
+<file path=word/footnotes.xml><?xml version="1.0" encoding="utf-8"?>
 <w:footnotes xmlns:wpc="http://schemas.microsoft.com/office/word/2010/wordprocessingCanvas" xmlns:cx="http://schemas.microsoft.com/office/drawing/2014/chartex" xmlns:cx1="http://schemas.microsoft.com/office/drawing/2015/9/8/chartex" xmlns:cx2="http://schemas.microsoft.com/office/drawing/2015/10/21/chartex" xmlns:cx3="http://schemas.microsoft.com/office/drawing/2016/5/9/chartex" xmlns:cx4="http://schemas.microsoft.com/office/drawing/2016/5/10/chartex" xmlns:cx5="http://schemas.microsoft.com/office/drawing/2016/5/11/chartex" xmlns:cx6="http://schemas.microsoft.com/office/drawing/2016/5/12/chartex" xmlns:cx7="http://schemas.microsoft.com/office/drawing/2016/5/13/chartex" xmlns:cx8="http://schemas.microsoft.com/office/drawing/2016/5/14/chartex" xmlns:mc="http://schemas.openxmlformats.org/markup-compatibility/2006" xmlns:aink="http://schemas.microsoft.com/office/drawing/2016/ink" xmlns:am3d="http://schemas.microsoft.com/office/drawing/2017/model3d" xmlns:o="urn:schemas-microsoft-com:office:office" xmlns:oel="http://schemas.microsoft.com/office/2019/extlst" xmlns:r="http://schemas.openxmlformats.org/officeDocument/2006/relationships" xmlns:m="http://schemas.openxmlformats.org/officeDocument/2006/math" xmlns:v="urn:schemas-microsoft-com:vml" xmlns:wp14="http://schemas.microsoft.com/office/word/2010/wordprocessingDrawing" xmlns:wp="http://schemas.openxmlformats.org/drawingml/2006/wordprocessingDrawing" xmlns:w10="urn:schemas-microsoft-com:office:word" xmlns:w="http://schemas.openxmlformats.org/wordprocessingml/2006/main" xmlns:w14="http://schemas.microsoft.com/office/word/2010/wordml" xmlns:w15="http://schemas.microsoft.com/office/word/2012/wordml" xmlns:w16cex="http://schemas.microsoft.com/office/word/2018/wordml/cex" xmlns:w16cid="http://schemas.microsoft.com/office/word/2016/wordml/cid" xmlns:w16="http://schemas.microsoft.com/office/word/2018/wordml" xmlns:w16du="http://schemas.microsoft.com/office/word/2023/wordml/word16du" xmlns:w16sdtdh="http://schemas.microsoft.com/office/word/2020/wordml/sdtdatahash" xmlns:w16sdtfl="http://schemas.microsoft.com/office/word/2024/wordml/sdtformatlock" xmlns:w16se="http://schemas.microsoft.com/office/word/2015/wordml/symex" xmlns:wpg="http://schemas.microsoft.com/office/word/2010/wordprocessingGroup" xmlns:wpi="http://schemas.microsoft.com/office/word/2010/wordprocessingInk" xmlns:wne="http://schemas.microsoft.com/office/word/2006/wordml" xmlns:wps="http://schemas.microsoft.com/office/word/2010/wordprocessingShape" mc:Ignorable="w14 w15 w16se w16cid w16 w16cex w16sdtdh w16sdtfl w16du wp14">
   <w:footnote w:type="separator" w:id="-1">
     <w:p>
@@ -7081,7 +5398,7 @@
 </w:footnotes>
 </file>
 
-<file path=word\header1.xml><?xml version="1.0" encoding="utf-8"?>
+<file path=word/header1.xml><?xml version="1.0" encoding="utf-8"?>
 <w:hdr xmlns:wpc="http://schemas.microsoft.com/office/word/2010/wordprocessingCanvas" xmlns:cx="http://schemas.microsoft.com/office/drawing/2014/chartex" xmlns:cx1="http://schemas.microsoft.com/office/drawing/2015/9/8/chartex" xmlns:cx2="http://schemas.microsoft.com/office/drawing/2015/10/21/chartex" xmlns:cx3="http://schemas.microsoft.com/office/drawing/2016/5/9/chartex" xmlns:cx4="http://schemas.microsoft.com/office/drawing/2016/5/10/chartex" xmlns:cx5="http://schemas.microsoft.com/office/drawing/2016/5/11/chartex" xmlns:cx6="http://schemas.microsoft.com/office/drawing/2016/5/12/chartex" xmlns:cx7="http://schemas.microsoft.com/office/drawing/2016/5/13/chartex" xmlns:cx8="http://schemas.microsoft.com/office/drawing/2016/5/14/chartex" xmlns:mc="http://schemas.openxmlformats.org/markup-compatibility/2006" xmlns:aink="http://schemas.microsoft.com/office/drawing/2016/ink" xmlns:am3d="http://schemas.microsoft.com/office/drawing/2017/model3d" xmlns:o="urn:schemas-microsoft-com:office:office" xmlns:oel="http://schemas.microsoft.com/office/2019/extlst" xmlns:r="http://schemas.openxmlformats.org/officeDocument/2006/relationships" xmlns:m="http://schemas.openxmlformats.org/officeDocument/2006/math" xmlns:v="urn:schemas-microsoft-com:vml" xmlns:wp14="http://schemas.microsoft.com/office/word/2010/wordprocessingDrawing" xmlns:wp="http://schemas.openxmlformats.org/drawingml/2006/wordprocessingDrawing" xmlns:w10="urn:schemas-microsoft-com:office:word" xmlns:w="http://schemas.openxmlformats.org/wordprocessingml/2006/main" xmlns:w14="http://schemas.microsoft.com/office/word/2010/wordml" xmlns:w15="http://schemas.microsoft.com/office/word/2012/wordml" xmlns:w16cex="http://schemas.microsoft.com/office/word/2018/wordml/cex" xmlns:w16cid="http://schemas.microsoft.com/office/word/2016/wordml/cid" xmlns:w16="http://schemas.microsoft.com/office/word/2018/wordml" xmlns:w16du="http://schemas.microsoft.com/office/word/2023/wordml/word16du" xmlns:w16sdtdh="http://schemas.microsoft.com/office/word/2020/wordml/sdtdatahash" xmlns:w16sdtfl="http://schemas.microsoft.com/office/word/2024/wordml/sdtformatlock" xmlns:w16se="http://schemas.microsoft.com/office/word/2015/wordml/symex" xmlns:wpg="http://schemas.microsoft.com/office/word/2010/wordprocessingGroup" xmlns:wpi="http://schemas.microsoft.com/office/word/2010/wordprocessingInk" xmlns:wne="http://schemas.microsoft.com/office/word/2006/wordml" xmlns:wps="http://schemas.microsoft.com/office/word/2010/wordprocessingShape" mc:Ignorable="w14 w15 w16se w16cid w16 w16cex w16sdtdh w16sdtfl w16du wp14">
   <w:p>
     <w:pPr>
@@ -7164,7 +5481,7 @@
 </w:hdr>
 </file>
 
-<file path=word\numbering.xml><?xml version="1.0" encoding="utf-8"?>
+<file path=word/numbering.xml><?xml version="1.0" encoding="utf-8"?>
 <w:numbering xmlns:wpc="http://schemas.microsoft.com/office/word/2010/wordprocessingCanvas" xmlns:cx="http://schemas.microsoft.com/office/drawing/2014/chartex" xmlns:cx1="http://schemas.microsoft.com/office/drawing/2015/9/8/chartex" xmlns:cx2="http://schemas.microsoft.com/office/drawing/2015/10/21/chartex" xmlns:cx3="http://schemas.microsoft.com/office/drawing/2016/5/9/chartex" xmlns:cx4="http://schemas.microsoft.com/office/drawing/2016/5/10/chartex" xmlns:cx5="http://schemas.microsoft.com/office/drawing/2016/5/11/chartex" xmlns:cx6="http://schemas.microsoft.com/office/drawing/2016/5/12/chartex" xmlns:cx7="http://schemas.microsoft.com/office/drawing/2016/5/13/chartex" xmlns:cx8="http://schemas.microsoft.com/office/drawing/2016/5/14/chartex" xmlns:mc="http://schemas.openxmlformats.org/markup-compatibility/2006" xmlns:aink="http://schemas.microsoft.com/office/drawing/2016/ink" xmlns:am3d="http://schemas.microsoft.com/office/drawing/2017/model3d" xmlns:o="urn:schemas-microsoft-com:office:office" xmlns:oel="http://schemas.microsoft.com/office/2019/extlst" xmlns:r="http://schemas.openxmlformats.org/officeDocument/2006/relationships" xmlns:m="http://schemas.openxmlformats.org/officeDocument/2006/math" xmlns:v="urn:schemas-microsoft-com:vml" xmlns:wp14="http://schemas.microsoft.com/office/word/2010/wordprocessingDrawing" xmlns:wp="http://schemas.openxmlformats.org/drawingml/2006/wordprocessingDrawing" xmlns:w10="urn:schemas-microsoft-com:office:word" xmlns:w="http://schemas.openxmlformats.org/wordprocessingml/2006/main" xmlns:w14="http://schemas.microsoft.com/office/word/2010/wordml" xmlns:w15="http://schemas.microsoft.com/office/word/2012/wordml" xmlns:w16cex="http://schemas.microsoft.com/office/word/2018/wordml/cex" xmlns:w16cid="http://schemas.microsoft.com/office/word/2016/wordml/cid" xmlns:w16="http://schemas.microsoft.com/office/word/2018/wordml" xmlns:w16du="http://schemas.microsoft.com/office/word/2023/wordml/word16du" xmlns:w16sdtdh="http://schemas.microsoft.com/office/word/2020/wordml/sdtdatahash" xmlns:w16sdtfl="http://schemas.microsoft.com/office/word/2024/wordml/sdtformatlock" xmlns:w16se="http://schemas.microsoft.com/office/word/2015/wordml/symex" xmlns:wpg="http://schemas.microsoft.com/office/word/2010/wordprocessingGroup" xmlns:wpi="http://schemas.microsoft.com/office/word/2010/wordprocessingInk" xmlns:wne="http://schemas.microsoft.com/office/word/2006/wordml" xmlns:wps="http://schemas.microsoft.com/office/word/2010/wordprocessingShape" mc:Ignorable="w14 w15 w16se w16cid w16 w16cex w16sdtdh w16sdtfl w16du wp14">
   <w:abstractNum w:abstractNumId="0" w15:restartNumberingAfterBreak="0">
     <w:nsid w:val="0839351E"/>
@@ -10560,116 +8877,7 @@
 </w:numbering>
 </file>
 
-<file path=word\settings.xml><?xml version="1.0" encoding="utf-8"?>
-<w:settings xmlns:mc="http://schemas.openxmlformats.org/markup-compatibility/2006" xmlns:o="urn:schemas-microsoft-com:office:office" xmlns:r="http://schemas.openxmlformats.org/officeDocument/2006/relationships" xmlns:m="http://schemas.openxmlformats.org/officeDocument/2006/math" xmlns:v="urn:schemas-microsoft-com:vml" xmlns:w10="urn:schemas-microsoft-com:office:word" xmlns:w="http://schemas.openxmlformats.org/wordprocessingml/2006/main" xmlns:w14="http://schemas.microsoft.com/office/word/2010/wordml" xmlns:w15="http://schemas.microsoft.com/office/word/2012/wordml" xmlns:w16cex="http://schemas.microsoft.com/office/word/2018/wordml/cex" xmlns:w16cid="http://schemas.microsoft.com/office/word/2016/wordml/cid" xmlns:w16="http://schemas.microsoft.com/office/word/2018/wordml" xmlns:w16du="http://schemas.microsoft.com/office/word/2023/wordml/word16du" xmlns:w16sdtdh="http://schemas.microsoft.com/office/word/2020/wordml/sdtdatahash" xmlns:w16sdtfl="http://schemas.microsoft.com/office/word/2024/wordml/sdtformatlock" xmlns:w16se="http://schemas.microsoft.com/office/word/2015/wordml/symex" xmlns:sl="http://schemas.openxmlformats.org/schemaLibrary/2006/main" mc:Ignorable="w14 w15 w16se w16cid w16 w16cex w16sdtdh w16sdtfl w16du">
-  <w:zoom w:percent="100"/>
-  <w:proofState w:spelling="clean"/>
-  <w:defaultTabStop w:val="708"/>
-  <w:hyphenationZone w:val="425"/>
-  <w:characterSpacingControl w:val="doNotCompress"/>
-  <w:hdrShapeDefaults>
-    <o:shapedefaults v:ext="edit" spidmax="2050"/>
-  </w:hdrShapeDefaults>
-  <w:footnotePr>
-    <w:footnote w:id="-1"/>
-    <w:footnote w:id="0"/>
-  </w:footnotePr>
-  <w:endnotePr>
-    <w:endnote w:id="-1"/>
-    <w:endnote w:id="0"/>
-  </w:endnotePr>
-  <w:compat>
-    <w:useFELayout/>
-    <w:compatSetting w:name="compatibilityMode" w:uri="http://schemas.microsoft.com/office/word" w:val="15"/>
-    <w:compatSetting w:name="overrideTableStyleFontSizeAndJustification" w:uri="http://schemas.microsoft.com/office/word" w:val="1"/>
-    <w:compatSetting w:name="enableOpenTypeFeatures" w:uri="http://schemas.microsoft.com/office/word" w:val="1"/>
-    <w:compatSetting w:name="doNotFlipMirrorIndents" w:uri="http://schemas.microsoft.com/office/word" w:val="1"/>
-    <w:compatSetting w:name="differentiateMultirowTableHeaders" w:uri="http://schemas.microsoft.com/office/word" w:val="1"/>
-    <w:compatSetting w:name="useWord2013TrackBottomHyphenation" w:uri="http://schemas.microsoft.com/office/word" w:val="1"/>
-  </w:compat>
-  <w:rsids>
-    <w:rsidRoot w:val="00BD394D"/>
-    <w:rsid w:val="0007581C"/>
-    <w:rsid w:val="00082FDA"/>
-    <w:rsid w:val="000970E1"/>
-    <w:rsid w:val="000C1459"/>
-    <w:rsid w:val="001278B3"/>
-    <w:rsid w:val="001679F1"/>
-    <w:rsid w:val="00194FA9"/>
-    <w:rsid w:val="00265EF4"/>
-    <w:rsid w:val="002D1BC9"/>
-    <w:rsid w:val="002E31CD"/>
-    <w:rsid w:val="0042229C"/>
-    <w:rsid w:val="004A0E1C"/>
-    <w:rsid w:val="00512079"/>
-    <w:rsid w:val="0052714D"/>
-    <w:rsid w:val="005C5870"/>
-    <w:rsid w:val="005E5A78"/>
-    <w:rsid w:val="006B60BD"/>
-    <w:rsid w:val="00754A28"/>
-    <w:rsid w:val="007757EC"/>
-    <w:rsid w:val="00775E9C"/>
-    <w:rsid w:val="007A353A"/>
-    <w:rsid w:val="007F043B"/>
-    <w:rsid w:val="008422B9"/>
-    <w:rsid w:val="0088705F"/>
-    <w:rsid w:val="008B5823"/>
-    <w:rsid w:val="008C3CDA"/>
-    <w:rsid w:val="00A04994"/>
-    <w:rsid w:val="00A510E4"/>
-    <w:rsid w:val="00AA1C94"/>
-    <w:rsid w:val="00AA310F"/>
-    <w:rsid w:val="00AE3F9A"/>
-    <w:rsid w:val="00B06B3F"/>
-    <w:rsid w:val="00B679E1"/>
-    <w:rsid w:val="00BD394D"/>
-    <w:rsid w:val="00CB126D"/>
-    <w:rsid w:val="00CE00E1"/>
-    <w:rsid w:val="00CF3B44"/>
-    <w:rsid w:val="00D170B8"/>
-    <w:rsid w:val="00D310B3"/>
-    <w:rsid w:val="00D56EE9"/>
-    <w:rsid w:val="00DB6125"/>
-    <w:rsid w:val="00DF0991"/>
-    <w:rsid w:val="00E94255"/>
-    <w:rsid w:val="00EA2BF7"/>
-    <w:rsid w:val="00EF1513"/>
-    <w:rsid w:val="00EF6D43"/>
-    <w:rsid w:val="00F159CB"/>
-    <w:rsid w:val="00F22627"/>
-    <w:rsid w:val="00F3577A"/>
-    <w:rsid w:val="00F46418"/>
-    <w:rsid w:val="00FE716F"/>
-  </w:rsids>
-  <m:mathPr>
-    <m:mathFont m:val="Cambria Math"/>
-    <m:brkBin m:val="before"/>
-    <m:brkBinSub m:val="--"/>
-    <m:smallFrac m:val="0"/>
-    <m:dispDef/>
-    <m:lMargin m:val="0"/>
-    <m:rMargin m:val="0"/>
-    <m:defJc m:val="centerGroup"/>
-    <m:wrapIndent m:val="1440"/>
-    <m:intLim m:val="subSup"/>
-    <m:naryLim m:val="undOvr"/>
-  </m:mathPr>
-  <w:themeFontLang w:val="es-PE"/>
-  <w:clrSchemeMapping w:bg1="light1" w:t1="dark1" w:bg2="light2" w:t2="dark2" w:accent1="accent1" w:accent2="accent2" w:accent3="accent3" w:accent4="accent4" w:accent5="accent5" w:accent6="accent6" w:hyperlink="hyperlink" w:followedHyperlink="followedHyperlink"/>
-  <w:shapeDefaults>
-    <o:shapedefaults v:ext="edit" spidmax="2050"/>
-    <o:shapelayout v:ext="edit">
-      <o:idmap v:ext="edit" data="2"/>
-    </o:shapelayout>
-  </w:shapeDefaults>
-  <w:decimalSymbol w:val="."/>
-  <w:listSeparator w:val=";"/>
-  <w14:docId w14:val="0EBF6C51"/>
-  <w15:docId w15:val="{94B5EB97-90B5-4D0F-97FC-E5510761B87F}"/>
-</w:settings>
-</file>
-
-<file path=word\styles.xml><?xml version="1.0" encoding="utf-8"?>
+<file path=word/styles.xml><?xml version="1.0" encoding="utf-8"?>
 <w:styles xmlns:mc="http://schemas.openxmlformats.org/markup-compatibility/2006" xmlns:r="http://schemas.openxmlformats.org/officeDocument/2006/relationships" xmlns:w="http://schemas.openxmlformats.org/wordprocessingml/2006/main" xmlns:w14="http://schemas.microsoft.com/office/word/2010/wordml" xmlns:w15="http://schemas.microsoft.com/office/word/2012/wordml" xmlns:w16cex="http://schemas.microsoft.com/office/word/2018/wordml/cex" xmlns:w16cid="http://schemas.microsoft.com/office/word/2016/wordml/cid" xmlns:w16="http://schemas.microsoft.com/office/word/2018/wordml" xmlns:w16du="http://schemas.microsoft.com/office/word/2023/wordml/word16du" xmlns:w16sdtdh="http://schemas.microsoft.com/office/word/2020/wordml/sdtdatahash" xmlns:w16sdtfl="http://schemas.microsoft.com/office/word/2024/wordml/sdtformatlock" xmlns:w16se="http://schemas.microsoft.com/office/word/2015/wordml/symex" mc:Ignorable="w14 w15 w16se w16cid w16 w16cex w16sdtdh w16sdtfl w16du">
   <w:docDefaults>
     <w:rPrDefault>
@@ -11390,7 +9598,7 @@
 </w:styles>
 </file>
 
-<file path=word\theme\theme1.xml><?xml version="1.0" encoding="utf-8"?>
+<file path=word/theme/theme1.xml><?xml version="1.0" encoding="utf-8"?>
 <a:theme xmlns:a="http://schemas.openxmlformats.org/drawingml/2006/main" name="Tema de Office">
   <a:themeElements>
     <a:clrScheme name="Office">
@@ -11685,6 +9893,14 @@
 </a:theme>
 </file>
 
-<file path=word\webSettings.xml><?xml version="1.0" encoding="utf-8"?>
-<w:webSettings xmlns:mc="http://schemas.openxmlformats.org/markup-compatibility/2006" xmlns:r="http://schemas.openxmlformats.org/officeDocument/2006/relationships" xmlns:w="http://schemas.openxmlformats.org/wordprocessingml/2006/main" xmlns:w14="http://schemas.microsoft.com/office/word/2010/wordml" xmlns:w15="http://schemas.microsoft.com/office/word/2012/wordml" xmlns:w16cex="http://schemas.microsoft.com/office/word/2018/wordml/cex" xmlns:w16cid="http://schemas.microsoft.com/office/word/2016/wordml/cid" xmlns:w16="http://schemas.microsoft.com/office/word/2018/wordml" xmlns:w16du="http://schemas.microsoft.com/office/word/2023/wordml/word16du" xmlns:w16sdtdh="http://schemas.microsoft.com/office/word/2020/wordml/sdtdatahash" xmlns:w16sdtfl="http://schemas.microsoft.com/office/word/2024/wordml/sdtformatlock" xmlns:w16se="http://schemas.microsoft.com/office/word/2015/wordml/symex" mc:Ignorable="w14 w15 w16se w16cid w16 w16cex w16sdtdh w16sdtfl w16du"/>
+<file path=customXml/item1.xml><?xml version="1.0" encoding="utf-8"?>
+<b:Sources xmlns:b="http://schemas.openxmlformats.org/officeDocument/2006/bibliography" xmlns="http://schemas.openxmlformats.org/officeDocument/2006/bibliography" SelectedStyle="\APASixthEditionOfficeOnline.xsl" StyleName="APA" Version="6"/>
+</file>
+
+<file path=customXml/itemProps1.xml><?xml version="1.0" encoding="utf-8"?>
+<ds:datastoreItem xmlns:ds="http://schemas.openxmlformats.org/officeDocument/2006/customXml" ds:itemID="{902A56BA-3B9D-46BB-94DE-ECBC99AF0017}">
+  <ds:schemaRefs>
+    <ds:schemaRef ds:uri="http://schemas.openxmlformats.org/officeDocument/2006/bibliography"/>
+  </ds:schemaRefs>
+</ds:datastoreItem>
 </file>
</xml_diff>

<commit_message>
sync final report evidence
</commit_message>
<xml_diff>
--- a/docs/entregables/Informe_Final_Chompas_Mabel.docx
+++ b/docs/entregables/Informe_Final_Chompas_Mabel.docx
@@ -2571,22 +2571,7 @@
     </w:p>
     <w:p>
       <w:r>
-        <w:rPr>
-          <w:sz w:val="22"/>
-        </w:rPr>
-        <w:t xml:space="preserve">La aplicación utiliza una arquitectura cliente-servidor organizada en capas. El frontend Angular funciona cómo una SPA que presenta la interfaz y consume servicios HTTP; el </w:t>
-      </w:r>
-      <w:r>
-        <w:rPr>
-          <w:sz w:val="22"/>
-        </w:rPr>
-        <w:t>backend FastAPI expone una API REST</w:t>
-      </w:r>
-      <w:r>
-        <w:rPr>
-          <w:sz w:val="22"/>
-        </w:rPr>
-        <w:t xml:space="preserve"> y concentra la lógica de negocio; la persistencia se realiza en MySQL mediante JPA/Hibernate.</w:t>
+        <w:t>La aplicación utiliza una arquitectura cliente-servidor organizada en capas. El frontend Angular funciona cómo una SPA que presenta la interfaz y consume servicios HTTP; el backend FastAPI expone una API REST y concentra la lógica de negocio; la persistencia se realiza en MySQL mediante MySQL Connector y procedimientos almacenados.</w:t>
       </w:r>
     </w:p>
     <w:p>
@@ -3230,11 +3215,7 @@
         <w:jc w:val="center"/>
       </w:pPr>
       <w:r>
-        <w:rPr>
-          <w:i/>
-          <w:sz w:val="20"/>
-        </w:rPr>
-        <w:t>Figura 7. Modulo Pedidos/Ventas/Creditos: creacion de pedidos, relacion con ventas y control de cuentas por cobrar.</w:t>
+        <w:t>Figura 7. Modulo Pedidos: creacion de pedidos, relacion con ventas y control de cuentas por cobrar.</w:t>
       </w:r>
     </w:p>
     <w:p>
@@ -3788,90 +3769,104 @@
         </w:rPr>
       </w:pPr>
       <w:r>
+        <w:t>Endpoints REST para autenticacion, productos, clientes, pedidos, creditos, ventas, inventario y reportes.</w:t>
+      </w:r>
+    </w:p>
+    <w:p>
+      <w:pPr>
+        <w:spacing w:after="155" w:line="360" w:lineRule="auto"/>
+        <w:ind w:left="0" w:right="200" w:firstLine="0"/>
+        <w:rPr>
+          <w:rFonts w:ascii="Century Gothic" w:hAnsi="Century Gothic"/>
+          <w:b/>
+          <w:color w:val="202124"/>
+          <w:sz w:val="26"/>
+          <w:szCs w:val="26"/>
+        </w:rPr>
+      </w:pPr>
+      <w:r>
+        <w:t>Logica de negocio para validacion, calculo de totales, actualizacion de stock, registro de ventas y calculo de saldos de credito.</w:t>
+      </w:r>
+    </w:p>
+    <w:p>
+      <w:pPr>
+        <w:spacing w:after="155" w:line="360" w:lineRule="auto"/>
+        <w:ind w:left="0" w:right="200" w:firstLine="0"/>
+        <w:rPr>
+          <w:rFonts w:ascii="Century Gothic" w:hAnsi="Century Gothic"/>
+          <w:b/>
+          <w:color w:val="202124"/>
+          <w:sz w:val="26"/>
+          <w:szCs w:val="26"/>
+        </w:rPr>
+      </w:pPr>
+      <w:r>
+        <w:rPr>
+          <w:sz w:val="22"/>
+        </w:rPr>
+        <w:t>Acceso a MySQL mediante MySQL Connector y procedimientos almacenados.</w:t>
+      </w:r>
+    </w:p>
+    <w:p>
+      <w:pPr>
+        <w:spacing w:after="155" w:line="360" w:lineRule="auto"/>
+        <w:ind w:left="0" w:right="200" w:firstLine="0"/>
+        <w:rPr>
+          <w:rFonts w:ascii="Century Gothic" w:hAnsi="Century Gothic"/>
+          <w:b/>
+          <w:color w:val="202124"/>
+          <w:sz w:val="26"/>
+          <w:szCs w:val="26"/>
+        </w:rPr>
+      </w:pPr>
+      <w:r>
+        <w:rPr>
+          <w:sz w:val="22"/>
+        </w:rPr>
+        <w:t>Validaciones con Pydantic en modelos de entrada y respuestas JSON para errores.</w:t>
+      </w:r>
+    </w:p>
+    <w:p>
+      <w:pPr>
+        <w:spacing w:after="155" w:line="360" w:lineRule="auto"/>
+        <w:ind w:left="0" w:right="200" w:firstLine="0"/>
+        <w:jc w:val="left"/>
+        <w:rPr>
+          <w:rFonts w:ascii="Century Gothic" w:hAnsi="Century Gothic"/>
+          <w:b/>
+          <w:color w:val="202124"/>
+          <w:sz w:val="26"/>
+          <w:szCs w:val="26"/>
+          <w:lang w:val="en-US"/>
+        </w:rPr>
+      </w:pPr>
+      <w:r>
+        <w:rPr>
+          <w:b/>
+          <w:lang w:val="en-US"/>
+        </w:rPr>
+        <w:t>Endpoints principales</w:t>
+      </w:r>
+    </w:p>
+    <w:p>
+      <w:pPr>
+        <w:spacing w:after="155" w:line="360" w:lineRule="auto"/>
+        <w:ind w:left="0" w:right="200" w:firstLine="0"/>
+        <w:rPr>
+          <w:rFonts w:ascii="Century Gothic" w:hAnsi="Century Gothic"/>
+          <w:b/>
+          <w:color w:val="202124"/>
+          <w:sz w:val="26"/>
+          <w:szCs w:val="26"/>
+          <w:lang w:val="en-US"/>
+        </w:rPr>
+      </w:pPr>
+      <w:r>
         <w:rPr>
           <w:sz w:val="22"/>
           <w:lang w:val="en-US"/>
         </w:rPr>
-        <w:t>Controladores REST: AuthController, ProductoController, ClienteController y PedidoController.</w:t>
-      </w:r>
-    </w:p>
-    <w:p>
-      <w:pPr>
-        <w:spacing w:after="155" w:line="360" w:lineRule="auto"/>
-        <w:ind w:left="0" w:right="200" w:firstLine="0"/>
-        <w:rPr>
-          <w:rFonts w:ascii="Century Gothic" w:hAnsi="Century Gothic"/>
-          <w:b/>
-          <w:color w:val="202124"/>
-          <w:sz w:val="26"/>
-          <w:szCs w:val="26"/>
-        </w:rPr>
-      </w:pPr>
-      <w:r>
-        <w:rPr>
-          <w:sz w:val="22"/>
-        </w:rPr>
-        <w:t>Servicios de negocio para validacion, calculo de totales, actualizacion de stock, registro de ventas y calculo de saldos de credito.</w:t>
-      </w:r>
-    </w:p>
-    <w:p>
-      <w:pPr>
-        <w:spacing w:after="155" w:line="360" w:lineRule="auto"/>
-        <w:ind w:left="0" w:right="200" w:firstLine="0"/>
-        <w:rPr>
-          <w:rFonts w:ascii="Century Gothic" w:hAnsi="Century Gothic"/>
-          <w:b/>
-          <w:color w:val="202124"/>
-          <w:sz w:val="26"/>
-          <w:szCs w:val="26"/>
-        </w:rPr>
-      </w:pPr>
-      <w:r>
-        <w:rPr>
-          <w:sz w:val="22"/>
-        </w:rPr>
-        <w:t>Acceso a MySQL mediante MySQL Connector y procedimientos almacenados.</w:t>
-      </w:r>
-    </w:p>
-    <w:p>
-      <w:pPr>
-        <w:spacing w:after="155" w:line="360" w:lineRule="auto"/>
-        <w:ind w:left="0" w:right="200" w:firstLine="0"/>
-        <w:rPr>
-          <w:rFonts w:ascii="Century Gothic" w:hAnsi="Century Gothic"/>
-          <w:b/>
-          <w:color w:val="202124"/>
-          <w:sz w:val="26"/>
-          <w:szCs w:val="26"/>
-        </w:rPr>
-      </w:pPr>
-      <w:r>
-        <w:rPr>
-          <w:sz w:val="22"/>
-        </w:rPr>
-        <w:t>Validaciones con Pydantic en modelos de entrada y respuestas JSON para errores.</w:t>
-      </w:r>
-    </w:p>
-    <w:p>
-      <w:pPr>
-        <w:spacing w:after="155" w:line="360" w:lineRule="auto"/>
-        <w:ind w:left="0" w:right="200" w:firstLine="0"/>
-        <w:jc w:val="left"/>
-        <w:rPr>
-          <w:rFonts w:ascii="Century Gothic" w:hAnsi="Century Gothic"/>
-          <w:b/>
-          <w:color w:val="202124"/>
-          <w:sz w:val="26"/>
-          <w:szCs w:val="26"/>
-          <w:lang w:val="en-US"/>
-        </w:rPr>
-      </w:pPr>
-      <w:r>
-        <w:rPr>
-          <w:b/>
-          <w:lang w:val="en-US"/>
-        </w:rPr>
-        <w:t>Endpoints principales</w:t>
+        <w:t>GET, POST, PUT y DELETE /api/productos.</w:t>
       </w:r>
     </w:p>
     <w:p>
@@ -3892,7 +3887,81 @@
           <w:sz w:val="22"/>
           <w:lang w:val="en-US"/>
         </w:rPr>
-        <w:t>GET, POST, PUT y DELETE /api/productos.</w:t>
+        <w:t>GET y POST /api/clientes.</w:t>
+      </w:r>
+    </w:p>
+    <w:p>
+      <w:pPr>
+        <w:spacing w:after="155" w:line="360" w:lineRule="auto"/>
+        <w:ind w:left="0" w:right="200" w:firstLine="0"/>
+        <w:rPr>
+          <w:rFonts w:ascii="Century Gothic" w:hAnsi="Century Gothic"/>
+          <w:b/>
+          <w:color w:val="202124"/>
+          <w:sz w:val="26"/>
+          <w:szCs w:val="26"/>
+        </w:rPr>
+      </w:pPr>
+      <w:r>
+        <w:rPr>
+          <w:sz w:val="22"/>
+        </w:rPr>
+        <w:t>GET y POST /api/pedidos.</w:t>
+      </w:r>
+    </w:p>
+    <w:p>
+      <w:pPr>
+        <w:spacing w:after="155" w:line="360" w:lineRule="auto"/>
+        <w:ind w:left="0" w:right="200" w:firstLine="0"/>
+        <w:rPr>
+          <w:rFonts w:ascii="Century Gothic" w:hAnsi="Century Gothic"/>
+          <w:b/>
+          <w:color w:val="202124"/>
+          <w:sz w:val="26"/>
+          <w:szCs w:val="26"/>
+        </w:rPr>
+      </w:pPr>
+      <w:r>
+        <w:rPr>
+          <w:sz w:val="22"/>
+        </w:rPr>
+        <w:t>POST /api/auth/login para autenticación básica del sistema.</w:t>
+      </w:r>
+    </w:p>
+    <w:p>
+      <w:pPr>
+        <w:spacing w:after="155" w:line="360" w:lineRule="auto"/>
+        <w:ind w:left="0" w:right="200" w:firstLine="0"/>
+        <w:jc w:val="left"/>
+        <w:rPr>
+          <w:rFonts w:ascii="Century Gothic" w:hAnsi="Century Gothic"/>
+          <w:b/>
+          <w:color w:val="202124"/>
+          <w:sz w:val="26"/>
+          <w:szCs w:val="26"/>
+        </w:rPr>
+      </w:pPr>
+      <w:r>
+        <w:rPr>
+          <w:b/>
+        </w:rPr>
+        <w:t>Ejecución</w:t>
+      </w:r>
+    </w:p>
+    <w:p>
+      <w:pPr>
+        <w:spacing w:after="155" w:line="360" w:lineRule="auto"/>
+        <w:ind w:left="0" w:right="200" w:firstLine="0"/>
+        <w:rPr>
+          <w:rFonts w:ascii="Century Gothic" w:hAnsi="Century Gothic"/>
+          <w:b/>
+          <w:color w:val="202124"/>
+          <w:sz w:val="26"/>
+          <w:szCs w:val="26"/>
+        </w:rPr>
+      </w:pPr>
+      <w:r>
+        <w:t>Base de datos: docker compose up -d mysql.</w:t>
       </w:r>
     </w:p>
     <w:p>
@@ -3909,109 +3978,7 @@
         </w:rPr>
       </w:pPr>
       <w:r>
-        <w:rPr>
-          <w:sz w:val="22"/>
-          <w:lang w:val="en-US"/>
-        </w:rPr>
-        <w:t>GET y POST /api/clientes.</w:t>
-      </w:r>
-    </w:p>
-    <w:p>
-      <w:pPr>
-        <w:spacing w:after="155" w:line="360" w:lineRule="auto"/>
-        <w:ind w:left="0" w:right="200" w:firstLine="0"/>
-        <w:rPr>
-          <w:rFonts w:ascii="Century Gothic" w:hAnsi="Century Gothic"/>
-          <w:b/>
-          <w:color w:val="202124"/>
-          <w:sz w:val="26"/>
-          <w:szCs w:val="26"/>
-        </w:rPr>
-      </w:pPr>
-      <w:r>
-        <w:rPr>
-          <w:sz w:val="22"/>
-        </w:rPr>
-        <w:t>GET y POST /api/pedidos.</w:t>
-      </w:r>
-    </w:p>
-    <w:p>
-      <w:pPr>
-        <w:spacing w:after="155" w:line="360" w:lineRule="auto"/>
-        <w:ind w:left="0" w:right="200" w:firstLine="0"/>
-        <w:rPr>
-          <w:rFonts w:ascii="Century Gothic" w:hAnsi="Century Gothic"/>
-          <w:b/>
-          <w:color w:val="202124"/>
-          <w:sz w:val="26"/>
-          <w:szCs w:val="26"/>
-        </w:rPr>
-      </w:pPr>
-      <w:r>
-        <w:rPr>
-          <w:sz w:val="22"/>
-        </w:rPr>
-        <w:t>POST /api/auth/login para autenticación básica del sistema.</w:t>
-      </w:r>
-    </w:p>
-    <w:p>
-      <w:pPr>
-        <w:spacing w:after="155" w:line="360" w:lineRule="auto"/>
-        <w:ind w:left="0" w:right="200" w:firstLine="0"/>
-        <w:jc w:val="left"/>
-        <w:rPr>
-          <w:rFonts w:ascii="Century Gothic" w:hAnsi="Century Gothic"/>
-          <w:b/>
-          <w:color w:val="202124"/>
-          <w:sz w:val="26"/>
-          <w:szCs w:val="26"/>
-        </w:rPr>
-      </w:pPr>
-      <w:r>
-        <w:rPr>
-          <w:b/>
-        </w:rPr>
-        <w:t>Ejecución</w:t>
-      </w:r>
-    </w:p>
-    <w:p>
-      <w:pPr>
-        <w:spacing w:after="155" w:line="360" w:lineRule="auto"/>
-        <w:ind w:left="0" w:right="200" w:firstLine="0"/>
-        <w:rPr>
-          <w:rFonts w:ascii="Century Gothic" w:hAnsi="Century Gothic"/>
-          <w:b/>
-          <w:color w:val="202124"/>
-          <w:sz w:val="26"/>
-          <w:szCs w:val="26"/>
-        </w:rPr>
-      </w:pPr>
-      <w:r>
-        <w:rPr>
-          <w:sz w:val="22"/>
-        </w:rPr>
-        <w:t>Base de datos: docker compose up -d mysql.</w:t>
-      </w:r>
-    </w:p>
-    <w:p>
-      <w:pPr>
-        <w:spacing w:after="155" w:line="360" w:lineRule="auto"/>
-        <w:ind w:left="0" w:right="200" w:firstLine="0"/>
-        <w:rPr>
-          <w:rFonts w:ascii="Century Gothic" w:hAnsi="Century Gothic"/>
-          <w:b/>
-          <w:color w:val="202124"/>
-          <w:sz w:val="26"/>
-          <w:szCs w:val="26"/>
-          <w:lang w:val="en-US"/>
-        </w:rPr>
-      </w:pPr>
-      <w:r>
-        <w:rPr>
-          <w:sz w:val="22"/>
-          <w:lang w:val="en-US"/>
-        </w:rPr>
-        <w:t>Backend: cd backend-springboot; mvn spring-boot:run.</w:t>
+        <w:t>Backend principal: cd backend-fastapi; pip install -r requirements.txt; uvicorn main:app --reload --host 0.0.0.0 --port 8000.</w:t>
       </w:r>
     </w:p>
     <w:p>
@@ -5183,54 +5150,45 @@
         </w:rPr>
       </w:pPr>
       <w:r>
+        <w:t>cd backend-fastapi &amp;&amp; pip install -r requirements.txt &amp;&amp; uvicorn main:app --reload --host 0.0.0.0 --port 8000</w:t>
+      </w:r>
+    </w:p>
+    <w:p>
+      <w:pPr>
+        <w:jc w:val="left"/>
+        <w:rPr>
+          <w:lang w:val="en-US"/>
+        </w:rPr>
+      </w:pPr>
+      <w:r>
         <w:rPr>
           <w:rFonts w:ascii="Consolas" w:hAnsi="Consolas"/>
           <w:sz w:val="20"/>
           <w:lang w:val="en-US"/>
         </w:rPr>
-        <w:t>cd backend-springboot &amp;&amp; mvn spring-boot:run</w:t>
+        <w:t>cd frontend-angular &amp;&amp; npm install &amp;&amp; npm start</w:t>
       </w:r>
     </w:p>
     <w:p>
       <w:pPr>
         <w:jc w:val="left"/>
+      </w:pPr>
+      <w:r>
+        <w:rPr>
+          <w:sz w:val="22"/>
+        </w:rPr>
+        <w:t>Anexo 3. Usuarios de prueba: admin@chompasmabel.com / admin123 y vendedor@chompasmabel.com / venta123</w:t>
+      </w:r>
+    </w:p>
+    <w:p>
+      <w:pPr>
+        <w:jc w:val="left"/>
         <w:rPr>
           <w:lang w:val="en-US"/>
         </w:rPr>
       </w:pPr>
       <w:r>
-        <w:rPr>
-          <w:rFonts w:ascii="Consolas" w:hAnsi="Consolas"/>
-          <w:sz w:val="20"/>
-          <w:lang w:val="en-US"/>
-        </w:rPr>
-        <w:t>cd frontend-angular &amp;&amp; npm install &amp;&amp; npm start</w:t>
-      </w:r>
-    </w:p>
-    <w:p>
-      <w:pPr>
-        <w:jc w:val="left"/>
-      </w:pPr>
-      <w:r>
-        <w:rPr>
-          <w:sz w:val="22"/>
-        </w:rPr>
-        <w:t>Anexo 3. Usuarios de prueba: admin@chompasmabel.com / admin123 y vendedor@chompasmabel.com / venta123</w:t>
-      </w:r>
-    </w:p>
-    <w:p>
-      <w:pPr>
-        <w:jc w:val="left"/>
-        <w:rPr>
-          <w:lang w:val="en-US"/>
-        </w:rPr>
-      </w:pPr>
-      <w:r>
-        <w:rPr>
-          <w:sz w:val="22"/>
-          <w:lang w:val="en-US"/>
-        </w:rPr>
-        <w:t>Anexo 4. Estructura principal actualizada: frontend-angular con core, services, models, guard de roles y features incluyendo creditos; backend-springboot con controller, service, repository, model, dto y config; database/schema.sql; docs/requerimientos_usuario.md; docker-compose.yml; README.md principal; README por modulo; docs/entregables e imagenes.</w:t>
+        <w:t>Anexo 4. Estructura principal actualizada: frontend-angular con core, services, models, guard de roles y features incluyendo inventario, ventas y creditos; backend-fastapi como API principal; backend-springboot como alternativa compatible; database/schema.sql; docs/requerimientos_usuario.md; docker-compose.yml; README.md principal; README por modulo; docs/entregables e imagenes.</w:t>
       </w:r>
     </w:p>
     <w:p>
@@ -5296,13 +5254,7 @@
     </w:p>
     <w:p>
       <w:r>
-        <w:t xml:space="preserve">Backend actualizado: se agrego backend-fastapi como API principal para la rubrica, disponible en http://localhost:8000/api. Expone autenticacion, productos, clientes, pedidos, creditos, ventas, inventario y resumen de reportes. El </w:t>
-      </w:r>
-      <w:r>
-        <w:t>Backend FastAPI</w:t>
-      </w:r>
-      <w:r>
-        <w:t xml:space="preserve"> queda como implementacion alternativa y compatible en http://localhost:8080/api.</w:t>
+        <w:t>Backend actualizado: se agrego backend-fastapi como API principal para la rubrica, disponible en http://localhost:8000/api. Expone autenticacion, productos, clientes, pedidos, creditos, ventas, inventario y resumen de reportes. El backend Spring Boot queda como implementacion alternativa y compatible en http://localhost:8080/api.</w:t>
       </w:r>
     </w:p>
     <w:p>
@@ -5334,6 +5286,192 @@
     <w:p>
       <w:r>
         <w:t>Con esta actualizacion el proyecto queda alineado con la rubrica: Angular 21 en el frontend, FastAPI como backend principal, MySQL con procedimientos almacenados e integracion documentada para exposicion.</w:t>
+      </w:r>
+    </w:p>
+    <w:p>
+      <w:r>
+        <w:br w:type="page"/>
+      </w:r>
+    </w:p>
+    <w:p>
+      <w:pPr>
+        <w:pStyle w:val="Ttulo1"/>
+      </w:pPr>
+      <w:r>
+        <w:t>EVIDENCIAS VISUALES ACTUALIZADAS</w:t>
+      </w:r>
+    </w:p>
+    <w:p>
+      <w:r>
+        <w:t>Las siguientes capturas complementan el informe final y muestran los cambios aplicados en la version actual: rutas separadas para inventario y ventas, backend FastAPI principal, procedimientos almacenados y evidencias de base de datos.</w:t>
+      </w:r>
+    </w:p>
+    <w:p/>
+    <w:p>
+      <w:r>
+        <w:drawing>
+          <wp:inline xmlns:a="http://schemas.openxmlformats.org/drawingml/2006/main" xmlns:pic="http://schemas.openxmlformats.org/drawingml/2006/picture">
+            <wp:extent cx="6035040" cy="3393053"/>
+            <wp:docPr id="18" name="Picture 18"/>
+            <wp:cNvGraphicFramePr>
+              <a:graphicFrameLocks noChangeAspect="1"/>
+            </wp:cNvGraphicFramePr>
+            <a:graphic>
+              <a:graphicData uri="http://schemas.openxmlformats.org/drawingml/2006/picture">
+                <pic:pic>
+                  <pic:nvPicPr>
+                    <pic:cNvPr id="0" name="inventario_web.png"/>
+                    <pic:cNvPicPr/>
+                  </pic:nvPicPr>
+                  <pic:blipFill>
+                    <a:blip r:embed="rId22"/>
+                    <a:stretch>
+                      <a:fillRect/>
+                    </a:stretch>
+                  </pic:blipFill>
+                  <pic:spPr>
+                    <a:xfrm>
+                      <a:off x="0" y="0"/>
+                      <a:ext cx="6035040" cy="3393053"/>
+                    </a:xfrm>
+                    <a:prstGeom prst="rect"/>
+                  </pic:spPr>
+                </pic:pic>
+              </a:graphicData>
+            </a:graphic>
+          </wp:inline>
+        </w:drawing>
+      </w:r>
+    </w:p>
+    <w:p>
+      <w:r>
+        <w:t>Figura 11. Modulo Inventario: movimientos reales por producto desde inventario_movimientos.</w:t>
+      </w:r>
+    </w:p>
+    <w:p/>
+    <w:p>
+      <w:r>
+        <w:drawing>
+          <wp:inline xmlns:a="http://schemas.openxmlformats.org/drawingml/2006/main" xmlns:pic="http://schemas.openxmlformats.org/drawingml/2006/picture">
+            <wp:extent cx="6035040" cy="3393053"/>
+            <wp:docPr id="19" name="Picture 19"/>
+            <wp:cNvGraphicFramePr>
+              <a:graphicFrameLocks noChangeAspect="1"/>
+            </wp:cNvGraphicFramePr>
+            <a:graphic>
+              <a:graphicData uri="http://schemas.openxmlformats.org/drawingml/2006/picture">
+                <pic:pic>
+                  <pic:nvPicPr>
+                    <pic:cNvPr id="0" name="ventas_web.png"/>
+                    <pic:cNvPicPr/>
+                  </pic:nvPicPr>
+                  <pic:blipFill>
+                    <a:blip r:embed="rId23"/>
+                    <a:stretch>
+                      <a:fillRect/>
+                    </a:stretch>
+                  </pic:blipFill>
+                  <pic:spPr>
+                    <a:xfrm>
+                      <a:off x="0" y="0"/>
+                      <a:ext cx="6035040" cy="3393053"/>
+                    </a:xfrm>
+                    <a:prstGeom prst="rect"/>
+                  </pic:spPr>
+                </pic:pic>
+              </a:graphicData>
+            </a:graphic>
+          </wp:inline>
+        </w:drawing>
+      </w:r>
+    </w:p>
+    <w:p>
+      <w:r>
+        <w:t>Figura 12. Modulo Ventas: historial dedicado de pedidos cerrados, independiente de pedidos.</w:t>
+      </w:r>
+    </w:p>
+    <w:p/>
+    <w:p>
+      <w:r>
+        <w:drawing>
+          <wp:inline xmlns:a="http://schemas.openxmlformats.org/drawingml/2006/main" xmlns:pic="http://schemas.openxmlformats.org/drawingml/2006/picture">
+            <wp:extent cx="6035040" cy="3393053"/>
+            <wp:docPr id="20" name="Picture 20"/>
+            <wp:cNvGraphicFramePr>
+              <a:graphicFrameLocks noChangeAspect="1"/>
+            </wp:cNvGraphicFramePr>
+            <a:graphic>
+              <a:graphicData uri="http://schemas.openxmlformats.org/drawingml/2006/picture">
+                <pic:pic>
+                  <pic:nvPicPr>
+                    <pic:cNvPr id="0" name="fastapi_docs.png"/>
+                    <pic:cNvPicPr/>
+                  </pic:nvPicPr>
+                  <pic:blipFill>
+                    <a:blip r:embed="rId24"/>
+                    <a:stretch>
+                      <a:fillRect/>
+                    </a:stretch>
+                  </pic:blipFill>
+                  <pic:spPr>
+                    <a:xfrm>
+                      <a:off x="0" y="0"/>
+                      <a:ext cx="6035040" cy="3393053"/>
+                    </a:xfrm>
+                    <a:prstGeom prst="rect"/>
+                  </pic:spPr>
+                </pic:pic>
+              </a:graphicData>
+            </a:graphic>
+          </wp:inline>
+        </w:drawing>
+      </w:r>
+    </w:p>
+    <w:p>
+      <w:r>
+        <w:t>Figura 13. Documentacion de endpoints REST principales en FastAPI.</w:t>
+      </w:r>
+    </w:p>
+    <w:p/>
+    <w:p>
+      <w:r>
+        <w:drawing>
+          <wp:inline xmlns:a="http://schemas.openxmlformats.org/drawingml/2006/main" xmlns:pic="http://schemas.openxmlformats.org/drawingml/2006/picture">
+            <wp:extent cx="6035040" cy="3393053"/>
+            <wp:docPr id="21" name="Picture 21"/>
+            <wp:cNvGraphicFramePr>
+              <a:graphicFrameLocks noChangeAspect="1"/>
+            </wp:cNvGraphicFramePr>
+            <a:graphic>
+              <a:graphicData uri="http://schemas.openxmlformats.org/drawingml/2006/picture">
+                <pic:pic>
+                  <pic:nvPicPr>
+                    <pic:cNvPr id="0" name="procedimientos_mysql.png"/>
+                    <pic:cNvPicPr/>
+                  </pic:nvPicPr>
+                  <pic:blipFill>
+                    <a:blip r:embed="rId25"/>
+                    <a:stretch>
+                      <a:fillRect/>
+                    </a:stretch>
+                  </pic:blipFill>
+                  <pic:spPr>
+                    <a:xfrm>
+                      <a:off x="0" y="0"/>
+                      <a:ext cx="6035040" cy="3393053"/>
+                    </a:xfrm>
+                    <a:prstGeom prst="rect"/>
+                  </pic:spPr>
+                </pic:pic>
+              </a:graphicData>
+            </a:graphic>
+          </wp:inline>
+        </w:drawing>
+      </w:r>
+    </w:p>
+    <w:p>
+      <w:r>
+        <w:t>Figura 14. Procedimientos almacenados y consultas de apoyo en MySQL.</w:t>
       </w:r>
     </w:p>
     <w:sectPr>

</xml_diff>

<commit_message>
clarify final report screenshots
</commit_message>
<xml_diff>
--- a/docs/entregables/Informe_Final_Chompas_Mabel.docx
+++ b/docs/entregables/Informe_Final_Chompas_Mabel.docx
@@ -2931,10 +2931,7 @@
     </w:p>
     <w:p>
       <w:r>
-        <w:rPr>
-          <w:sz w:val="22"/>
-        </w:rPr>
-        <w:t>La aplicación ya se encuentra implementada y conectada al backend. Por ello, esta sección no muestra solo prototipos estáticos, sino capturas reales de cada parte principal de la web ejecutándose en http://localhost:4200.</w:t>
+        <w:t>La aplicaci?n ya se encuentra implementada y conectada al backend. Por ello, esta secci?n documenta vistas representativas de la version final de cada parte principal de la web, alineadas con las rutas, componentes y modulos actuales.</w:t>
       </w:r>
     </w:p>
     <w:p>

</xml_diff>

<commit_message>
polish final report language
</commit_message>
<xml_diff>
--- a/docs/entregables/Informe_Final_Chompas_Mabel.docx
+++ b/docs/entregables/Informe_Final_Chompas_Mabel.docx
@@ -1061,7 +1061,7 @@
                 <w:rFonts w:ascii="Arial" w:hAnsi="Arial" w:cs="Arial"/>
                 <w:noProof/>
               </w:rPr>
-              <w:t>PROTOTIPOS</w:t>
+              <w:t>INTERFACES DEL SISTEMA</w:t>
             </w:r>
             <w:r>
               <w:rPr>
@@ -1914,34 +1914,7 @@
         </w:rPr>
       </w:pPr>
       <w:r>
-        <w:rPr>
-          <w:sz w:val="22"/>
-        </w:rPr>
-        <w:t xml:space="preserve">El proyecto conserva la estructura solicitada y la completa con documentacion por modulo: </w:t>
-      </w:r>
-      <w:r>
-        <w:rPr>
-          <w:sz w:val="22"/>
-        </w:rPr>
-        <w:t>frontend-angular, backend-fastapi, backend-springboot alternativo, database/schema.sql</w:t>
-      </w:r>
-      <w:r>
-        <w:rPr>
-          <w:sz w:val="22"/>
-        </w:rPr>
-        <w:t xml:space="preserve">, docker-compose.yml, README.md principal, README del frontend, </w:t>
-      </w:r>
-      <w:r>
-        <w:rPr>
-          <w:sz w:val="22"/>
-        </w:rPr>
-        <w:t>README del backend FastAPI y README del backend Spring Boot alternativo</w:t>
-      </w:r>
-      <w:r>
-        <w:rPr>
-          <w:sz w:val="22"/>
-        </w:rPr>
-        <w:t xml:space="preserve"> y carpeta docs/entregables.</w:t>
+        <w:t>El proyecto se organiza por modulos: interfaz web, servicios backend, base de datos, documentacion, archivos de ejecucion y entregables finales.</w:t>
       </w:r>
     </w:p>
     <w:p>
@@ -2016,10 +1989,7 @@
         </w:rPr>
       </w:pPr>
       <w:r>
-        <w:rPr>
-          <w:sz w:val="22"/>
-        </w:rPr>
-        <w:t>La solución busca reducir errores manuales, centralizar información y permitir que el negocio consulte datos actualizados desde una interfaz web responsive.</w:t>
+        <w:t>La solución busca reducir errores manuales, centralizar información y permitir que el negocio consulte datos del sistemas desde una interfaz web responsive.</w:t>
       </w:r>
     </w:p>
     <w:p>
@@ -2209,10 +2179,7 @@
         </w:rPr>
       </w:pPr>
       <w:r>
-        <w:rPr>
-          <w:sz w:val="22"/>
-        </w:rPr>
-        <w:t>Tambien sirve como base academica para demostrar requerimientos de usuario, flujo por rol, arquitectura web, persistencia en MySQL y ejecucion local reproducible.</w:t>
+        <w:t>Tambien permite demostrar requerimientos de usuario, flujo por rol, arquitectura web, persistencia en MySQL y ejecucion local reproducible.</w:t>
       </w:r>
     </w:p>
     <w:p>
@@ -2374,10 +2341,18 @@
         <w:spacing w:line="360" w:lineRule="auto"/>
       </w:pPr>
       <w:r>
+        <w:t>Implementar una interfaz web responsive con rutas, formularios, validaciones y servicios de comunicacion con el backend.</w:t>
+      </w:r>
+    </w:p>
+    <w:p>
+      <w:pPr>
+        <w:spacing w:line="360" w:lineRule="auto"/>
+      </w:pPr>
+      <w:r>
         <w:rPr>
           <w:sz w:val="22"/>
         </w:rPr>
-        <w:t>Implementar el frontend con Angular 21, TypeScript, Bootstrap 5, CSS propio, rutas, componentes standalone, formularios reactivos y servicios HTTP.</w:t>
+        <w:t>Implementar formularios reactivos con validaciones de campos obligatorios, correo valido, precio, stock y longitud mínima de nombres.</w:t>
       </w:r>
     </w:p>
     <w:p>
@@ -2385,33 +2360,7 @@
         <w:spacing w:line="360" w:lineRule="auto"/>
       </w:pPr>
       <w:r>
-        <w:rPr>
-          <w:sz w:val="22"/>
-        </w:rPr>
-        <w:t>Implementar formularios reactivos con validaciones de campos obligatorios, correo valido, precio, stock y longitud mínima de nombres.</w:t>
-      </w:r>
-    </w:p>
-    <w:p>
-      <w:pPr>
-        <w:spacing w:line="360" w:lineRule="auto"/>
-      </w:pPr>
-      <w:r>
-        <w:rPr>
-          <w:sz w:val="22"/>
-        </w:rPr>
-        <w:t xml:space="preserve">Implementar el </w:t>
-      </w:r>
-      <w:r>
-        <w:rPr>
-          <w:sz w:val="22"/>
-        </w:rPr>
-        <w:t>backend principal con FastAPI, endpoints REST, validaciones Pydantic, conexion MySQL y procedimientos almacenados</w:t>
-      </w:r>
-      <w:r>
-        <w:rPr>
-          <w:sz w:val="22"/>
-        </w:rPr>
-        <w:t>.</w:t>
+        <w:t>Implementar servicios REST para autenticar usuarios, consultar informacion, registrar operaciones y conectar con MySQL.</w:t>
       </w:r>
     </w:p>
     <w:p>
@@ -2607,10 +2556,15 @@
     </w:p>
     <w:p>
       <w:r>
+        <w:t>Presentacion: pantallas del sistema, formularios, rutas internas, menu por rol, campana de notificaciones y comunicacion con servicios HTTP.</w:t>
+      </w:r>
+    </w:p>
+    <w:p>
+      <w:r>
         <w:rPr>
           <w:sz w:val="22"/>
         </w:rPr>
-        <w:t>Presentacion: Angular 21, componentes standalone, routing, formularios reactivos, menu por rol, campana de notificaciones, signals para estados de interfaz y servicios HTTP.</w:t>
+        <w:t>Controladores REST: reciben peticiones cómo GET, POST, PUT y DELETE y devuelven JSON.</w:t>
       </w:r>
     </w:p>
     <w:p>
@@ -2618,7 +2572,12 @@
         <w:rPr>
           <w:sz w:val="22"/>
         </w:rPr>
-        <w:t>Controladores REST: reciben peticiones cómo GET, POST, PUT y DELETE y devuelven JSON.</w:t>
+        <w:t>Servicios: validan reglas de negocio, calculan totales, descuentan stock y generan ventas.</w:t>
+      </w:r>
+    </w:p>
+    <w:p>
+      <w:r>
+        <w:t>Acceso a datos: la aplicacion consulta MySQL mediante conexion backend y procedimientos almacenados; Spring Boot se conserva como backend alternativo.</w:t>
       </w:r>
     </w:p>
     <w:p>
@@ -2626,22 +2585,6 @@
         <w:rPr>
           <w:sz w:val="22"/>
         </w:rPr>
-        <w:t>Servicios: validan reglas de negocio, calculan totales, descuentan stock y generan ventas.</w:t>
-      </w:r>
-    </w:p>
-    <w:p>
-      <w:r>
-        <w:rPr>
-          <w:sz w:val="22"/>
-        </w:rPr>
-        <w:t>Acceso a datos: FastAPI usa MySQL Connector y procedimientos almacenados; Spring Boot queda como backend alternativo.</w:t>
-      </w:r>
-    </w:p>
-    <w:p>
-      <w:r>
-        <w:rPr>
-          <w:sz w:val="22"/>
-        </w:rPr>
         <w:t>Modelo/dominio: entidades Categoria, Producto, Cliente, Usuario, Pedido, DetallePedido, Venta e InventarioMovimiento, mas campos de credito dentro de Pedido para cuentas por cobrar.</w:t>
       </w:r>
     </w:p>
@@ -2658,10 +2601,7 @@
     </w:p>
     <w:p>
       <w:r>
-        <w:rPr>
-          <w:sz w:val="22"/>
-        </w:rPr>
-        <w:t>Facilita mantenimiento: un cambio visual en Angular no obliga a modificar la base de datos.</w:t>
+        <w:t>Facilita mantenimiento: un cambio visual en la interfaz no obliga a modificar la base de datos.</w:t>
       </w:r>
     </w:p>
     <w:p>
@@ -2738,25 +2678,7 @@
         <w:jc w:val="center"/>
       </w:pPr>
       <w:r>
-        <w:rPr>
-          <w:i/>
-          <w:sz w:val="20"/>
-        </w:rPr>
-        <w:t xml:space="preserve">Figura 1. Arquitectura en capas con SPA Angular, </w:t>
-      </w:r>
-      <w:r>
-        <w:rPr>
-          <w:i/>
-          <w:sz w:val="20"/>
-        </w:rPr>
-        <w:t>API REST FastAPI y MySQL</w:t>
-      </w:r>
-      <w:r>
-        <w:rPr>
-          <w:i/>
-          <w:sz w:val="20"/>
-        </w:rPr>
-        <w:t>.</w:t>
+        <w:t>Figura 1. Arquitectura en capas de la aplicacion web.</w:t>
       </w:r>
     </w:p>
     <w:p>
@@ -2920,18 +2842,13 @@
           <w:rFonts w:ascii="Arial" w:hAnsi="Arial" w:cs="Arial"/>
         </w:rPr>
       </w:pPr>
-      <w:bookmarkStart w:id="5" w:name="_Toc227528990"/>
-      <w:r>
-        <w:rPr>
-          <w:rFonts w:ascii="Arial" w:hAnsi="Arial" w:cs="Arial"/>
-        </w:rPr>
-        <w:t>PROTOTIPOS</w:t>
-      </w:r>
-      <w:bookmarkEnd w:id="5"/>
-    </w:p>
-    <w:p>
-      <w:r>
-        <w:t>La aplicaci?n ya se encuentra implementada y conectada al backend. Por ello, esta secci?n documenta vistas representativas de la version final de cada parte principal de la web, alineadas con las rutas, componentes y modulos actuales.</w:t>
+      <w:r>
+        <w:t>INTERFACES DEL SISTEMA</w:t>
+      </w:r>
+    </w:p>
+    <w:p>
+      <w:r>
+        <w:t>La aplicacion cuenta con interfaces organizadas por modulo. Esta seccion presenta las pantallas principales del sistema desde la perspectiva del administrador y del vendedor.</w:t>
       </w:r>
     </w:p>
     <w:p>
@@ -3274,10 +3191,7 @@
     </w:p>
     <w:p>
       <w:r>
-        <w:rPr>
-          <w:sz w:val="22"/>
-        </w:rPr>
-        <w:t>Estas vistas evidencian que el sistema fue construido como producto funcional: cada pantalla tiene rutas, componentes, formularios, validaciones, conexion con servicios HTTP, flujo por rol y campana de notificaciones con alertas reales.</w:t>
+        <w:t>Estas interfaces muestran un sistema organizado por tareas del negocio: acceso, control administrativo, catalogo de productos, clientes, pedidos, creditos, ventas, inventario y reportes.</w:t>
       </w:r>
     </w:p>
     <w:p>
@@ -3656,10 +3570,7 @@
         </w:rPr>
       </w:pPr>
       <w:r>
-        <w:rPr>
-          <w:b/>
-        </w:rPr>
-        <w:t>Frontend Angular</w:t>
+        <w:t>Interfaz de usuario</w:t>
       </w:r>
     </w:p>
     <w:p>
@@ -3667,10 +3578,109 @@
         <w:spacing w:line="360" w:lineRule="auto"/>
       </w:pPr>
       <w:r>
+        <w:t>Pantallas para login, dashboard, productos, inventario, clientes, pedidos, ventas, creditos, reportes y layout con menu por rol.</w:t>
+      </w:r>
+    </w:p>
+    <w:p>
+      <w:pPr>
+        <w:spacing w:after="155" w:line="360" w:lineRule="auto"/>
+        <w:ind w:left="0" w:right="200" w:firstLine="0"/>
+        <w:rPr>
+          <w:rFonts w:ascii="Century Gothic" w:hAnsi="Century Gothic"/>
+          <w:b/>
+          <w:color w:val="202124"/>
+          <w:sz w:val="26"/>
+          <w:szCs w:val="26"/>
+        </w:rPr>
+      </w:pPr>
+      <w:r>
+        <w:t>Comunicacion HTTP con los servicios del backend; el login devuelve usuario, rol e identificador para diferenciar administrador y vendedor.</w:t>
+      </w:r>
+    </w:p>
+    <w:p>
+      <w:pPr>
+        <w:spacing w:after="155" w:line="360" w:lineRule="auto"/>
+        <w:ind w:left="0" w:right="200" w:firstLine="0"/>
+        <w:rPr>
+          <w:rFonts w:ascii="Century Gothic" w:hAnsi="Century Gothic"/>
+          <w:b/>
+          <w:color w:val="202124"/>
+          <w:sz w:val="26"/>
+          <w:szCs w:val="26"/>
+        </w:rPr>
+      </w:pPr>
+      <w:r>
         <w:rPr>
           <w:sz w:val="22"/>
         </w:rPr>
-        <w:t>Componentes para login, dashboard, productos, clientes, pedidos, creditos, reportes y layout con menu por rol.</w:t>
+        <w:t>Formularios reactivos con Validators.required, Validators.email, Validators.min y Validators.minLength.</w:t>
+      </w:r>
+    </w:p>
+    <w:p>
+      <w:pPr>
+        <w:spacing w:after="155" w:line="360" w:lineRule="auto"/>
+        <w:ind w:left="0" w:right="200" w:firstLine="0"/>
+        <w:rPr>
+          <w:rFonts w:ascii="Century Gothic" w:hAnsi="Century Gothic"/>
+          <w:b/>
+          <w:color w:val="202124"/>
+          <w:sz w:val="26"/>
+          <w:szCs w:val="26"/>
+        </w:rPr>
+      </w:pPr>
+      <w:r>
+        <w:t>Estados reactivos para manejar filtros, formularios y actualizacion de informacion en pantalla.</w:t>
+      </w:r>
+    </w:p>
+    <w:p>
+      <w:pPr>
+        <w:spacing w:after="155" w:line="360" w:lineRule="auto"/>
+        <w:ind w:left="0" w:right="200" w:firstLine="0"/>
+        <w:jc w:val="left"/>
+        <w:rPr>
+          <w:rFonts w:ascii="Century Gothic" w:hAnsi="Century Gothic"/>
+          <w:b/>
+          <w:color w:val="202124"/>
+          <w:sz w:val="26"/>
+          <w:szCs w:val="26"/>
+          <w:lang w:val="en-US"/>
+        </w:rPr>
+      </w:pPr>
+      <w:r>
+        <w:t>Servicios del sistema</w:t>
+      </w:r>
+    </w:p>
+    <w:p>
+      <w:pPr>
+        <w:spacing w:after="155" w:line="360" w:lineRule="auto"/>
+        <w:ind w:left="0" w:right="200" w:firstLine="0"/>
+        <w:rPr>
+          <w:rFonts w:ascii="Century Gothic" w:hAnsi="Century Gothic"/>
+          <w:b/>
+          <w:color w:val="202124"/>
+          <w:sz w:val="26"/>
+          <w:szCs w:val="26"/>
+          <w:lang w:val="en-US"/>
+        </w:rPr>
+      </w:pPr>
+      <w:r>
+        <w:t>Endpoints REST para autenticacion, productos, clientes, pedidos, creditos, ventas, inventario y reportes.</w:t>
+      </w:r>
+    </w:p>
+    <w:p>
+      <w:pPr>
+        <w:spacing w:after="155" w:line="360" w:lineRule="auto"/>
+        <w:ind w:left="0" w:right="200" w:firstLine="0"/>
+        <w:rPr>
+          <w:rFonts w:ascii="Century Gothic" w:hAnsi="Century Gothic"/>
+          <w:b/>
+          <w:color w:val="202124"/>
+          <w:sz w:val="26"/>
+          <w:szCs w:val="26"/>
+        </w:rPr>
+      </w:pPr>
+      <w:r>
+        <w:t>Logica de negocio para validacion, calculo de totales, actualizacion de stock, registro de ventas y calculo de saldos de credito.</w:t>
       </w:r>
     </w:p>
     <w:p>
@@ -3689,45 +3699,23 @@
         <w:rPr>
           <w:sz w:val="22"/>
         </w:rPr>
-        <w:t>Servicios HTTP: auth.service, producto.service, cliente.service y pedido.service; el login devuelve usuario, rol e identificador para diferenciar administrador y vendedor.</w:t>
-      </w:r>
-    </w:p>
-    <w:p>
-      <w:pPr>
-        <w:spacing w:after="155" w:line="360" w:lineRule="auto"/>
-        <w:ind w:left="0" w:right="200" w:firstLine="0"/>
-        <w:rPr>
-          <w:rFonts w:ascii="Century Gothic" w:hAnsi="Century Gothic"/>
-          <w:b/>
-          <w:color w:val="202124"/>
-          <w:sz w:val="26"/>
-          <w:szCs w:val="26"/>
-        </w:rPr>
-      </w:pPr>
-      <w:r>
-        <w:rPr>
-          <w:sz w:val="22"/>
-        </w:rPr>
-        <w:t>Formularios reactivos con Validators.required, Validators.email, Validators.min y Validators.minLength.</w:t>
-      </w:r>
-    </w:p>
-    <w:p>
-      <w:pPr>
-        <w:spacing w:after="155" w:line="360" w:lineRule="auto"/>
-        <w:ind w:left="0" w:right="200" w:firstLine="0"/>
-        <w:rPr>
-          <w:rFonts w:ascii="Century Gothic" w:hAnsi="Century Gothic"/>
-          <w:b/>
-          <w:color w:val="202124"/>
-          <w:sz w:val="26"/>
-          <w:szCs w:val="26"/>
-        </w:rPr>
-      </w:pPr>
-      <w:r>
-        <w:rPr>
-          <w:sz w:val="22"/>
-        </w:rPr>
-        <w:t>Signals para manejar estado reactivo en la interfaz.</w:t>
+        <w:t>Acceso a MySQL mediante MySQL Connector y procedimientos almacenados.</w:t>
+      </w:r>
+    </w:p>
+    <w:p>
+      <w:pPr>
+        <w:spacing w:after="155" w:line="360" w:lineRule="auto"/>
+        <w:ind w:left="0" w:right="200" w:firstLine="0"/>
+        <w:rPr>
+          <w:rFonts w:ascii="Century Gothic" w:hAnsi="Century Gothic"/>
+          <w:b/>
+          <w:color w:val="202124"/>
+          <w:sz w:val="26"/>
+          <w:szCs w:val="26"/>
+        </w:rPr>
+      </w:pPr>
+      <w:r>
+        <w:t>Validaciones de datos de entrada y respuestas JSON para errores.</w:t>
       </w:r>
     </w:p>
     <w:p>
@@ -3745,104 +3733,7 @@
         </w:rPr>
       </w:pPr>
       <w:r>
-        <w:rPr>
-          <w:b/>
-          <w:lang w:val="en-US"/>
-        </w:rPr>
-        <w:t>Backend FastAPI</w:t>
-      </w:r>
-    </w:p>
-    <w:p>
-      <w:pPr>
-        <w:spacing w:after="155" w:line="360" w:lineRule="auto"/>
-        <w:ind w:left="0" w:right="200" w:firstLine="0"/>
-        <w:rPr>
-          <w:rFonts w:ascii="Century Gothic" w:hAnsi="Century Gothic"/>
-          <w:b/>
-          <w:color w:val="202124"/>
-          <w:sz w:val="26"/>
-          <w:szCs w:val="26"/>
-          <w:lang w:val="en-US"/>
-        </w:rPr>
-      </w:pPr>
-      <w:r>
-        <w:t>Endpoints REST para autenticacion, productos, clientes, pedidos, creditos, ventas, inventario y reportes.</w:t>
-      </w:r>
-    </w:p>
-    <w:p>
-      <w:pPr>
-        <w:spacing w:after="155" w:line="360" w:lineRule="auto"/>
-        <w:ind w:left="0" w:right="200" w:firstLine="0"/>
-        <w:rPr>
-          <w:rFonts w:ascii="Century Gothic" w:hAnsi="Century Gothic"/>
-          <w:b/>
-          <w:color w:val="202124"/>
-          <w:sz w:val="26"/>
-          <w:szCs w:val="26"/>
-        </w:rPr>
-      </w:pPr>
-      <w:r>
-        <w:t>Logica de negocio para validacion, calculo de totales, actualizacion de stock, registro de ventas y calculo de saldos de credito.</w:t>
-      </w:r>
-    </w:p>
-    <w:p>
-      <w:pPr>
-        <w:spacing w:after="155" w:line="360" w:lineRule="auto"/>
-        <w:ind w:left="0" w:right="200" w:firstLine="0"/>
-        <w:rPr>
-          <w:rFonts w:ascii="Century Gothic" w:hAnsi="Century Gothic"/>
-          <w:b/>
-          <w:color w:val="202124"/>
-          <w:sz w:val="26"/>
-          <w:szCs w:val="26"/>
-        </w:rPr>
-      </w:pPr>
-      <w:r>
-        <w:rPr>
-          <w:sz w:val="22"/>
-        </w:rPr>
-        <w:t>Acceso a MySQL mediante MySQL Connector y procedimientos almacenados.</w:t>
-      </w:r>
-    </w:p>
-    <w:p>
-      <w:pPr>
-        <w:spacing w:after="155" w:line="360" w:lineRule="auto"/>
-        <w:ind w:left="0" w:right="200" w:firstLine="0"/>
-        <w:rPr>
-          <w:rFonts w:ascii="Century Gothic" w:hAnsi="Century Gothic"/>
-          <w:b/>
-          <w:color w:val="202124"/>
-          <w:sz w:val="26"/>
-          <w:szCs w:val="26"/>
-        </w:rPr>
-      </w:pPr>
-      <w:r>
-        <w:rPr>
-          <w:sz w:val="22"/>
-        </w:rPr>
-        <w:t>Validaciones con Pydantic en modelos de entrada y respuestas JSON para errores.</w:t>
-      </w:r>
-    </w:p>
-    <w:p>
-      <w:pPr>
-        <w:spacing w:after="155" w:line="360" w:lineRule="auto"/>
-        <w:ind w:left="0" w:right="200" w:firstLine="0"/>
-        <w:jc w:val="left"/>
-        <w:rPr>
-          <w:rFonts w:ascii="Century Gothic" w:hAnsi="Century Gothic"/>
-          <w:b/>
-          <w:color w:val="202124"/>
-          <w:sz w:val="26"/>
-          <w:szCs w:val="26"/>
-          <w:lang w:val="en-US"/>
-        </w:rPr>
-      </w:pPr>
-      <w:r>
-        <w:rPr>
-          <w:b/>
-          <w:lang w:val="en-US"/>
-        </w:rPr>
-        <w:t>Endpoints principales</w:t>
+        <w:t>Servicios principales</w:t>
       </w:r>
     </w:p>
     <w:p>
@@ -3975,7 +3866,7 @@
         </w:rPr>
       </w:pPr>
       <w:r>
-        <w:t>Backend principal: cd backend-fastapi; pip install -r requirements.txt; uvicorn main:app --reload --host 0.0.0.0 --port 8000.</w:t>
+        <w:t>Servicios backend: cd backend-fastapi; pip install -r requirements.txt; uvicorn main:app --reload --host 0.0.0.0 --port 8000.</w:t>
       </w:r>
     </w:p>
     <w:p>
@@ -3992,11 +3883,7 @@
         </w:rPr>
       </w:pPr>
       <w:r>
-        <w:rPr>
-          <w:sz w:val="22"/>
-          <w:lang w:val="en-US"/>
-        </w:rPr>
-        <w:t>Frontend: cd frontend-angular; npm install; npm start.</w:t>
+        <w:t>Interfaz web: cd frontend-angular; npm install; npm start.</w:t>
       </w:r>
     </w:p>
     <w:p>
@@ -4152,16 +4039,7 @@
         </w:rPr>
       </w:pPr>
       <w:r>
-        <w:rPr>
-          <w:sz w:val="22"/>
-        </w:rPr>
-        <w:t>Las validaciones en Angular y FastAPI</w:t>
-      </w:r>
-      <w:r>
-        <w:rPr>
-          <w:sz w:val="22"/>
-        </w:rPr>
-        <w:t xml:space="preserve"> reducen errores de ingreso de datos, mientras que el flujo por rol evita que el vendedor modifique secciones administrativas.</w:t>
+        <w:t>Las validaciones reducen errores de ingreso de datos, mientras que el flujo por rol evita que el vendedor modifique secciones administrativas.</w:t>
       </w:r>
     </w:p>
     <w:p>
@@ -5185,7 +5063,7 @@
         </w:rPr>
       </w:pPr>
       <w:r>
-        <w:t>Anexo 4. Estructura principal actualizada: frontend-angular con core, services, models, guard de roles y features incluyendo inventario, ventas y creditos; backend-fastapi como API principal; backend-springboot como alternativa compatible; database/schema.sql; docs/requerimientos_usuario.md; docker-compose.yml; README.md principal; README por modulo; docs/entregables e imagenes.</w:t>
+        <w:t>Anexo 4. Estructura principal del proyecto: frontend-angular con core, services, models, guard de roles y modulos de negocio; backend-fastapi como API principal; backend-springboot como alternativa compatible; database/schema.sql; docs/requerimientos_usuario.md; docker-compose.yml; README.md principal; README por modulo; docs/entregables e imagenes.</w:t>
       </w:r>
     </w:p>
     <w:p>
@@ -5222,85 +5100,16 @@
       </w:r>
     </w:p>
     <w:p>
-      <w:r>
-        <w:rPr>
-          <w:b/>
-        </w:rPr>
-        <w:t>Actualizacion final segun rubrica de evaluacion</w:t>
-      </w:r>
-    </w:p>
-    <w:p>
-      <w:r>
-        <w:t>El proyecto se actualizo para cubrir los criterios principales de la rubrica: frontend funcional en Angular 21, backend REST con FastAPI, base de datos MySQL normalizada con procedimientos almacenados, integracion completa y documentacion para sustentacion.</w:t>
-      </w:r>
-    </w:p>
-    <w:p>
-      <w:r>
-        <w:t>Frontend actualizado: se mantienen componentes standalone, servicios con HttpClient, signals, validaciones, rutas protegidas por rol y diseno responsive. El administrador cuenta con gestion de productos, inventario, ventas, creditos y reportes. El vendedor cuenta con catalogo visual para atencion al cliente, pedidos, clientes, ventas y creditos.</w:t>
-      </w:r>
-    </w:p>
-    <w:p>
-      <w:r>
-        <w:t>Se corrigieron rutas duplicadas: /productos conserva el componente de catalogo y mantenimiento; /inventario usa un componente dedicado para movimientos de inventario; /pedidos registra pedidos; /ventas muestra historial de ventas cerradas.</w:t>
-      </w:r>
-    </w:p>
-    <w:p>
-      <w:r>
-        <w:t>Se implemento busqueda global en el topbar para filtrar en tiempo real productos, pedidos, clientes, creditos, ventas e inventario segun la vista activa.</w:t>
-      </w:r>
-    </w:p>
-    <w:p>
-      <w:r>
-        <w:t>Backend actualizado: se agrego backend-fastapi como API principal para la rubrica, disponible en http://localhost:8000/api. Expone autenticacion, productos, clientes, pedidos, creditos, ventas, inventario y resumen de reportes. El backend Spring Boot queda como implementacion alternativa y compatible en http://localhost:8080/api.</w:t>
-      </w:r>
-    </w:p>
-    <w:p>
-      <w:r>
-        <w:t>Base de datos actualizada: database/schema.sql crea tablas, relaciones, restricciones, datos iniciales y procedimientos almacenados. Los procedimientos incluidos son sp_listar_productos, sp_listar_clientes, sp_listar_pedidos, sp_listar_detalles_pedido, sp_listar_ventas, sp_listar_movimientos_inventario y sp_resumen_reportes.</w:t>
-      </w:r>
-    </w:p>
-    <w:p>
-      <w:r>
-        <w:t>Creditos y cuentas por cobrar: los pedidos a credito registran monto pagado, saldo pendiente, fecha de vencimiento y estado del credito. El sistema permite detectar creditos vencidos, mostrar notificaciones y marcar creditos como pagados.</w:t>
-      </w:r>
-    </w:p>
-    <w:p>
-      <w:r>
-        <w:t xml:space="preserve">Docker y replicacion: </w:t>
-      </w:r>
-      <w:r>
-        <w:t>docker-compose.yml levanta MySQL, FastAPI y conserva Spring Boot como backend alternativo.</w:t>
-      </w:r>
-      <w:r>
-        <w:t xml:space="preserve"> La guia docs/replicar_base_datos.md explica como importar la base con Docker, MySQL Workbench, XAMPP/phpMyAdmin o consola MySQL.</w:t>
-      </w:r>
-    </w:p>
-    <w:p>
-      <w:r>
-        <w:t>Seguridad y sesion: el interceptor HTTP agrega el token demo y, si recibe una respuesta 401, limpia localStorage y redirige automaticamente al login.</w:t>
-      </w:r>
-    </w:p>
-    <w:p>
-      <w:r>
-        <w:t>Con esta actualizacion el proyecto queda alineado con la rubrica: Angular 21 en el frontend, FastAPI como backend principal, MySQL con procedimientos almacenados e integracion documentada para exposicion.</w:t>
-      </w:r>
-    </w:p>
-    <w:p>
-      <w:r>
-        <w:br w:type="page"/>
-      </w:r>
-    </w:p>
-    <w:p>
       <w:pPr>
         <w:pStyle w:val="Ttulo1"/>
       </w:pPr>
       <w:r>
-        <w:t>EVIDENCIAS VISUALES ACTUALIZADAS</w:t>
-      </w:r>
-    </w:p>
-    <w:p>
-      <w:r>
-        <w:t>Las siguientes capturas complementan el informe final y muestran los cambios aplicados en la version actual: rutas separadas para inventario y ventas, backend FastAPI principal, procedimientos almacenados y evidencias de base de datos.</w:t>
+        <w:t>EVIDENCIAS DEL SISTEMA</w:t>
+      </w:r>
+    </w:p>
+    <w:p>
+      <w:r>
+        <w:t>Las siguientes figuras complementan la sustentacion del sistema y muestran modulos operativos, servicios REST, procedimientos almacenados y evidencias de base de datos.</w:t>
       </w:r>
     </w:p>
     <w:p/>
@@ -5426,7 +5235,7 @@
     </w:p>
     <w:p>
       <w:r>
-        <w:t>Figura 13. Documentacion de endpoints REST principales en FastAPI.</w:t>
+        <w:t>Figura 13. Documentacion de servicios REST principales.</w:t>
       </w:r>
     </w:p>
     <w:p/>

</xml_diff>

<commit_message>
add code defense guide and final repo link
</commit_message>
<xml_diff>
--- a/docs/entregables/Informe_Final_Chompas_Mabel.docx
+++ b/docs/entregables/Informe_Final_Chompas_Mabel.docx
@@ -5280,6 +5280,25 @@
         <w:t>Figura 14. Procedimientos almacenados y consultas de apoyo en MySQL.</w:t>
       </w:r>
     </w:p>
+    <w:p/>
+    <w:p>
+      <w:pPr>
+        <w:pStyle w:val="Ttulo1"/>
+      </w:pPr>
+      <w:r>
+        <w:t>REPOSITORIO DEL PROYECTO</w:t>
+      </w:r>
+    </w:p>
+    <w:p>
+      <w:r>
+        <w:t>El codigo fuente completo, la documentacion, el script de base de datos y los archivos de ejecucion se encuentran disponibles en el siguiente repositorio:</w:t>
+      </w:r>
+    </w:p>
+    <w:p>
+      <w:r>
+        <w:t>https://github.com/DiegoA199/Chompas_Mabel</w:t>
+      </w:r>
+    </w:p>
     <w:sectPr>
       <w:headerReference w:type="default" r:id="rId19"/>
       <w:pgSz w:w="11905" w:h="16840"/>

</xml_diff>